<commit_message>
W 10-07 bible: fix McDONALD'S header render; rebuilt docx/pdf; pushed to Drive as '10/7 Wed Bible'
Co-Authored-By: Claude Opus 5.5 <noreply@anthropic.com>
Claude-Session: https://claude.ai/code/session_01F5T5EfKU7bvTfCbU31zr39
</commit_message>
<xml_diff>
--- a/runs/W_10072026/10_07 LIVE BIBLE.docx
+++ b/runs/W_10072026/10_07 LIVE BIBLE.docx
@@ -9565,9 +9565,9 @@
           <w:rFonts w:ascii="Arial" w:hAnsi="Arial" w:cs="Arial" w:eastAsia="Arial"/>
           <w:b/>
           <w:color w:val="000000"/>
-          <w:sz w:val="36"/>
-        </w:rPr>
-        <w:t>NOW McDONALD'S IS RETRAINING MORE THAN 2 MILLION WORKERS… TO BE NICER TO YOU!!</w:t>
+          <w:sz w:val="46"/>
+        </w:rPr>
+        <w:t>NOW MCDONALD'S IS RETRAINING MORE THAN 2 MILLION WORKERS… TO BE NICER TO YOU!!</w:t>
       </w:r>
     </w:p>
     <w:p>

</xml_diff>

<commit_message>
10/07 bible: move Story B phone demo ahead of the Caper Cart segment
Co-Authored-By: Claude Opus 5.5 <noreply@anthropic.com>
Claude-Session: https://claude.ai/code/session_01TNJ6mpHv7cQth7iuoFbymm
</commit_message>
<xml_diff>
--- a/runs/W_10072026/10_07 LIVE BIBLE.docx
+++ b/runs/W_10072026/10_07 LIVE BIBLE.docx
@@ -4055,6 +4055,933 @@
       <w:r>
         <w:rPr>
           <w:rFonts w:ascii="Arial" w:hAnsi="Arial" w:cs="Arial" w:eastAsia="Arial"/>
+          <w:b w:val="0"/>
+          <w:color w:val="000000"/>
+          <w:sz w:val="36"/>
+        </w:rPr>
+        <w:t>-BUT THE PART THAT TIES IT ALL BACK TO YOU... YOU CAN SHUT DOWN RIGHT NOW.</w:t>
+      </w:r>
+    </w:p>
+    <w:p>
+      <w:pPr>
+        <w:spacing w:lineRule="auto" w:line="276" w:before="0" w:after="0"/>
+      </w:pPr>
+      <w:r>
+        <w:rPr>
+          <w:rFonts w:ascii="Arial" w:hAnsi="Arial" w:cs="Arial" w:eastAsia="Arial"/>
+          <w:b w:val="0"/>
+          <w:color w:val="000000"/>
+          <w:sz w:val="36"/>
+        </w:rPr>
+      </w:r>
+    </w:p>
+    <w:p>
+      <w:pPr>
+        <w:spacing w:lineRule="auto" w:line="276" w:before="0" w:after="0"/>
+      </w:pPr>
+      <w:r>
+        <w:rPr>
+          <w:rFonts w:ascii="Arial" w:hAnsi="Arial" w:cs="Arial" w:eastAsia="Arial"/>
+          <w:b/>
+          <w:color w:val="000000"/>
+          <w:sz w:val="46"/>
+        </w:rPr>
+        <w:t>HERE'S HOW TO PROTECT YOURSELF</w:t>
+      </w:r>
+    </w:p>
+    <w:p>
+      <w:pPr>
+        <w:spacing w:lineRule="auto" w:line="276" w:before="0" w:after="0"/>
+      </w:pPr>
+      <w:r>
+        <w:rPr>
+          <w:rFonts w:ascii="Arial" w:hAnsi="Arial" w:cs="Arial" w:eastAsia="Arial"/>
+          <w:b w:val="0"/>
+          <w:color w:val="000000"/>
+          <w:sz w:val="36"/>
+        </w:rPr>
+      </w:r>
+    </w:p>
+    <w:p>
+      <w:pPr>
+        <w:spacing w:lineRule="auto" w:line="276" w:before="0" w:after="0"/>
+      </w:pPr>
+      <w:r>
+        <w:rPr>
+          <w:rFonts w:ascii="Arial" w:hAnsi="Arial" w:cs="Arial" w:eastAsia="Arial"/>
+          <w:b w:val="0"/>
+          <w:color w:val="000000"/>
+          <w:sz w:val="36"/>
+        </w:rPr>
+        <w:t>-HERE'S THE STEP BY STEP I WANT ALL OF YOU TO DO WITH ME... RIGHT NOW.</w:t>
+      </w:r>
+    </w:p>
+    <w:p>
+      <w:pPr>
+        <w:spacing w:lineRule="auto" w:line="276" w:before="0" w:after="0"/>
+      </w:pPr>
+      <w:r>
+        <w:rPr>
+          <w:rFonts w:ascii="Arial" w:hAnsi="Arial" w:cs="Arial" w:eastAsia="Arial"/>
+          <w:b w:val="0"/>
+          <w:color w:val="000000"/>
+          <w:sz w:val="36"/>
+        </w:rPr>
+      </w:r>
+    </w:p>
+    <w:p>
+      <w:pPr>
+        <w:spacing w:lineRule="auto" w:line="276" w:before="0" w:after="0"/>
+      </w:pPr>
+      <w:r>
+        <w:rPr>
+          <w:rFonts w:ascii="Arial" w:hAnsi="Arial" w:cs="Arial" w:eastAsia="Arial"/>
+          <w:b/>
+          <w:color w:val="FF0000"/>
+          <w:sz w:val="36"/>
+        </w:rPr>
+        <w:t>(((SHOW-PRODUCED: JEFF SCREEN SHARE, OR A PRE-RECORDED SCREEN RECORDING. ANDROID FIRST, THEN IPHONE)))</w:t>
+      </w:r>
+    </w:p>
+    <w:p>
+      <w:pPr>
+        <w:spacing w:lineRule="auto" w:line="276" w:before="0" w:after="0"/>
+      </w:pPr>
+      <w:r>
+        <w:rPr>
+          <w:rFonts w:ascii="Arial" w:hAnsi="Arial" w:cs="Arial" w:eastAsia="Arial"/>
+          <w:b w:val="0"/>
+          <w:color w:val="000000"/>
+          <w:sz w:val="36"/>
+        </w:rPr>
+      </w:r>
+    </w:p>
+    <w:p>
+      <w:pPr>
+        <w:spacing w:lineRule="auto" w:line="276" w:before="0" w:after="0"/>
+      </w:pPr>
+      <w:r>
+        <w:rPr>
+          <w:rFonts w:ascii="Arial" w:hAnsi="Arial" w:cs="Arial" w:eastAsia="Arial"/>
+          <w:b/>
+          <w:color w:val="FF0000"/>
+          <w:sz w:val="36"/>
+        </w:rPr>
+        <w:t>(((JEFF SCREEN SHARE)))</w:t>
+      </w:r>
+    </w:p>
+    <w:p>
+      <w:pPr>
+        <w:spacing w:lineRule="auto" w:line="276" w:before="0" w:after="0"/>
+      </w:pPr>
+      <w:r>
+        <w:rPr>
+          <w:rFonts w:ascii="Arial" w:hAnsi="Arial" w:cs="Arial" w:eastAsia="Arial"/>
+          <w:b w:val="0"/>
+          <w:color w:val="000000"/>
+          <w:sz w:val="36"/>
+        </w:rPr>
+      </w:r>
+    </w:p>
+    <w:p>
+      <w:pPr>
+        <w:spacing w:lineRule="auto" w:line="276" w:before="0" w:after="0"/>
+      </w:pPr>
+      <w:r>
+        <w:rPr>
+          <w:rFonts w:ascii="Arial" w:hAnsi="Arial" w:cs="Arial" w:eastAsia="Arial"/>
+          <w:b w:val="0"/>
+          <w:color w:val="000000"/>
+          <w:sz w:val="36"/>
+        </w:rPr>
+        <w:t xml:space="preserve">-NUMBER ONE. ON AN ANDROID, TURN OFF </w:t>
+      </w:r>
+      <w:r>
+        <w:rPr>
+          <w:rFonts w:ascii="Arial" w:hAnsi="Arial" w:cs="Arial" w:eastAsia="Arial"/>
+          <w:b/>
+          <w:color w:val="000000"/>
+          <w:sz w:val="36"/>
+        </w:rPr>
+        <w:t>BLUETOOTH SCANNING</w:t>
+      </w:r>
+      <w:r>
+        <w:rPr>
+          <w:rFonts w:ascii="Arial" w:hAnsi="Arial" w:cs="Arial" w:eastAsia="Arial"/>
+          <w:b w:val="0"/>
+          <w:color w:val="000000"/>
+          <w:sz w:val="36"/>
+        </w:rPr>
+        <w:t>.</w:t>
+      </w:r>
+    </w:p>
+    <w:p>
+      <w:pPr>
+        <w:spacing w:lineRule="auto" w:line="276" w:before="0" w:after="0"/>
+      </w:pPr>
+      <w:r>
+        <w:rPr>
+          <w:rFonts w:ascii="Arial" w:hAnsi="Arial" w:cs="Arial" w:eastAsia="Arial"/>
+          <w:b w:val="0"/>
+          <w:color w:val="000000"/>
+          <w:sz w:val="36"/>
+        </w:rPr>
+      </w:r>
+    </w:p>
+    <w:p>
+      <w:pPr>
+        <w:spacing w:lineRule="auto" w:line="276" w:before="0" w:after="0"/>
+      </w:pPr>
+      <w:r>
+        <w:rPr>
+          <w:rFonts w:ascii="Arial" w:hAnsi="Arial" w:cs="Arial" w:eastAsia="Arial"/>
+          <w:b w:val="0"/>
+          <w:color w:val="000000"/>
+          <w:sz w:val="36"/>
+        </w:rPr>
+        <w:t>-BECAUSE YOUR PHONE KEEPS LOOKING FOR BEACONS EVEN WHEN BLUETOOTH IS OFF!!</w:t>
+      </w:r>
+    </w:p>
+    <w:p>
+      <w:pPr>
+        <w:spacing w:lineRule="auto" w:line="276" w:before="0" w:after="0"/>
+      </w:pPr>
+      <w:r>
+        <w:rPr>
+          <w:rFonts w:ascii="Arial" w:hAnsi="Arial" w:cs="Arial" w:eastAsia="Arial"/>
+          <w:b w:val="0"/>
+          <w:color w:val="000000"/>
+          <w:sz w:val="36"/>
+        </w:rPr>
+      </w:r>
+    </w:p>
+    <w:p>
+      <w:pPr>
+        <w:spacing w:lineRule="auto" w:line="276" w:before="0" w:after="0"/>
+      </w:pPr>
+      <w:r>
+        <w:rPr>
+          <w:rFonts w:ascii="Arial" w:hAnsi="Arial" w:cs="Arial" w:eastAsia="Arial"/>
+          <w:b w:val="0"/>
+          <w:color w:val="000000"/>
+          <w:sz w:val="36"/>
+        </w:rPr>
+        <w:t>-GO TO "</w:t>
+      </w:r>
+      <w:r>
+        <w:rPr>
+          <w:rFonts w:ascii="Arial" w:hAnsi="Arial" w:cs="Arial" w:eastAsia="Arial"/>
+          <w:b/>
+          <w:color w:val="000000"/>
+          <w:sz w:val="36"/>
+        </w:rPr>
+        <w:t>SETTINGS</w:t>
+      </w:r>
+      <w:r>
+        <w:rPr>
+          <w:rFonts w:ascii="Arial" w:hAnsi="Arial" w:cs="Arial" w:eastAsia="Arial"/>
+          <w:b w:val="0"/>
+          <w:color w:val="000000"/>
+          <w:sz w:val="36"/>
+        </w:rPr>
+        <w:t>"... THEN "</w:t>
+      </w:r>
+      <w:r>
+        <w:rPr>
+          <w:rFonts w:ascii="Arial" w:hAnsi="Arial" w:cs="Arial" w:eastAsia="Arial"/>
+          <w:b/>
+          <w:color w:val="000000"/>
+          <w:sz w:val="36"/>
+        </w:rPr>
+        <w:t>LOCATION</w:t>
+      </w:r>
+      <w:r>
+        <w:rPr>
+          <w:rFonts w:ascii="Arial" w:hAnsi="Arial" w:cs="Arial" w:eastAsia="Arial"/>
+          <w:b w:val="0"/>
+          <w:color w:val="000000"/>
+          <w:sz w:val="36"/>
+        </w:rPr>
+        <w:t>"... THEN "</w:t>
+      </w:r>
+      <w:r>
+        <w:rPr>
+          <w:rFonts w:ascii="Arial" w:hAnsi="Arial" w:cs="Arial" w:eastAsia="Arial"/>
+          <w:b/>
+          <w:color w:val="000000"/>
+          <w:sz w:val="36"/>
+        </w:rPr>
+        <w:t>LOCATION SERVICES</w:t>
+      </w:r>
+      <w:r>
+        <w:rPr>
+          <w:rFonts w:ascii="Arial" w:hAnsi="Arial" w:cs="Arial" w:eastAsia="Arial"/>
+          <w:b w:val="0"/>
+          <w:color w:val="000000"/>
+          <w:sz w:val="36"/>
+        </w:rPr>
+        <w:t>"... AND SWITCH OFF "</w:t>
+      </w:r>
+      <w:r>
+        <w:rPr>
+          <w:rFonts w:ascii="Arial" w:hAnsi="Arial" w:cs="Arial" w:eastAsia="Arial"/>
+          <w:b/>
+          <w:color w:val="000000"/>
+          <w:sz w:val="36"/>
+        </w:rPr>
+        <w:t>BLUETOOTH SCANNING</w:t>
+      </w:r>
+      <w:r>
+        <w:rPr>
+          <w:rFonts w:ascii="Arial" w:hAnsi="Arial" w:cs="Arial" w:eastAsia="Arial"/>
+          <w:b w:val="0"/>
+          <w:color w:val="000000"/>
+          <w:sz w:val="36"/>
+        </w:rPr>
+        <w:t>."</w:t>
+      </w:r>
+    </w:p>
+    <w:p>
+      <w:pPr>
+        <w:spacing w:lineRule="auto" w:line="276" w:before="0" w:after="0"/>
+      </w:pPr>
+      <w:r>
+        <w:rPr>
+          <w:rFonts w:ascii="Arial" w:hAnsi="Arial" w:cs="Arial" w:eastAsia="Arial"/>
+          <w:b w:val="0"/>
+          <w:color w:val="000000"/>
+          <w:sz w:val="36"/>
+        </w:rPr>
+      </w:r>
+    </w:p>
+    <w:p>
+      <w:pPr>
+        <w:spacing w:lineRule="auto" w:line="276" w:before="0" w:after="0"/>
+      </w:pPr>
+      <w:r>
+        <w:rPr>
+          <w:rFonts w:ascii="Arial" w:hAnsi="Arial" w:cs="Arial" w:eastAsia="Arial"/>
+          <w:b w:val="0"/>
+          <w:color w:val="000000"/>
+          <w:sz w:val="36"/>
+        </w:rPr>
+        <w:t>-ON A SAMSUNG, IT'S THE SAME PATH.</w:t>
+      </w:r>
+    </w:p>
+    <w:p>
+      <w:pPr>
+        <w:spacing w:lineRule="auto" w:line="276" w:before="0" w:after="0"/>
+      </w:pPr>
+      <w:r>
+        <w:rPr>
+          <w:rFonts w:ascii="Arial" w:hAnsi="Arial" w:cs="Arial" w:eastAsia="Arial"/>
+          <w:b w:val="0"/>
+          <w:color w:val="000000"/>
+          <w:sz w:val="36"/>
+        </w:rPr>
+      </w:r>
+    </w:p>
+    <w:p>
+      <w:pPr>
+        <w:spacing w:lineRule="auto" w:line="276" w:before="0" w:after="0"/>
+      </w:pPr>
+      <w:r>
+        <w:rPr>
+          <w:rFonts w:ascii="Arial" w:hAnsi="Arial" w:cs="Arial" w:eastAsia="Arial"/>
+          <w:b w:val="0"/>
+          <w:color w:val="000000"/>
+          <w:sz w:val="36"/>
+        </w:rPr>
+        <w:t>-NUMBER TWO. STOP THE STORE APP FROM SEEING NEARBY DEVICES, SO IT CAN'T HEAR THE BEACONS.</w:t>
+      </w:r>
+    </w:p>
+    <w:p>
+      <w:pPr>
+        <w:spacing w:lineRule="auto" w:line="276" w:before="0" w:after="0"/>
+      </w:pPr>
+      <w:r>
+        <w:rPr>
+          <w:rFonts w:ascii="Arial" w:hAnsi="Arial" w:cs="Arial" w:eastAsia="Arial"/>
+          <w:b w:val="0"/>
+          <w:color w:val="000000"/>
+          <w:sz w:val="36"/>
+        </w:rPr>
+      </w:r>
+    </w:p>
+    <w:p>
+      <w:pPr>
+        <w:spacing w:lineRule="auto" w:line="276" w:before="0" w:after="0"/>
+      </w:pPr>
+      <w:r>
+        <w:rPr>
+          <w:rFonts w:ascii="Arial" w:hAnsi="Arial" w:cs="Arial" w:eastAsia="Arial"/>
+          <w:b w:val="0"/>
+          <w:color w:val="000000"/>
+          <w:sz w:val="36"/>
+        </w:rPr>
+        <w:t>-"</w:t>
+      </w:r>
+      <w:r>
+        <w:rPr>
+          <w:rFonts w:ascii="Arial" w:hAnsi="Arial" w:cs="Arial" w:eastAsia="Arial"/>
+          <w:b/>
+          <w:color w:val="000000"/>
+          <w:sz w:val="36"/>
+        </w:rPr>
+        <w:t>SETTINGS</w:t>
+      </w:r>
+      <w:r>
+        <w:rPr>
+          <w:rFonts w:ascii="Arial" w:hAnsi="Arial" w:cs="Arial" w:eastAsia="Arial"/>
+          <w:b w:val="0"/>
+          <w:color w:val="000000"/>
+          <w:sz w:val="36"/>
+        </w:rPr>
+        <w:t>"... "</w:t>
+      </w:r>
+      <w:r>
+        <w:rPr>
+          <w:rFonts w:ascii="Arial" w:hAnsi="Arial" w:cs="Arial" w:eastAsia="Arial"/>
+          <w:b/>
+          <w:color w:val="000000"/>
+          <w:sz w:val="36"/>
+        </w:rPr>
+        <w:t>APPS</w:t>
+      </w:r>
+      <w:r>
+        <w:rPr>
+          <w:rFonts w:ascii="Arial" w:hAnsi="Arial" w:cs="Arial" w:eastAsia="Arial"/>
+          <w:b w:val="0"/>
+          <w:color w:val="000000"/>
+          <w:sz w:val="36"/>
+        </w:rPr>
+        <w:t>"... THE STORE APP... "</w:t>
+      </w:r>
+      <w:r>
+        <w:rPr>
+          <w:rFonts w:ascii="Arial" w:hAnsi="Arial" w:cs="Arial" w:eastAsia="Arial"/>
+          <w:b/>
+          <w:color w:val="000000"/>
+          <w:sz w:val="36"/>
+        </w:rPr>
+        <w:t>PERMISSIONS</w:t>
+      </w:r>
+      <w:r>
+        <w:rPr>
+          <w:rFonts w:ascii="Arial" w:hAnsi="Arial" w:cs="Arial" w:eastAsia="Arial"/>
+          <w:b w:val="0"/>
+          <w:color w:val="000000"/>
+          <w:sz w:val="36"/>
+        </w:rPr>
+        <w:t>"... "</w:t>
+      </w:r>
+      <w:r>
+        <w:rPr>
+          <w:rFonts w:ascii="Arial" w:hAnsi="Arial" w:cs="Arial" w:eastAsia="Arial"/>
+          <w:b/>
+          <w:color w:val="000000"/>
+          <w:sz w:val="36"/>
+        </w:rPr>
+        <w:t>NEARBY DEVICES</w:t>
+      </w:r>
+      <w:r>
+        <w:rPr>
+          <w:rFonts w:ascii="Arial" w:hAnsi="Arial" w:cs="Arial" w:eastAsia="Arial"/>
+          <w:b w:val="0"/>
+          <w:color w:val="000000"/>
+          <w:sz w:val="36"/>
+        </w:rPr>
+        <w:t>"... "</w:t>
+      </w:r>
+      <w:r>
+        <w:rPr>
+          <w:rFonts w:ascii="Arial" w:hAnsi="Arial" w:cs="Arial" w:eastAsia="Arial"/>
+          <w:b/>
+          <w:color w:val="000000"/>
+          <w:sz w:val="36"/>
+        </w:rPr>
+        <w:t>DON'T ALLOW</w:t>
+      </w:r>
+      <w:r>
+        <w:rPr>
+          <w:rFonts w:ascii="Arial" w:hAnsi="Arial" w:cs="Arial" w:eastAsia="Arial"/>
+          <w:b w:val="0"/>
+          <w:color w:val="000000"/>
+          <w:sz w:val="36"/>
+        </w:rPr>
+        <w:t>."</w:t>
+      </w:r>
+    </w:p>
+    <w:p>
+      <w:pPr>
+        <w:spacing w:lineRule="auto" w:line="276" w:before="0" w:after="0"/>
+      </w:pPr>
+      <w:r>
+        <w:rPr>
+          <w:rFonts w:ascii="Arial" w:hAnsi="Arial" w:cs="Arial" w:eastAsia="Arial"/>
+          <w:b w:val="0"/>
+          <w:color w:val="000000"/>
+          <w:sz w:val="36"/>
+        </w:rPr>
+      </w:r>
+    </w:p>
+    <w:p>
+      <w:pPr>
+        <w:spacing w:lineRule="auto" w:line="276" w:before="0" w:after="0"/>
+      </w:pPr>
+      <w:r>
+        <w:rPr>
+          <w:rFonts w:ascii="Arial" w:hAnsi="Arial" w:cs="Arial" w:eastAsia="Arial"/>
+          <w:b w:val="0"/>
+          <w:color w:val="000000"/>
+          <w:sz w:val="36"/>
+        </w:rPr>
+        <w:t>-NUMBER THREE. ON AN IPHONE, TURN OFF LOCATION FOR THE STORE APP.</w:t>
+      </w:r>
+    </w:p>
+    <w:p>
+      <w:pPr>
+        <w:spacing w:lineRule="auto" w:line="276" w:before="0" w:after="0"/>
+      </w:pPr>
+      <w:r>
+        <w:rPr>
+          <w:rFonts w:ascii="Arial" w:hAnsi="Arial" w:cs="Arial" w:eastAsia="Arial"/>
+          <w:b w:val="0"/>
+          <w:color w:val="000000"/>
+          <w:sz w:val="36"/>
+        </w:rPr>
+      </w:r>
+    </w:p>
+    <w:p>
+      <w:pPr>
+        <w:spacing w:lineRule="auto" w:line="276" w:before="0" w:after="0"/>
+      </w:pPr>
+      <w:r>
+        <w:rPr>
+          <w:rFonts w:ascii="Arial" w:hAnsi="Arial" w:cs="Arial" w:eastAsia="Arial"/>
+          <w:b w:val="0"/>
+          <w:color w:val="000000"/>
+          <w:sz w:val="36"/>
+        </w:rPr>
+        <w:t>-BECAUSE THAT'S HOW IPHONE APPS PICK UP THE BEACONS.</w:t>
+      </w:r>
+    </w:p>
+    <w:p>
+      <w:pPr>
+        <w:spacing w:lineRule="auto" w:line="276" w:before="0" w:after="0"/>
+      </w:pPr>
+      <w:r>
+        <w:rPr>
+          <w:rFonts w:ascii="Arial" w:hAnsi="Arial" w:cs="Arial" w:eastAsia="Arial"/>
+          <w:b w:val="0"/>
+          <w:color w:val="000000"/>
+          <w:sz w:val="36"/>
+        </w:rPr>
+      </w:r>
+    </w:p>
+    <w:p>
+      <w:pPr>
+        <w:spacing w:lineRule="auto" w:line="276" w:before="0" w:after="0"/>
+      </w:pPr>
+      <w:r>
+        <w:rPr>
+          <w:rFonts w:ascii="Arial" w:hAnsi="Arial" w:cs="Arial" w:eastAsia="Arial"/>
+          <w:b w:val="0"/>
+          <w:color w:val="000000"/>
+          <w:sz w:val="36"/>
+        </w:rPr>
+        <w:t>-"</w:t>
+      </w:r>
+      <w:r>
+        <w:rPr>
+          <w:rFonts w:ascii="Arial" w:hAnsi="Arial" w:cs="Arial" w:eastAsia="Arial"/>
+          <w:b/>
+          <w:color w:val="000000"/>
+          <w:sz w:val="36"/>
+        </w:rPr>
+        <w:t>SETTINGS</w:t>
+      </w:r>
+      <w:r>
+        <w:rPr>
+          <w:rFonts w:ascii="Arial" w:hAnsi="Arial" w:cs="Arial" w:eastAsia="Arial"/>
+          <w:b w:val="0"/>
+          <w:color w:val="000000"/>
+          <w:sz w:val="36"/>
+        </w:rPr>
+        <w:t>"... "</w:t>
+      </w:r>
+      <w:r>
+        <w:rPr>
+          <w:rFonts w:ascii="Arial" w:hAnsi="Arial" w:cs="Arial" w:eastAsia="Arial"/>
+          <w:b/>
+          <w:color w:val="000000"/>
+          <w:sz w:val="36"/>
+        </w:rPr>
+        <w:t>PRIVACY &amp; SECURITY</w:t>
+      </w:r>
+      <w:r>
+        <w:rPr>
+          <w:rFonts w:ascii="Arial" w:hAnsi="Arial" w:cs="Arial" w:eastAsia="Arial"/>
+          <w:b w:val="0"/>
+          <w:color w:val="000000"/>
+          <w:sz w:val="36"/>
+        </w:rPr>
+        <w:t>"... "</w:t>
+      </w:r>
+      <w:r>
+        <w:rPr>
+          <w:rFonts w:ascii="Arial" w:hAnsi="Arial" w:cs="Arial" w:eastAsia="Arial"/>
+          <w:b/>
+          <w:color w:val="000000"/>
+          <w:sz w:val="36"/>
+        </w:rPr>
+        <w:t>LOCATION SERVICES</w:t>
+      </w:r>
+      <w:r>
+        <w:rPr>
+          <w:rFonts w:ascii="Arial" w:hAnsi="Arial" w:cs="Arial" w:eastAsia="Arial"/>
+          <w:b w:val="0"/>
+          <w:color w:val="000000"/>
+          <w:sz w:val="36"/>
+        </w:rPr>
+        <w:t>"... THE STORE APP... "</w:t>
+      </w:r>
+      <w:r>
+        <w:rPr>
+          <w:rFonts w:ascii="Arial" w:hAnsi="Arial" w:cs="Arial" w:eastAsia="Arial"/>
+          <w:b/>
+          <w:color w:val="000000"/>
+          <w:sz w:val="36"/>
+        </w:rPr>
+        <w:t>NEVER</w:t>
+      </w:r>
+      <w:r>
+        <w:rPr>
+          <w:rFonts w:ascii="Arial" w:hAnsi="Arial" w:cs="Arial" w:eastAsia="Arial"/>
+          <w:b w:val="0"/>
+          <w:color w:val="000000"/>
+          <w:sz w:val="36"/>
+        </w:rPr>
+        <w:t>" OR "</w:t>
+      </w:r>
+      <w:r>
+        <w:rPr>
+          <w:rFonts w:ascii="Arial" w:hAnsi="Arial" w:cs="Arial" w:eastAsia="Arial"/>
+          <w:b/>
+          <w:color w:val="000000"/>
+          <w:sz w:val="36"/>
+        </w:rPr>
+        <w:t>WHILE USING</w:t>
+      </w:r>
+      <w:r>
+        <w:rPr>
+          <w:rFonts w:ascii="Arial" w:hAnsi="Arial" w:cs="Arial" w:eastAsia="Arial"/>
+          <w:b w:val="0"/>
+          <w:color w:val="000000"/>
+          <w:sz w:val="36"/>
+        </w:rPr>
+        <w:t>."</w:t>
+      </w:r>
+    </w:p>
+    <w:p>
+      <w:pPr>
+        <w:spacing w:lineRule="auto" w:line="276" w:before="0" w:after="0"/>
+      </w:pPr>
+      <w:r>
+        <w:rPr>
+          <w:rFonts w:ascii="Arial" w:hAnsi="Arial" w:cs="Arial" w:eastAsia="Arial"/>
+          <w:b w:val="0"/>
+          <w:color w:val="000000"/>
+          <w:sz w:val="36"/>
+        </w:rPr>
+      </w:r>
+    </w:p>
+    <w:p>
+      <w:pPr>
+        <w:spacing w:lineRule="auto" w:line="276" w:before="0" w:after="0"/>
+      </w:pPr>
+      <w:r>
+        <w:rPr>
+          <w:rFonts w:ascii="Arial" w:hAnsi="Arial" w:cs="Arial" w:eastAsia="Arial"/>
+          <w:b w:val="0"/>
+          <w:color w:val="000000"/>
+          <w:sz w:val="36"/>
+        </w:rPr>
+        <w:t>-AND WHILE YOU'RE THERE, SWITCH OFF "</w:t>
+      </w:r>
+      <w:r>
+        <w:rPr>
+          <w:rFonts w:ascii="Arial" w:hAnsi="Arial" w:cs="Arial" w:eastAsia="Arial"/>
+          <w:b/>
+          <w:color w:val="000000"/>
+          <w:sz w:val="36"/>
+        </w:rPr>
+        <w:t>PRECISE LOCATION</w:t>
+      </w:r>
+      <w:r>
+        <w:rPr>
+          <w:rFonts w:ascii="Arial" w:hAnsi="Arial" w:cs="Arial" w:eastAsia="Arial"/>
+          <w:b w:val="0"/>
+          <w:color w:val="000000"/>
+          <w:sz w:val="36"/>
+        </w:rPr>
+        <w:t>."</w:t>
+      </w:r>
+    </w:p>
+    <w:p>
+      <w:pPr>
+        <w:spacing w:lineRule="auto" w:line="276" w:before="0" w:after="0"/>
+      </w:pPr>
+      <w:r>
+        <w:rPr>
+          <w:rFonts w:ascii="Arial" w:hAnsi="Arial" w:cs="Arial" w:eastAsia="Arial"/>
+          <w:b w:val="0"/>
+          <w:color w:val="000000"/>
+          <w:sz w:val="36"/>
+        </w:rPr>
+      </w:r>
+    </w:p>
+    <w:p>
+      <w:pPr>
+        <w:spacing w:lineRule="auto" w:line="276" w:before="0" w:after="0"/>
+      </w:pPr>
+      <w:r>
+        <w:rPr>
+          <w:rFonts w:ascii="Arial" w:hAnsi="Arial" w:cs="Arial" w:eastAsia="Arial"/>
+          <w:b w:val="0"/>
+          <w:color w:val="000000"/>
+          <w:sz w:val="36"/>
+        </w:rPr>
+        <w:t>-THEN GO BACK TO "</w:t>
+      </w:r>
+      <w:r>
+        <w:rPr>
+          <w:rFonts w:ascii="Arial" w:hAnsi="Arial" w:cs="Arial" w:eastAsia="Arial"/>
+          <w:b/>
+          <w:color w:val="000000"/>
+          <w:sz w:val="36"/>
+        </w:rPr>
+        <w:t>PRIVACY &amp; SECURITY</w:t>
+      </w:r>
+      <w:r>
+        <w:rPr>
+          <w:rFonts w:ascii="Arial" w:hAnsi="Arial" w:cs="Arial" w:eastAsia="Arial"/>
+          <w:b w:val="0"/>
+          <w:color w:val="000000"/>
+          <w:sz w:val="36"/>
+        </w:rPr>
+        <w:t>"... "</w:t>
+      </w:r>
+      <w:r>
+        <w:rPr>
+          <w:rFonts w:ascii="Arial" w:hAnsi="Arial" w:cs="Arial" w:eastAsia="Arial"/>
+          <w:b/>
+          <w:color w:val="000000"/>
+          <w:sz w:val="36"/>
+        </w:rPr>
+        <w:t>BLUETOOTH</w:t>
+      </w:r>
+      <w:r>
+        <w:rPr>
+          <w:rFonts w:ascii="Arial" w:hAnsi="Arial" w:cs="Arial" w:eastAsia="Arial"/>
+          <w:b w:val="0"/>
+          <w:color w:val="000000"/>
+          <w:sz w:val="36"/>
+        </w:rPr>
+        <w:t>"... AND SWITCH THE STORE APP OFF.</w:t>
+      </w:r>
+    </w:p>
+    <w:p>
+      <w:pPr>
+        <w:spacing w:lineRule="auto" w:line="276" w:before="0" w:after="0"/>
+      </w:pPr>
+      <w:r>
+        <w:rPr>
+          <w:rFonts w:ascii="Arial" w:hAnsi="Arial" w:cs="Arial" w:eastAsia="Arial"/>
+          <w:b w:val="0"/>
+          <w:color w:val="000000"/>
+          <w:sz w:val="36"/>
+        </w:rPr>
+      </w:r>
+    </w:p>
+    <w:p>
+      <w:pPr>
+        <w:spacing w:lineRule="auto" w:line="276" w:before="0" w:after="0"/>
+      </w:pPr>
+      <w:r>
+        <w:rPr>
+          <w:rFonts w:ascii="Arial" w:hAnsi="Arial" w:cs="Arial" w:eastAsia="Arial"/>
+          <w:b/>
+          <w:color w:val="FF0000"/>
+          <w:sz w:val="36"/>
+        </w:rPr>
+        <w:t>(((END SCREENSHARE)))</w:t>
+      </w:r>
+    </w:p>
+    <w:p>
+      <w:pPr>
+        <w:spacing w:lineRule="auto" w:line="276" w:before="0" w:after="0"/>
+      </w:pPr>
+      <w:r>
+        <w:rPr>
+          <w:rFonts w:ascii="Arial" w:hAnsi="Arial" w:cs="Arial" w:eastAsia="Arial"/>
+          <w:b w:val="0"/>
+          <w:color w:val="000000"/>
+          <w:sz w:val="36"/>
+        </w:rPr>
+      </w:r>
+    </w:p>
+    <w:p>
+      <w:pPr>
+        <w:spacing w:lineRule="auto" w:line="276" w:before="0" w:after="0"/>
+      </w:pPr>
+      <w:r>
+        <w:rPr>
+          <w:rFonts w:ascii="Arial" w:hAnsi="Arial" w:cs="Arial" w:eastAsia="Arial"/>
+          <w:b w:val="0"/>
+          <w:color w:val="000000"/>
+          <w:sz w:val="36"/>
+        </w:rPr>
+        <w:t>-NUMBER FOUR. OPT OUT OF THE SELLING, BECAUSE THE LAW IN A LOT OF STATES LETS YOU.</w:t>
+      </w:r>
+    </w:p>
+    <w:p>
+      <w:pPr>
+        <w:spacing w:lineRule="auto" w:line="276" w:before="0" w:after="0"/>
+      </w:pPr>
+      <w:r>
+        <w:rPr>
+          <w:rFonts w:ascii="Arial" w:hAnsi="Arial" w:cs="Arial" w:eastAsia="Arial"/>
+          <w:b w:val="0"/>
+          <w:color w:val="000000"/>
+          <w:sz w:val="36"/>
+        </w:rPr>
+      </w:r>
+    </w:p>
+    <w:p>
+      <w:pPr>
+        <w:spacing w:lineRule="auto" w:line="276" w:before="0" w:after="0"/>
+      </w:pPr>
+      <w:r>
+        <w:rPr>
+          <w:rFonts w:ascii="Arial" w:hAnsi="Arial" w:cs="Arial" w:eastAsia="Arial"/>
+          <w:b w:val="0"/>
+          <w:color w:val="000000"/>
+          <w:sz w:val="36"/>
+        </w:rPr>
+        <w:t>-IN THE STORE'S APP OR WEBSITE, LOOK FOR "</w:t>
+      </w:r>
+      <w:r>
+        <w:rPr>
+          <w:rFonts w:ascii="Arial" w:hAnsi="Arial" w:cs="Arial" w:eastAsia="Arial"/>
+          <w:b/>
+          <w:color w:val="000000"/>
+          <w:sz w:val="36"/>
+        </w:rPr>
+        <w:t>DO NOT SELL OR SHARE MY PERSONAL INFORMATION</w:t>
+      </w:r>
+      <w:r>
+        <w:rPr>
+          <w:rFonts w:ascii="Arial" w:hAnsi="Arial" w:cs="Arial" w:eastAsia="Arial"/>
+          <w:b w:val="0"/>
+          <w:color w:val="000000"/>
+          <w:sz w:val="36"/>
+        </w:rPr>
+        <w:t>" OR "</w:t>
+      </w:r>
+      <w:r>
+        <w:rPr>
+          <w:rFonts w:ascii="Arial" w:hAnsi="Arial" w:cs="Arial" w:eastAsia="Arial"/>
+          <w:b/>
+          <w:color w:val="000000"/>
+          <w:sz w:val="36"/>
+        </w:rPr>
+        <w:t>YOUR PRIVACY CHOICES</w:t>
+      </w:r>
+      <w:r>
+        <w:rPr>
+          <w:rFonts w:ascii="Arial" w:hAnsi="Arial" w:cs="Arial" w:eastAsia="Arial"/>
+          <w:b w:val="0"/>
+          <w:color w:val="000000"/>
+          <w:sz w:val="36"/>
+        </w:rPr>
+        <w:t>."</w:t>
+      </w:r>
+    </w:p>
+    <w:p>
+      <w:pPr>
+        <w:spacing w:lineRule="auto" w:line="276" w:before="0" w:after="0"/>
+      </w:pPr>
+      <w:r>
+        <w:rPr>
+          <w:rFonts w:ascii="Arial" w:hAnsi="Arial" w:cs="Arial" w:eastAsia="Arial"/>
+          <w:b w:val="0"/>
+          <w:color w:val="000000"/>
+          <w:sz w:val="36"/>
+        </w:rPr>
+      </w:r>
+    </w:p>
+    <w:p>
+      <w:pPr>
+        <w:spacing w:lineRule="auto" w:line="276" w:before="0" w:after="0"/>
+      </w:pPr>
+      <w:r>
+        <w:rPr>
+          <w:rFonts w:ascii="Arial" w:hAnsi="Arial" w:cs="Arial" w:eastAsia="Arial"/>
+          <w:b w:val="0"/>
+          <w:color w:val="000000"/>
+          <w:sz w:val="36"/>
+        </w:rPr>
+        <w:t>-AND REMEMBER YOU CAN PAUSE AND REWIND THIS VIDEO.</w:t>
+      </w:r>
+    </w:p>
+    <w:p>
+      <w:pPr>
+        <w:spacing w:lineRule="auto" w:line="276" w:before="0" w:after="0"/>
+      </w:pPr>
+      <w:r>
+        <w:rPr>
+          <w:rFonts w:ascii="Arial" w:hAnsi="Arial" w:cs="Arial" w:eastAsia="Arial"/>
+          <w:b w:val="0"/>
+          <w:color w:val="000000"/>
+          <w:sz w:val="36"/>
+        </w:rPr>
+      </w:r>
+    </w:p>
+    <w:p>
+      <w:pPr>
+        <w:spacing w:lineRule="auto" w:line="276" w:before="0" w:after="0"/>
+      </w:pPr>
+      <w:r>
+        <w:rPr>
+          <w:rFonts w:ascii="Arial" w:hAnsi="Arial" w:cs="Arial" w:eastAsia="Arial"/>
+          <w:b w:val="0"/>
+          <w:color w:val="000000"/>
+          <w:sz w:val="36"/>
+        </w:rPr>
+        <w:t>-DO THAT, AND THE BASKET TRACKS A BASKET. NOT YOU.</w:t>
+      </w:r>
+    </w:p>
+    <w:p>
+      <w:pPr>
+        <w:spacing w:lineRule="auto" w:line="276" w:before="0" w:after="0"/>
+      </w:pPr>
+      <w:r>
+        <w:rPr>
+          <w:rFonts w:ascii="Arial" w:hAnsi="Arial" w:cs="Arial" w:eastAsia="Arial"/>
+          <w:b w:val="0"/>
+          <w:color w:val="000000"/>
+          <w:sz w:val="36"/>
+        </w:rPr>
+      </w:r>
+    </w:p>
+    <w:p>
+      <w:pPr>
+        <w:spacing w:lineRule="auto" w:line="276" w:before="0" w:after="0"/>
+      </w:pPr>
+      <w:r>
+        <w:rPr>
+          <w:rFonts w:ascii="Arial" w:hAnsi="Arial" w:cs="Arial" w:eastAsia="Arial"/>
           <w:b/>
           <w:color w:val="000000"/>
           <w:sz w:val="46"/>
@@ -4518,907 +5445,7 @@
           <w:color w:val="000000"/>
           <w:sz w:val="36"/>
         </w:rPr>
-        <w:t>-BUT THE PART THAT TIES IT ALL BACK TO YOU... YOU CAN SHUT DOWN RIGHT NOW.</w:t>
-      </w:r>
-    </w:p>
-    <w:p>
-      <w:pPr>
-        <w:spacing w:lineRule="auto" w:line="276" w:before="0" w:after="0"/>
-      </w:pPr>
-      <w:r>
-        <w:rPr>
-          <w:rFonts w:ascii="Arial" w:hAnsi="Arial" w:cs="Arial" w:eastAsia="Arial"/>
-          <w:b w:val="0"/>
-          <w:color w:val="000000"/>
-          <w:sz w:val="36"/>
-        </w:rPr>
-      </w:r>
-    </w:p>
-    <w:p>
-      <w:pPr>
-        <w:spacing w:lineRule="auto" w:line="276" w:before="0" w:after="0"/>
-      </w:pPr>
-      <w:r>
-        <w:rPr>
-          <w:rFonts w:ascii="Arial" w:hAnsi="Arial" w:cs="Arial" w:eastAsia="Arial"/>
-          <w:b/>
-          <w:color w:val="000000"/>
-          <w:sz w:val="46"/>
-        </w:rPr>
-        <w:t>HERE'S HOW TO PROTECT YOURSELF</w:t>
-      </w:r>
-    </w:p>
-    <w:p>
-      <w:pPr>
-        <w:spacing w:lineRule="auto" w:line="276" w:before="0" w:after="0"/>
-      </w:pPr>
-      <w:r>
-        <w:rPr>
-          <w:rFonts w:ascii="Arial" w:hAnsi="Arial" w:cs="Arial" w:eastAsia="Arial"/>
-          <w:b w:val="0"/>
-          <w:color w:val="000000"/>
-          <w:sz w:val="36"/>
-        </w:rPr>
-      </w:r>
-    </w:p>
-    <w:p>
-      <w:pPr>
-        <w:spacing w:lineRule="auto" w:line="276" w:before="0" w:after="0"/>
-      </w:pPr>
-      <w:r>
-        <w:rPr>
-          <w:rFonts w:ascii="Arial" w:hAnsi="Arial" w:cs="Arial" w:eastAsia="Arial"/>
-          <w:b w:val="0"/>
-          <w:color w:val="000000"/>
-          <w:sz w:val="36"/>
-        </w:rPr>
-        <w:t>-HERE'S THE STEP BY STEP I WANT ALL OF YOU TO DO WITH ME... RIGHT NOW.</w:t>
-      </w:r>
-    </w:p>
-    <w:p>
-      <w:pPr>
-        <w:spacing w:lineRule="auto" w:line="276" w:before="0" w:after="0"/>
-      </w:pPr>
-      <w:r>
-        <w:rPr>
-          <w:rFonts w:ascii="Arial" w:hAnsi="Arial" w:cs="Arial" w:eastAsia="Arial"/>
-          <w:b w:val="0"/>
-          <w:color w:val="000000"/>
-          <w:sz w:val="36"/>
-        </w:rPr>
-      </w:r>
-    </w:p>
-    <w:p>
-      <w:pPr>
-        <w:spacing w:lineRule="auto" w:line="276" w:before="0" w:after="0"/>
-      </w:pPr>
-      <w:r>
-        <w:rPr>
-          <w:rFonts w:ascii="Arial" w:hAnsi="Arial" w:cs="Arial" w:eastAsia="Arial"/>
-          <w:b/>
-          <w:color w:val="FF0000"/>
-          <w:sz w:val="36"/>
-        </w:rPr>
-        <w:t>(((SHOW-PRODUCED: JEFF SCREEN SHARE, OR A PRE-RECORDED SCREEN RECORDING. ANDROID FIRST, THEN IPHONE)))</w:t>
-      </w:r>
-    </w:p>
-    <w:p>
-      <w:pPr>
-        <w:spacing w:lineRule="auto" w:line="276" w:before="0" w:after="0"/>
-      </w:pPr>
-      <w:r>
-        <w:rPr>
-          <w:rFonts w:ascii="Arial" w:hAnsi="Arial" w:cs="Arial" w:eastAsia="Arial"/>
-          <w:b w:val="0"/>
-          <w:color w:val="000000"/>
-          <w:sz w:val="36"/>
-        </w:rPr>
-      </w:r>
-    </w:p>
-    <w:p>
-      <w:pPr>
-        <w:spacing w:lineRule="auto" w:line="276" w:before="0" w:after="0"/>
-      </w:pPr>
-      <w:r>
-        <w:rPr>
-          <w:rFonts w:ascii="Arial" w:hAnsi="Arial" w:cs="Arial" w:eastAsia="Arial"/>
-          <w:b/>
-          <w:color w:val="FF0000"/>
-          <w:sz w:val="36"/>
-        </w:rPr>
-        <w:t>(((JEFF SCREEN SHARE)))</w:t>
-      </w:r>
-    </w:p>
-    <w:p>
-      <w:pPr>
-        <w:spacing w:lineRule="auto" w:line="276" w:before="0" w:after="0"/>
-      </w:pPr>
-      <w:r>
-        <w:rPr>
-          <w:rFonts w:ascii="Arial" w:hAnsi="Arial" w:cs="Arial" w:eastAsia="Arial"/>
-          <w:b w:val="0"/>
-          <w:color w:val="000000"/>
-          <w:sz w:val="36"/>
-        </w:rPr>
-      </w:r>
-    </w:p>
-    <w:p>
-      <w:pPr>
-        <w:spacing w:lineRule="auto" w:line="276" w:before="0" w:after="0"/>
-      </w:pPr>
-      <w:r>
-        <w:rPr>
-          <w:rFonts w:ascii="Arial" w:hAnsi="Arial" w:cs="Arial" w:eastAsia="Arial"/>
-          <w:b w:val="0"/>
-          <w:color w:val="000000"/>
-          <w:sz w:val="36"/>
-        </w:rPr>
-        <w:t xml:space="preserve">-NUMBER ONE. ON AN ANDROID, TURN OFF </w:t>
-      </w:r>
-      <w:r>
-        <w:rPr>
-          <w:rFonts w:ascii="Arial" w:hAnsi="Arial" w:cs="Arial" w:eastAsia="Arial"/>
-          <w:b/>
-          <w:color w:val="000000"/>
-          <w:sz w:val="36"/>
-        </w:rPr>
-        <w:t>BLUETOOTH SCANNING</w:t>
-      </w:r>
-      <w:r>
-        <w:rPr>
-          <w:rFonts w:ascii="Arial" w:hAnsi="Arial" w:cs="Arial" w:eastAsia="Arial"/>
-          <w:b w:val="0"/>
-          <w:color w:val="000000"/>
-          <w:sz w:val="36"/>
-        </w:rPr>
-        <w:t>.</w:t>
-      </w:r>
-    </w:p>
-    <w:p>
-      <w:pPr>
-        <w:spacing w:lineRule="auto" w:line="276" w:before="0" w:after="0"/>
-      </w:pPr>
-      <w:r>
-        <w:rPr>
-          <w:rFonts w:ascii="Arial" w:hAnsi="Arial" w:cs="Arial" w:eastAsia="Arial"/>
-          <w:b w:val="0"/>
-          <w:color w:val="000000"/>
-          <w:sz w:val="36"/>
-        </w:rPr>
-      </w:r>
-    </w:p>
-    <w:p>
-      <w:pPr>
-        <w:spacing w:lineRule="auto" w:line="276" w:before="0" w:after="0"/>
-      </w:pPr>
-      <w:r>
-        <w:rPr>
-          <w:rFonts w:ascii="Arial" w:hAnsi="Arial" w:cs="Arial" w:eastAsia="Arial"/>
-          <w:b w:val="0"/>
-          <w:color w:val="000000"/>
-          <w:sz w:val="36"/>
-        </w:rPr>
-        <w:t>-BECAUSE YOUR PHONE KEEPS LOOKING FOR BEACONS EVEN WHEN BLUETOOTH IS OFF!!</w:t>
-      </w:r>
-    </w:p>
-    <w:p>
-      <w:pPr>
-        <w:spacing w:lineRule="auto" w:line="276" w:before="0" w:after="0"/>
-      </w:pPr>
-      <w:r>
-        <w:rPr>
-          <w:rFonts w:ascii="Arial" w:hAnsi="Arial" w:cs="Arial" w:eastAsia="Arial"/>
-          <w:b w:val="0"/>
-          <w:color w:val="000000"/>
-          <w:sz w:val="36"/>
-        </w:rPr>
-      </w:r>
-    </w:p>
-    <w:p>
-      <w:pPr>
-        <w:spacing w:lineRule="auto" w:line="276" w:before="0" w:after="0"/>
-      </w:pPr>
-      <w:r>
-        <w:rPr>
-          <w:rFonts w:ascii="Arial" w:hAnsi="Arial" w:cs="Arial" w:eastAsia="Arial"/>
-          <w:b w:val="0"/>
-          <w:color w:val="000000"/>
-          <w:sz w:val="36"/>
-        </w:rPr>
-        <w:t>-GO TO "</w:t>
-      </w:r>
-      <w:r>
-        <w:rPr>
-          <w:rFonts w:ascii="Arial" w:hAnsi="Arial" w:cs="Arial" w:eastAsia="Arial"/>
-          <w:b/>
-          <w:color w:val="000000"/>
-          <w:sz w:val="36"/>
-        </w:rPr>
-        <w:t>SETTINGS</w:t>
-      </w:r>
-      <w:r>
-        <w:rPr>
-          <w:rFonts w:ascii="Arial" w:hAnsi="Arial" w:cs="Arial" w:eastAsia="Arial"/>
-          <w:b w:val="0"/>
-          <w:color w:val="000000"/>
-          <w:sz w:val="36"/>
-        </w:rPr>
-        <w:t>"... THEN "</w:t>
-      </w:r>
-      <w:r>
-        <w:rPr>
-          <w:rFonts w:ascii="Arial" w:hAnsi="Arial" w:cs="Arial" w:eastAsia="Arial"/>
-          <w:b/>
-          <w:color w:val="000000"/>
-          <w:sz w:val="36"/>
-        </w:rPr>
-        <w:t>LOCATION</w:t>
-      </w:r>
-      <w:r>
-        <w:rPr>
-          <w:rFonts w:ascii="Arial" w:hAnsi="Arial" w:cs="Arial" w:eastAsia="Arial"/>
-          <w:b w:val="0"/>
-          <w:color w:val="000000"/>
-          <w:sz w:val="36"/>
-        </w:rPr>
-        <w:t>"... THEN "</w:t>
-      </w:r>
-      <w:r>
-        <w:rPr>
-          <w:rFonts w:ascii="Arial" w:hAnsi="Arial" w:cs="Arial" w:eastAsia="Arial"/>
-          <w:b/>
-          <w:color w:val="000000"/>
-          <w:sz w:val="36"/>
-        </w:rPr>
-        <w:t>LOCATION SERVICES</w:t>
-      </w:r>
-      <w:r>
-        <w:rPr>
-          <w:rFonts w:ascii="Arial" w:hAnsi="Arial" w:cs="Arial" w:eastAsia="Arial"/>
-          <w:b w:val="0"/>
-          <w:color w:val="000000"/>
-          <w:sz w:val="36"/>
-        </w:rPr>
-        <w:t>"... AND SWITCH OFF "</w:t>
-      </w:r>
-      <w:r>
-        <w:rPr>
-          <w:rFonts w:ascii="Arial" w:hAnsi="Arial" w:cs="Arial" w:eastAsia="Arial"/>
-          <w:b/>
-          <w:color w:val="000000"/>
-          <w:sz w:val="36"/>
-        </w:rPr>
-        <w:t>BLUETOOTH SCANNING</w:t>
-      </w:r>
-      <w:r>
-        <w:rPr>
-          <w:rFonts w:ascii="Arial" w:hAnsi="Arial" w:cs="Arial" w:eastAsia="Arial"/>
-          <w:b w:val="0"/>
-          <w:color w:val="000000"/>
-          <w:sz w:val="36"/>
-        </w:rPr>
-        <w:t>."</w:t>
-      </w:r>
-    </w:p>
-    <w:p>
-      <w:pPr>
-        <w:spacing w:lineRule="auto" w:line="276" w:before="0" w:after="0"/>
-      </w:pPr>
-      <w:r>
-        <w:rPr>
-          <w:rFonts w:ascii="Arial" w:hAnsi="Arial" w:cs="Arial" w:eastAsia="Arial"/>
-          <w:b w:val="0"/>
-          <w:color w:val="000000"/>
-          <w:sz w:val="36"/>
-        </w:rPr>
-      </w:r>
-    </w:p>
-    <w:p>
-      <w:pPr>
-        <w:spacing w:lineRule="auto" w:line="276" w:before="0" w:after="0"/>
-      </w:pPr>
-      <w:r>
-        <w:rPr>
-          <w:rFonts w:ascii="Arial" w:hAnsi="Arial" w:cs="Arial" w:eastAsia="Arial"/>
-          <w:b w:val="0"/>
-          <w:color w:val="000000"/>
-          <w:sz w:val="36"/>
-        </w:rPr>
-        <w:t>-ON A SAMSUNG, IT'S THE SAME PATH.</w:t>
-      </w:r>
-    </w:p>
-    <w:p>
-      <w:pPr>
-        <w:spacing w:lineRule="auto" w:line="276" w:before="0" w:after="0"/>
-      </w:pPr>
-      <w:r>
-        <w:rPr>
-          <w:rFonts w:ascii="Arial" w:hAnsi="Arial" w:cs="Arial" w:eastAsia="Arial"/>
-          <w:b w:val="0"/>
-          <w:color w:val="000000"/>
-          <w:sz w:val="36"/>
-        </w:rPr>
-      </w:r>
-    </w:p>
-    <w:p>
-      <w:pPr>
-        <w:spacing w:lineRule="auto" w:line="276" w:before="0" w:after="0"/>
-      </w:pPr>
-      <w:r>
-        <w:rPr>
-          <w:rFonts w:ascii="Arial" w:hAnsi="Arial" w:cs="Arial" w:eastAsia="Arial"/>
-          <w:b w:val="0"/>
-          <w:color w:val="000000"/>
-          <w:sz w:val="36"/>
-        </w:rPr>
-        <w:t>-NUMBER TWO. STOP THE STORE APP FROM SEEING NEARBY DEVICES, SO IT CAN'T HEAR THE BEACONS.</w:t>
-      </w:r>
-    </w:p>
-    <w:p>
-      <w:pPr>
-        <w:spacing w:lineRule="auto" w:line="276" w:before="0" w:after="0"/>
-      </w:pPr>
-      <w:r>
-        <w:rPr>
-          <w:rFonts w:ascii="Arial" w:hAnsi="Arial" w:cs="Arial" w:eastAsia="Arial"/>
-          <w:b w:val="0"/>
-          <w:color w:val="000000"/>
-          <w:sz w:val="36"/>
-        </w:rPr>
-      </w:r>
-    </w:p>
-    <w:p>
-      <w:pPr>
-        <w:spacing w:lineRule="auto" w:line="276" w:before="0" w:after="0"/>
-      </w:pPr>
-      <w:r>
-        <w:rPr>
-          <w:rFonts w:ascii="Arial" w:hAnsi="Arial" w:cs="Arial" w:eastAsia="Arial"/>
-          <w:b w:val="0"/>
-          <w:color w:val="000000"/>
-          <w:sz w:val="36"/>
-        </w:rPr>
-        <w:t>-"</w:t>
-      </w:r>
-      <w:r>
-        <w:rPr>
-          <w:rFonts w:ascii="Arial" w:hAnsi="Arial" w:cs="Arial" w:eastAsia="Arial"/>
-          <w:b/>
-          <w:color w:val="000000"/>
-          <w:sz w:val="36"/>
-        </w:rPr>
-        <w:t>SETTINGS</w:t>
-      </w:r>
-      <w:r>
-        <w:rPr>
-          <w:rFonts w:ascii="Arial" w:hAnsi="Arial" w:cs="Arial" w:eastAsia="Arial"/>
-          <w:b w:val="0"/>
-          <w:color w:val="000000"/>
-          <w:sz w:val="36"/>
-        </w:rPr>
-        <w:t>"... "</w:t>
-      </w:r>
-      <w:r>
-        <w:rPr>
-          <w:rFonts w:ascii="Arial" w:hAnsi="Arial" w:cs="Arial" w:eastAsia="Arial"/>
-          <w:b/>
-          <w:color w:val="000000"/>
-          <w:sz w:val="36"/>
-        </w:rPr>
-        <w:t>APPS</w:t>
-      </w:r>
-      <w:r>
-        <w:rPr>
-          <w:rFonts w:ascii="Arial" w:hAnsi="Arial" w:cs="Arial" w:eastAsia="Arial"/>
-          <w:b w:val="0"/>
-          <w:color w:val="000000"/>
-          <w:sz w:val="36"/>
-        </w:rPr>
-        <w:t>"... THE STORE APP... "</w:t>
-      </w:r>
-      <w:r>
-        <w:rPr>
-          <w:rFonts w:ascii="Arial" w:hAnsi="Arial" w:cs="Arial" w:eastAsia="Arial"/>
-          <w:b/>
-          <w:color w:val="000000"/>
-          <w:sz w:val="36"/>
-        </w:rPr>
-        <w:t>PERMISSIONS</w:t>
-      </w:r>
-      <w:r>
-        <w:rPr>
-          <w:rFonts w:ascii="Arial" w:hAnsi="Arial" w:cs="Arial" w:eastAsia="Arial"/>
-          <w:b w:val="0"/>
-          <w:color w:val="000000"/>
-          <w:sz w:val="36"/>
-        </w:rPr>
-        <w:t>"... "</w:t>
-      </w:r>
-      <w:r>
-        <w:rPr>
-          <w:rFonts w:ascii="Arial" w:hAnsi="Arial" w:cs="Arial" w:eastAsia="Arial"/>
-          <w:b/>
-          <w:color w:val="000000"/>
-          <w:sz w:val="36"/>
-        </w:rPr>
-        <w:t>NEARBY DEVICES</w:t>
-      </w:r>
-      <w:r>
-        <w:rPr>
-          <w:rFonts w:ascii="Arial" w:hAnsi="Arial" w:cs="Arial" w:eastAsia="Arial"/>
-          <w:b w:val="0"/>
-          <w:color w:val="000000"/>
-          <w:sz w:val="36"/>
-        </w:rPr>
-        <w:t>"... "</w:t>
-      </w:r>
-      <w:r>
-        <w:rPr>
-          <w:rFonts w:ascii="Arial" w:hAnsi="Arial" w:cs="Arial" w:eastAsia="Arial"/>
-          <w:b/>
-          <w:color w:val="000000"/>
-          <w:sz w:val="36"/>
-        </w:rPr>
-        <w:t>DON'T ALLOW</w:t>
-      </w:r>
-      <w:r>
-        <w:rPr>
-          <w:rFonts w:ascii="Arial" w:hAnsi="Arial" w:cs="Arial" w:eastAsia="Arial"/>
-          <w:b w:val="0"/>
-          <w:color w:val="000000"/>
-          <w:sz w:val="36"/>
-        </w:rPr>
-        <w:t>."</w:t>
-      </w:r>
-    </w:p>
-    <w:p>
-      <w:pPr>
-        <w:spacing w:lineRule="auto" w:line="276" w:before="0" w:after="0"/>
-      </w:pPr>
-      <w:r>
-        <w:rPr>
-          <w:rFonts w:ascii="Arial" w:hAnsi="Arial" w:cs="Arial" w:eastAsia="Arial"/>
-          <w:b w:val="0"/>
-          <w:color w:val="000000"/>
-          <w:sz w:val="36"/>
-        </w:rPr>
-      </w:r>
-    </w:p>
-    <w:p>
-      <w:pPr>
-        <w:spacing w:lineRule="auto" w:line="276" w:before="0" w:after="0"/>
-      </w:pPr>
-      <w:r>
-        <w:rPr>
-          <w:rFonts w:ascii="Arial" w:hAnsi="Arial" w:cs="Arial" w:eastAsia="Arial"/>
-          <w:b w:val="0"/>
-          <w:color w:val="000000"/>
-          <w:sz w:val="36"/>
-        </w:rPr>
-        <w:t>-NUMBER THREE. ON AN IPHONE, TURN OFF LOCATION FOR THE STORE APP.</w:t>
-      </w:r>
-    </w:p>
-    <w:p>
-      <w:pPr>
-        <w:spacing w:lineRule="auto" w:line="276" w:before="0" w:after="0"/>
-      </w:pPr>
-      <w:r>
-        <w:rPr>
-          <w:rFonts w:ascii="Arial" w:hAnsi="Arial" w:cs="Arial" w:eastAsia="Arial"/>
-          <w:b w:val="0"/>
-          <w:color w:val="000000"/>
-          <w:sz w:val="36"/>
-        </w:rPr>
-      </w:r>
-    </w:p>
-    <w:p>
-      <w:pPr>
-        <w:spacing w:lineRule="auto" w:line="276" w:before="0" w:after="0"/>
-      </w:pPr>
-      <w:r>
-        <w:rPr>
-          <w:rFonts w:ascii="Arial" w:hAnsi="Arial" w:cs="Arial" w:eastAsia="Arial"/>
-          <w:b w:val="0"/>
-          <w:color w:val="000000"/>
-          <w:sz w:val="36"/>
-        </w:rPr>
-        <w:t>-BECAUSE THAT'S HOW IPHONE APPS PICK UP THE BEACONS.</w:t>
-      </w:r>
-    </w:p>
-    <w:p>
-      <w:pPr>
-        <w:spacing w:lineRule="auto" w:line="276" w:before="0" w:after="0"/>
-      </w:pPr>
-      <w:r>
-        <w:rPr>
-          <w:rFonts w:ascii="Arial" w:hAnsi="Arial" w:cs="Arial" w:eastAsia="Arial"/>
-          <w:b w:val="0"/>
-          <w:color w:val="000000"/>
-          <w:sz w:val="36"/>
-        </w:rPr>
-      </w:r>
-    </w:p>
-    <w:p>
-      <w:pPr>
-        <w:spacing w:lineRule="auto" w:line="276" w:before="0" w:after="0"/>
-      </w:pPr>
-      <w:r>
-        <w:rPr>
-          <w:rFonts w:ascii="Arial" w:hAnsi="Arial" w:cs="Arial" w:eastAsia="Arial"/>
-          <w:b w:val="0"/>
-          <w:color w:val="000000"/>
-          <w:sz w:val="36"/>
-        </w:rPr>
-        <w:t>-"</w:t>
-      </w:r>
-      <w:r>
-        <w:rPr>
-          <w:rFonts w:ascii="Arial" w:hAnsi="Arial" w:cs="Arial" w:eastAsia="Arial"/>
-          <w:b/>
-          <w:color w:val="000000"/>
-          <w:sz w:val="36"/>
-        </w:rPr>
-        <w:t>SETTINGS</w:t>
-      </w:r>
-      <w:r>
-        <w:rPr>
-          <w:rFonts w:ascii="Arial" w:hAnsi="Arial" w:cs="Arial" w:eastAsia="Arial"/>
-          <w:b w:val="0"/>
-          <w:color w:val="000000"/>
-          <w:sz w:val="36"/>
-        </w:rPr>
-        <w:t>"... "</w:t>
-      </w:r>
-      <w:r>
-        <w:rPr>
-          <w:rFonts w:ascii="Arial" w:hAnsi="Arial" w:cs="Arial" w:eastAsia="Arial"/>
-          <w:b/>
-          <w:color w:val="000000"/>
-          <w:sz w:val="36"/>
-        </w:rPr>
-        <w:t>PRIVACY &amp; SECURITY</w:t>
-      </w:r>
-      <w:r>
-        <w:rPr>
-          <w:rFonts w:ascii="Arial" w:hAnsi="Arial" w:cs="Arial" w:eastAsia="Arial"/>
-          <w:b w:val="0"/>
-          <w:color w:val="000000"/>
-          <w:sz w:val="36"/>
-        </w:rPr>
-        <w:t>"... "</w:t>
-      </w:r>
-      <w:r>
-        <w:rPr>
-          <w:rFonts w:ascii="Arial" w:hAnsi="Arial" w:cs="Arial" w:eastAsia="Arial"/>
-          <w:b/>
-          <w:color w:val="000000"/>
-          <w:sz w:val="36"/>
-        </w:rPr>
-        <w:t>LOCATION SERVICES</w:t>
-      </w:r>
-      <w:r>
-        <w:rPr>
-          <w:rFonts w:ascii="Arial" w:hAnsi="Arial" w:cs="Arial" w:eastAsia="Arial"/>
-          <w:b w:val="0"/>
-          <w:color w:val="000000"/>
-          <w:sz w:val="36"/>
-        </w:rPr>
-        <w:t>"... THE STORE APP... "</w:t>
-      </w:r>
-      <w:r>
-        <w:rPr>
-          <w:rFonts w:ascii="Arial" w:hAnsi="Arial" w:cs="Arial" w:eastAsia="Arial"/>
-          <w:b/>
-          <w:color w:val="000000"/>
-          <w:sz w:val="36"/>
-        </w:rPr>
-        <w:t>NEVER</w:t>
-      </w:r>
-      <w:r>
-        <w:rPr>
-          <w:rFonts w:ascii="Arial" w:hAnsi="Arial" w:cs="Arial" w:eastAsia="Arial"/>
-          <w:b w:val="0"/>
-          <w:color w:val="000000"/>
-          <w:sz w:val="36"/>
-        </w:rPr>
-        <w:t>" OR "</w:t>
-      </w:r>
-      <w:r>
-        <w:rPr>
-          <w:rFonts w:ascii="Arial" w:hAnsi="Arial" w:cs="Arial" w:eastAsia="Arial"/>
-          <w:b/>
-          <w:color w:val="000000"/>
-          <w:sz w:val="36"/>
-        </w:rPr>
-        <w:t>WHILE USING</w:t>
-      </w:r>
-      <w:r>
-        <w:rPr>
-          <w:rFonts w:ascii="Arial" w:hAnsi="Arial" w:cs="Arial" w:eastAsia="Arial"/>
-          <w:b w:val="0"/>
-          <w:color w:val="000000"/>
-          <w:sz w:val="36"/>
-        </w:rPr>
-        <w:t>."</w:t>
-      </w:r>
-    </w:p>
-    <w:p>
-      <w:pPr>
-        <w:spacing w:lineRule="auto" w:line="276" w:before="0" w:after="0"/>
-      </w:pPr>
-      <w:r>
-        <w:rPr>
-          <w:rFonts w:ascii="Arial" w:hAnsi="Arial" w:cs="Arial" w:eastAsia="Arial"/>
-          <w:b w:val="0"/>
-          <w:color w:val="000000"/>
-          <w:sz w:val="36"/>
-        </w:rPr>
-      </w:r>
-    </w:p>
-    <w:p>
-      <w:pPr>
-        <w:spacing w:lineRule="auto" w:line="276" w:before="0" w:after="0"/>
-      </w:pPr>
-      <w:r>
-        <w:rPr>
-          <w:rFonts w:ascii="Arial" w:hAnsi="Arial" w:cs="Arial" w:eastAsia="Arial"/>
-          <w:b w:val="0"/>
-          <w:color w:val="000000"/>
-          <w:sz w:val="36"/>
-        </w:rPr>
-        <w:t>-AND WHILE YOU'RE THERE, SWITCH OFF "</w:t>
-      </w:r>
-      <w:r>
-        <w:rPr>
-          <w:rFonts w:ascii="Arial" w:hAnsi="Arial" w:cs="Arial" w:eastAsia="Arial"/>
-          <w:b/>
-          <w:color w:val="000000"/>
-          <w:sz w:val="36"/>
-        </w:rPr>
-        <w:t>PRECISE LOCATION</w:t>
-      </w:r>
-      <w:r>
-        <w:rPr>
-          <w:rFonts w:ascii="Arial" w:hAnsi="Arial" w:cs="Arial" w:eastAsia="Arial"/>
-          <w:b w:val="0"/>
-          <w:color w:val="000000"/>
-          <w:sz w:val="36"/>
-        </w:rPr>
-        <w:t>."</w:t>
-      </w:r>
-    </w:p>
-    <w:p>
-      <w:pPr>
-        <w:spacing w:lineRule="auto" w:line="276" w:before="0" w:after="0"/>
-      </w:pPr>
-      <w:r>
-        <w:rPr>
-          <w:rFonts w:ascii="Arial" w:hAnsi="Arial" w:cs="Arial" w:eastAsia="Arial"/>
-          <w:b w:val="0"/>
-          <w:color w:val="000000"/>
-          <w:sz w:val="36"/>
-        </w:rPr>
-      </w:r>
-    </w:p>
-    <w:p>
-      <w:pPr>
-        <w:spacing w:lineRule="auto" w:line="276" w:before="0" w:after="0"/>
-      </w:pPr>
-      <w:r>
-        <w:rPr>
-          <w:rFonts w:ascii="Arial" w:hAnsi="Arial" w:cs="Arial" w:eastAsia="Arial"/>
-          <w:b w:val="0"/>
-          <w:color w:val="000000"/>
-          <w:sz w:val="36"/>
-        </w:rPr>
-        <w:t>-THEN GO BACK TO "</w:t>
-      </w:r>
-      <w:r>
-        <w:rPr>
-          <w:rFonts w:ascii="Arial" w:hAnsi="Arial" w:cs="Arial" w:eastAsia="Arial"/>
-          <w:b/>
-          <w:color w:val="000000"/>
-          <w:sz w:val="36"/>
-        </w:rPr>
-        <w:t>PRIVACY &amp; SECURITY</w:t>
-      </w:r>
-      <w:r>
-        <w:rPr>
-          <w:rFonts w:ascii="Arial" w:hAnsi="Arial" w:cs="Arial" w:eastAsia="Arial"/>
-          <w:b w:val="0"/>
-          <w:color w:val="000000"/>
-          <w:sz w:val="36"/>
-        </w:rPr>
-        <w:t>"... "</w:t>
-      </w:r>
-      <w:r>
-        <w:rPr>
-          <w:rFonts w:ascii="Arial" w:hAnsi="Arial" w:cs="Arial" w:eastAsia="Arial"/>
-          <w:b/>
-          <w:color w:val="000000"/>
-          <w:sz w:val="36"/>
-        </w:rPr>
-        <w:t>BLUETOOTH</w:t>
-      </w:r>
-      <w:r>
-        <w:rPr>
-          <w:rFonts w:ascii="Arial" w:hAnsi="Arial" w:cs="Arial" w:eastAsia="Arial"/>
-          <w:b w:val="0"/>
-          <w:color w:val="000000"/>
-          <w:sz w:val="36"/>
-        </w:rPr>
-        <w:t>"... AND SWITCH THE STORE APP OFF.</w:t>
-      </w:r>
-    </w:p>
-    <w:p>
-      <w:pPr>
-        <w:spacing w:lineRule="auto" w:line="276" w:before="0" w:after="0"/>
-      </w:pPr>
-      <w:r>
-        <w:rPr>
-          <w:rFonts w:ascii="Arial" w:hAnsi="Arial" w:cs="Arial" w:eastAsia="Arial"/>
-          <w:b w:val="0"/>
-          <w:color w:val="000000"/>
-          <w:sz w:val="36"/>
-        </w:rPr>
-      </w:r>
-    </w:p>
-    <w:p>
-      <w:pPr>
-        <w:spacing w:lineRule="auto" w:line="276" w:before="0" w:after="0"/>
-      </w:pPr>
-      <w:r>
-        <w:rPr>
-          <w:rFonts w:ascii="Arial" w:hAnsi="Arial" w:cs="Arial" w:eastAsia="Arial"/>
-          <w:b/>
-          <w:color w:val="FF0000"/>
-          <w:sz w:val="36"/>
-        </w:rPr>
-        <w:t>(((END SCREENSHARE)))</w:t>
-      </w:r>
-    </w:p>
-    <w:p>
-      <w:pPr>
-        <w:spacing w:lineRule="auto" w:line="276" w:before="0" w:after="0"/>
-      </w:pPr>
-      <w:r>
-        <w:rPr>
-          <w:rFonts w:ascii="Arial" w:hAnsi="Arial" w:cs="Arial" w:eastAsia="Arial"/>
-          <w:b w:val="0"/>
-          <w:color w:val="000000"/>
-          <w:sz w:val="36"/>
-        </w:rPr>
-      </w:r>
-    </w:p>
-    <w:p>
-      <w:pPr>
-        <w:spacing w:lineRule="auto" w:line="276" w:before="0" w:after="0"/>
-      </w:pPr>
-      <w:r>
-        <w:rPr>
-          <w:rFonts w:ascii="Arial" w:hAnsi="Arial" w:cs="Arial" w:eastAsia="Arial"/>
-          <w:b w:val="0"/>
-          <w:color w:val="000000"/>
-          <w:sz w:val="36"/>
-        </w:rPr>
-        <w:t>-NUMBER FOUR. OPT OUT OF THE SELLING, BECAUSE THE LAW IN A LOT OF STATES LETS YOU.</w:t>
-      </w:r>
-    </w:p>
-    <w:p>
-      <w:pPr>
-        <w:spacing w:lineRule="auto" w:line="276" w:before="0" w:after="0"/>
-      </w:pPr>
-      <w:r>
-        <w:rPr>
-          <w:rFonts w:ascii="Arial" w:hAnsi="Arial" w:cs="Arial" w:eastAsia="Arial"/>
-          <w:b w:val="0"/>
-          <w:color w:val="000000"/>
-          <w:sz w:val="36"/>
-        </w:rPr>
-      </w:r>
-    </w:p>
-    <w:p>
-      <w:pPr>
-        <w:spacing w:lineRule="auto" w:line="276" w:before="0" w:after="0"/>
-      </w:pPr>
-      <w:r>
-        <w:rPr>
-          <w:rFonts w:ascii="Arial" w:hAnsi="Arial" w:cs="Arial" w:eastAsia="Arial"/>
-          <w:b w:val="0"/>
-          <w:color w:val="000000"/>
-          <w:sz w:val="36"/>
-        </w:rPr>
-        <w:t>-IN THE STORE'S APP OR WEBSITE, LOOK FOR "</w:t>
-      </w:r>
-      <w:r>
-        <w:rPr>
-          <w:rFonts w:ascii="Arial" w:hAnsi="Arial" w:cs="Arial" w:eastAsia="Arial"/>
-          <w:b/>
-          <w:color w:val="000000"/>
-          <w:sz w:val="36"/>
-        </w:rPr>
-        <w:t>DO NOT SELL OR SHARE MY PERSONAL INFORMATION</w:t>
-      </w:r>
-      <w:r>
-        <w:rPr>
-          <w:rFonts w:ascii="Arial" w:hAnsi="Arial" w:cs="Arial" w:eastAsia="Arial"/>
-          <w:b w:val="0"/>
-          <w:color w:val="000000"/>
-          <w:sz w:val="36"/>
-        </w:rPr>
-        <w:t>" OR "</w:t>
-      </w:r>
-      <w:r>
-        <w:rPr>
-          <w:rFonts w:ascii="Arial" w:hAnsi="Arial" w:cs="Arial" w:eastAsia="Arial"/>
-          <w:b/>
-          <w:color w:val="000000"/>
-          <w:sz w:val="36"/>
-        </w:rPr>
-        <w:t>YOUR PRIVACY CHOICES</w:t>
-      </w:r>
-      <w:r>
-        <w:rPr>
-          <w:rFonts w:ascii="Arial" w:hAnsi="Arial" w:cs="Arial" w:eastAsia="Arial"/>
-          <w:b w:val="0"/>
-          <w:color w:val="000000"/>
-          <w:sz w:val="36"/>
-        </w:rPr>
-        <w:t>."</w:t>
-      </w:r>
-    </w:p>
-    <w:p>
-      <w:pPr>
-        <w:spacing w:lineRule="auto" w:line="276" w:before="0" w:after="0"/>
-      </w:pPr>
-      <w:r>
-        <w:rPr>
-          <w:rFonts w:ascii="Arial" w:hAnsi="Arial" w:cs="Arial" w:eastAsia="Arial"/>
-          <w:b w:val="0"/>
-          <w:color w:val="000000"/>
-          <w:sz w:val="36"/>
-        </w:rPr>
-      </w:r>
-    </w:p>
-    <w:p>
-      <w:pPr>
-        <w:spacing w:lineRule="auto" w:line="276" w:before="0" w:after="0"/>
-      </w:pPr>
-      <w:r>
-        <w:rPr>
-          <w:rFonts w:ascii="Arial" w:hAnsi="Arial" w:cs="Arial" w:eastAsia="Arial"/>
-          <w:b w:val="0"/>
-          <w:color w:val="000000"/>
-          <w:sz w:val="36"/>
-        </w:rPr>
-        <w:t>-AND REMEMBER YOU CAN PAUSE AND REWIND THIS VIDEO.</w:t>
-      </w:r>
-    </w:p>
-    <w:p>
-      <w:pPr>
-        <w:spacing w:lineRule="auto" w:line="276" w:before="0" w:after="0"/>
-      </w:pPr>
-      <w:r>
-        <w:rPr>
-          <w:rFonts w:ascii="Arial" w:hAnsi="Arial" w:cs="Arial" w:eastAsia="Arial"/>
-          <w:b w:val="0"/>
-          <w:color w:val="000000"/>
-          <w:sz w:val="36"/>
-        </w:rPr>
-      </w:r>
-    </w:p>
-    <w:p>
-      <w:pPr>
-        <w:spacing w:lineRule="auto" w:line="276" w:before="0" w:after="0"/>
-      </w:pPr>
-      <w:r>
-        <w:rPr>
-          <w:rFonts w:ascii="Arial" w:hAnsi="Arial" w:cs="Arial" w:eastAsia="Arial"/>
-          <w:b w:val="0"/>
-          <w:color w:val="000000"/>
-          <w:sz w:val="36"/>
-        </w:rPr>
-        <w:t>-DO THAT, AND THE BASKET TRACKS A BASKET. NOT YOU.</w:t>
+        <w:t>-SO NOW YOU KNOW EXACTLY WHAT THAT CART IS DOING WHEN YOU PUSH IT DOWN THE AISLE.</w:t>
       </w:r>
     </w:p>
     <w:p>

</xml_diff>

<commit_message>
10/07 bible: rewrite Story C around humans returning to the workforce
McDonald's Make It Golden leads; Burger King, Taco Bell (stated
accurately: still expanding AI) and Starbucks follow. Sources and flags
added to SOURCE_LOG.md.

Co-Authored-By: Claude Opus 5.5 <noreply@anthropic.com>
Claude-Session: https://claude.ai/code/session_01TNJ6mpHv7cQth7iuoFbymm
</commit_message>
<xml_diff>
--- a/runs/W_10072026/10_07 LIVE BIBLE.docx
+++ b/runs/W_10072026/10_07 LIVE BIBLE.docx
@@ -5634,115 +5634,520 @@
           <w:color w:val="000000"/>
           <w:sz w:val="36"/>
         </w:rPr>
-        <w:t>-YOU PULL UP TO THE DRIVE-THRU, AND INSTEAD OF A PERSON, A COMPUTER VOICE TAKES YOUR ORDER.</w:t>
-      </w:r>
-    </w:p>
-    <w:p>
-      <w:pPr>
-        <w:spacing w:lineRule="auto" w:line="276" w:before="0" w:after="0"/>
-      </w:pPr>
-      <w:r>
-        <w:rPr>
-          <w:rFonts w:ascii="Arial" w:hAnsi="Arial" w:cs="Arial" w:eastAsia="Arial"/>
-          <w:b w:val="0"/>
-          <w:color w:val="000000"/>
-          <w:sz w:val="36"/>
-        </w:rPr>
-      </w:r>
-    </w:p>
-    <w:p>
-      <w:pPr>
-        <w:spacing w:lineRule="auto" w:line="276" w:before="0" w:after="0"/>
-      </w:pPr>
-      <w:r>
-        <w:rPr>
-          <w:rFonts w:ascii="Arial" w:hAnsi="Arial" w:cs="Arial" w:eastAsia="Arial"/>
-          <w:b w:val="0"/>
-          <w:color w:val="000000"/>
-          <w:sz w:val="36"/>
-        </w:rPr>
-        <w:t>-YOU'VE PROBABLY BEEN THERE. YOU SAY IT ONCE. YOU SAY IT AGAIN. IT STILL GETS IT WRONG.</w:t>
-      </w:r>
-    </w:p>
-    <w:p>
-      <w:pPr>
-        <w:spacing w:lineRule="auto" w:line="276" w:before="0" w:after="0"/>
-      </w:pPr>
-      <w:r>
-        <w:rPr>
-          <w:rFonts w:ascii="Arial" w:hAnsi="Arial" w:cs="Arial" w:eastAsia="Arial"/>
-          <w:b w:val="0"/>
-          <w:color w:val="000000"/>
-          <w:sz w:val="36"/>
-        </w:rPr>
-      </w:r>
-    </w:p>
-    <w:p>
-      <w:pPr>
-        <w:spacing w:lineRule="auto" w:line="276" w:before="0" w:after="0"/>
-      </w:pPr>
-      <w:r>
-        <w:rPr>
-          <w:rFonts w:ascii="Arial" w:hAnsi="Arial" w:cs="Arial" w:eastAsia="Arial"/>
-          <w:b w:val="0"/>
-          <w:color w:val="000000"/>
-          <w:sz w:val="36"/>
-        </w:rPr>
-        <w:t>-THIS DRIVER FILMED THE AI VOICE AT A MCDONALD'S DRIVE-THRU BACK IN 2023.</w:t>
-      </w:r>
-    </w:p>
-    <w:p>
-      <w:pPr>
-        <w:spacing w:lineRule="auto" w:line="276" w:before="0" w:after="0"/>
-      </w:pPr>
-      <w:r>
-        <w:rPr>
-          <w:rFonts w:ascii="Arial" w:hAnsi="Arial" w:cs="Arial" w:eastAsia="Arial"/>
-          <w:b w:val="0"/>
-          <w:color w:val="000000"/>
-          <w:sz w:val="36"/>
-        </w:rPr>
-      </w:r>
-    </w:p>
-    <w:p>
-      <w:pPr>
-        <w:spacing w:lineRule="auto" w:line="276" w:before="0" w:after="0"/>
-      </w:pPr>
-      <w:r>
-        <w:rPr>
-          <w:rFonts w:ascii="Arial" w:hAnsi="Arial" w:cs="Arial" w:eastAsia="Arial"/>
-          <w:b w:val="0"/>
-          <w:color w:val="000000"/>
-          <w:sz w:val="36"/>
-        </w:rPr>
-        <w:t>-ALL THEY WANTED WAS A SIMPLE ORDER. THE VIDEO WENT VIRAL.</w:t>
-      </w:r>
-    </w:p>
-    <w:p>
-      <w:pPr>
-        <w:spacing w:lineRule="auto" w:line="276" w:before="0" w:after="0"/>
-      </w:pPr>
-      <w:r>
-        <w:rPr>
-          <w:rFonts w:ascii="Arial" w:hAnsi="Arial" w:cs="Arial" w:eastAsia="Arial"/>
-          <w:b w:val="0"/>
-          <w:color w:val="000000"/>
-          <w:sz w:val="36"/>
-        </w:rPr>
-      </w:r>
-    </w:p>
-    <w:p>
-      <w:pPr>
-        <w:spacing w:lineRule="auto" w:line="276" w:before="0" w:after="0"/>
-      </w:pPr>
-      <w:r>
-        <w:rPr>
-          <w:rFonts w:ascii="Arial" w:hAnsi="Arial" w:cs="Arial" w:eastAsia="Arial"/>
-          <w:b w:val="0"/>
-          <w:color w:val="000000"/>
-          <w:sz w:val="36"/>
-        </w:rPr>
-        <w:t xml:space="preserve">-THE PROBLEM? THE </w:t>
+        <w:t>-FOR YEARS, FAST FOOD HAS BEEN SWAPPING PEOPLE FOR KIOSKS, APPS AND AI VOICES AT THE DRIVE-THRU.</w:t>
+      </w:r>
+    </w:p>
+    <w:p>
+      <w:pPr>
+        <w:spacing w:lineRule="auto" w:line="276" w:before="0" w:after="0"/>
+      </w:pPr>
+      <w:r>
+        <w:rPr>
+          <w:rFonts w:ascii="Arial" w:hAnsi="Arial" w:cs="Arial" w:eastAsia="Arial"/>
+          <w:b w:val="0"/>
+          <w:color w:val="000000"/>
+          <w:sz w:val="36"/>
+        </w:rPr>
+      </w:r>
+    </w:p>
+    <w:p>
+      <w:pPr>
+        <w:spacing w:lineRule="auto" w:line="276" w:before="0" w:after="0"/>
+      </w:pPr>
+      <w:r>
+        <w:rPr>
+          <w:rFonts w:ascii="Arial" w:hAnsi="Arial" w:cs="Arial" w:eastAsia="Arial"/>
+          <w:b w:val="0"/>
+          <w:color w:val="000000"/>
+          <w:sz w:val="36"/>
+        </w:rPr>
+        <w:t>-AND NOW THE BIGGEST BURGER CHAIN IN THE WORLD IS BETTING ON PEOPLE AGAIN!!</w:t>
+      </w:r>
+    </w:p>
+    <w:p>
+      <w:pPr>
+        <w:spacing w:lineRule="auto" w:line="276" w:before="0" w:after="0"/>
+      </w:pPr>
+      <w:r>
+        <w:rPr>
+          <w:rFonts w:ascii="Arial" w:hAnsi="Arial" w:cs="Arial" w:eastAsia="Arial"/>
+          <w:b w:val="0"/>
+          <w:color w:val="000000"/>
+          <w:sz w:val="36"/>
+        </w:rPr>
+      </w:r>
+    </w:p>
+    <w:p>
+      <w:pPr>
+        <w:spacing w:lineRule="auto" w:line="276" w:before="0" w:after="0"/>
+      </w:pPr>
+      <w:r>
+        <w:rPr>
+          <w:rFonts w:ascii="Arial" w:hAnsi="Arial" w:cs="Arial" w:eastAsia="Arial"/>
+          <w:b w:val="0"/>
+          <w:color w:val="000000"/>
+          <w:sz w:val="36"/>
+        </w:rPr>
+        <w:t xml:space="preserve">-STARTING OCTOBER 5TH, MCDONALD'S IS RETRAINING MORE THAN </w:t>
+      </w:r>
+      <w:r>
+        <w:rPr>
+          <w:rFonts w:ascii="Arial" w:hAnsi="Arial" w:cs="Arial" w:eastAsia="Arial"/>
+          <w:b/>
+          <w:color w:val="000000"/>
+          <w:sz w:val="36"/>
+        </w:rPr>
+        <w:t>2 MILLION WORKERS</w:t>
+      </w:r>
+      <w:r>
+        <w:rPr>
+          <w:rFonts w:ascii="Arial" w:hAnsi="Arial" w:cs="Arial" w:eastAsia="Arial"/>
+          <w:b w:val="0"/>
+          <w:color w:val="000000"/>
+          <w:sz w:val="36"/>
+        </w:rPr>
+        <w:t xml:space="preserve"> AROUND THE WORLD.</w:t>
+      </w:r>
+    </w:p>
+    <w:p>
+      <w:pPr>
+        <w:spacing w:lineRule="auto" w:line="276" w:before="0" w:after="0"/>
+      </w:pPr>
+      <w:r>
+        <w:rPr>
+          <w:rFonts w:ascii="Arial" w:hAnsi="Arial" w:cs="Arial" w:eastAsia="Arial"/>
+          <w:b w:val="0"/>
+          <w:color w:val="000000"/>
+          <w:sz w:val="36"/>
+        </w:rPr>
+      </w:r>
+    </w:p>
+    <w:p>
+      <w:pPr>
+        <w:spacing w:lineRule="auto" w:line="276" w:before="0" w:after="0"/>
+      </w:pPr>
+      <w:r>
+        <w:rPr>
+          <w:rFonts w:ascii="Arial" w:hAnsi="Arial" w:cs="Arial" w:eastAsia="Arial"/>
+          <w:b w:val="0"/>
+          <w:color w:val="000000"/>
+          <w:sz w:val="36"/>
+        </w:rPr>
+        <w:t>-OCTOBER 5TH IS MCDONALD'S FOUNDER'S DAY. RAY KROC'S BIRTHDAY.</w:t>
+      </w:r>
+    </w:p>
+    <w:p>
+      <w:pPr>
+        <w:spacing w:lineRule="auto" w:line="276" w:before="0" w:after="0"/>
+      </w:pPr>
+      <w:r>
+        <w:rPr>
+          <w:rFonts w:ascii="Arial" w:hAnsi="Arial" w:cs="Arial" w:eastAsia="Arial"/>
+          <w:b w:val="0"/>
+          <w:color w:val="000000"/>
+          <w:sz w:val="36"/>
+        </w:rPr>
+      </w:r>
+    </w:p>
+    <w:p>
+      <w:pPr>
+        <w:spacing w:lineRule="auto" w:line="276" w:before="0" w:after="0"/>
+      </w:pPr>
+      <w:r>
+        <w:rPr>
+          <w:rFonts w:ascii="Arial" w:hAnsi="Arial" w:cs="Arial" w:eastAsia="Arial"/>
+          <w:b w:val="0"/>
+          <w:color w:val="000000"/>
+          <w:sz w:val="36"/>
+        </w:rPr>
+        <w:t>-IT'S CALLED "</w:t>
+      </w:r>
+      <w:r>
+        <w:rPr>
+          <w:rFonts w:ascii="Arial" w:hAnsi="Arial" w:cs="Arial" w:eastAsia="Arial"/>
+          <w:b/>
+          <w:color w:val="000000"/>
+          <w:sz w:val="36"/>
+        </w:rPr>
+        <w:t>MAKE IT GOLDEN</w:t>
+      </w:r>
+      <w:r>
+        <w:rPr>
+          <w:rFonts w:ascii="Arial" w:hAnsi="Arial" w:cs="Arial" w:eastAsia="Arial"/>
+          <w:b w:val="0"/>
+          <w:color w:val="000000"/>
+          <w:sz w:val="36"/>
+        </w:rPr>
+        <w:t>," AND IT'S ALL ABOUT HOSPITALITY... HOW THEY TREAT YOU.</w:t>
+      </w:r>
+    </w:p>
+    <w:p>
+      <w:pPr>
+        <w:spacing w:lineRule="auto" w:line="276" w:before="0" w:after="0"/>
+      </w:pPr>
+      <w:r>
+        <w:rPr>
+          <w:rFonts w:ascii="Arial" w:hAnsi="Arial" w:cs="Arial" w:eastAsia="Arial"/>
+          <w:b w:val="0"/>
+          <w:color w:val="000000"/>
+          <w:sz w:val="36"/>
+        </w:rPr>
+      </w:r>
+    </w:p>
+    <w:p>
+      <w:pPr>
+        <w:spacing w:lineRule="auto" w:line="276" w:before="0" w:after="0"/>
+      </w:pPr>
+      <w:r>
+        <w:rPr>
+          <w:rFonts w:ascii="Arial" w:hAnsi="Arial" w:cs="Arial" w:eastAsia="Arial"/>
+          <w:b w:val="0"/>
+          <w:color w:val="000000"/>
+          <w:sz w:val="36"/>
+        </w:rPr>
+        <w:t>-MCDONALD'S GLOBAL CHIEF PEOPLE OFFICER, TIFFANIE BOYD, CALLS IT "THE LARGEST UPSKILLING EFFORT IN THE COMPANY'S HISTORY."</w:t>
+      </w:r>
+    </w:p>
+    <w:p>
+      <w:pPr>
+        <w:spacing w:lineRule="auto" w:line="276" w:before="0" w:after="0"/>
+      </w:pPr>
+      <w:r>
+        <w:rPr>
+          <w:rFonts w:ascii="Arial" w:hAnsi="Arial" w:cs="Arial" w:eastAsia="Arial"/>
+          <w:b w:val="0"/>
+          <w:color w:val="000000"/>
+          <w:sz w:val="36"/>
+        </w:rPr>
+      </w:r>
+    </w:p>
+    <w:p>
+      <w:pPr>
+        <w:spacing w:lineRule="auto" w:line="276" w:before="0" w:after="0"/>
+      </w:pPr>
+      <w:r>
+        <w:rPr>
+          <w:rFonts w:ascii="Arial" w:hAnsi="Arial" w:cs="Arial" w:eastAsia="Arial"/>
+          <w:b/>
+          <w:color w:val="000000"/>
+          <w:sz w:val="46"/>
+        </w:rPr>
+        <w:t>AND WAIT UNTIL YOU HEAR WHAT THEY'RE TELLING WORKERS TO DO!!</w:t>
+      </w:r>
+    </w:p>
+    <w:p>
+      <w:pPr>
+        <w:spacing w:lineRule="auto" w:line="276" w:before="0" w:after="0"/>
+      </w:pPr>
+      <w:r>
+        <w:rPr>
+          <w:rFonts w:ascii="Arial" w:hAnsi="Arial" w:cs="Arial" w:eastAsia="Arial"/>
+          <w:b w:val="0"/>
+          <w:color w:val="000000"/>
+          <w:sz w:val="36"/>
+        </w:rPr>
+      </w:r>
+    </w:p>
+    <w:p>
+      <w:pPr>
+        <w:spacing w:lineRule="auto" w:line="276" w:before="0" w:after="0"/>
+      </w:pPr>
+      <w:r>
+        <w:rPr>
+          <w:rFonts w:ascii="Arial" w:hAnsi="Arial" w:cs="Arial" w:eastAsia="Arial"/>
+          <w:b w:val="0"/>
+          <w:color w:val="000000"/>
+          <w:sz w:val="36"/>
+        </w:rPr>
+        <w:t>-GREET YOU WHEN YOU WALK IN.</w:t>
+      </w:r>
+    </w:p>
+    <w:p>
+      <w:pPr>
+        <w:spacing w:lineRule="auto" w:line="276" w:before="0" w:after="0"/>
+      </w:pPr>
+      <w:r>
+        <w:rPr>
+          <w:rFonts w:ascii="Arial" w:hAnsi="Arial" w:cs="Arial" w:eastAsia="Arial"/>
+          <w:b w:val="0"/>
+          <w:color w:val="000000"/>
+          <w:sz w:val="36"/>
+        </w:rPr>
+      </w:r>
+    </w:p>
+    <w:p>
+      <w:pPr>
+        <w:spacing w:lineRule="auto" w:line="276" w:before="0" w:after="0"/>
+      </w:pPr>
+      <w:r>
+        <w:rPr>
+          <w:rFonts w:ascii="Arial" w:hAnsi="Arial" w:cs="Arial" w:eastAsia="Arial"/>
+          <w:b w:val="0"/>
+          <w:color w:val="000000"/>
+          <w:sz w:val="36"/>
+        </w:rPr>
+        <w:t>-CHECK ON YOU IN THE LOBBY... AND AGAIN BEFORE YOU LEAVE.</w:t>
+      </w:r>
+    </w:p>
+    <w:p>
+      <w:pPr>
+        <w:spacing w:lineRule="auto" w:line="276" w:before="0" w:after="0"/>
+      </w:pPr>
+      <w:r>
+        <w:rPr>
+          <w:rFonts w:ascii="Arial" w:hAnsi="Arial" w:cs="Arial" w:eastAsia="Arial"/>
+          <w:b w:val="0"/>
+          <w:color w:val="000000"/>
+          <w:sz w:val="36"/>
+        </w:rPr>
+      </w:r>
+    </w:p>
+    <w:p>
+      <w:pPr>
+        <w:spacing w:lineRule="auto" w:line="276" w:before="0" w:after="0"/>
+      </w:pPr>
+      <w:r>
+        <w:rPr>
+          <w:rFonts w:ascii="Arial" w:hAnsi="Arial" w:cs="Arial" w:eastAsia="Arial"/>
+          <w:b w:val="0"/>
+          <w:color w:val="000000"/>
+          <w:sz w:val="36"/>
+        </w:rPr>
+        <w:t>-AND ACCORDING TO THE WALL STREET JOURNAL, FRIENDLY SERVICE WILL NOW COUNT WHEN MCDONALD'S GRADES ITS FRANCHISE RESTAURANTS.</w:t>
+      </w:r>
+    </w:p>
+    <w:p>
+      <w:pPr>
+        <w:spacing w:lineRule="auto" w:line="276" w:before="0" w:after="0"/>
+      </w:pPr>
+      <w:r>
+        <w:rPr>
+          <w:rFonts w:ascii="Arial" w:hAnsi="Arial" w:cs="Arial" w:eastAsia="Arial"/>
+          <w:b w:val="0"/>
+          <w:color w:val="000000"/>
+          <w:sz w:val="36"/>
+        </w:rPr>
+      </w:r>
+    </w:p>
+    <w:p>
+      <w:pPr>
+        <w:spacing w:lineRule="auto" w:line="276" w:before="0" w:after="0"/>
+      </w:pPr>
+      <w:r>
+        <w:rPr>
+          <w:rFonts w:ascii="Arial" w:hAnsi="Arial" w:cs="Arial" w:eastAsia="Arial"/>
+          <w:b w:val="0"/>
+          <w:color w:val="000000"/>
+          <w:sz w:val="36"/>
+        </w:rPr>
+        <w:t>-SO IF YOUR LOCAL MCDONALD'S IS RUDE TO YOU, THAT'S GOING ON ITS REPORT CARD!!</w:t>
+      </w:r>
+    </w:p>
+    <w:p>
+      <w:pPr>
+        <w:spacing w:lineRule="auto" w:line="276" w:before="0" w:after="0"/>
+      </w:pPr>
+      <w:r>
+        <w:rPr>
+          <w:rFonts w:ascii="Arial" w:hAnsi="Arial" w:cs="Arial" w:eastAsia="Arial"/>
+          <w:b w:val="0"/>
+          <w:color w:val="000000"/>
+          <w:sz w:val="36"/>
+        </w:rPr>
+      </w:r>
+    </w:p>
+    <w:p>
+      <w:pPr>
+        <w:spacing w:lineRule="auto" w:line="276" w:before="0" w:after="0"/>
+      </w:pPr>
+      <w:r>
+        <w:rPr>
+          <w:rFonts w:ascii="Arial" w:hAnsi="Arial" w:cs="Arial" w:eastAsia="Arial"/>
+          <w:b/>
+          <w:color w:val="000000"/>
+          <w:sz w:val="46"/>
+        </w:rPr>
+        <w:t>SO WHY IS MCDONALD'S DOING THIS NOW???</w:t>
+      </w:r>
+    </w:p>
+    <w:p>
+      <w:pPr>
+        <w:spacing w:lineRule="auto" w:line="276" w:before="0" w:after="0"/>
+      </w:pPr>
+      <w:r>
+        <w:rPr>
+          <w:rFonts w:ascii="Arial" w:hAnsi="Arial" w:cs="Arial" w:eastAsia="Arial"/>
+          <w:b w:val="0"/>
+          <w:color w:val="000000"/>
+          <w:sz w:val="36"/>
+        </w:rPr>
+      </w:r>
+    </w:p>
+    <w:p>
+      <w:pPr>
+        <w:spacing w:lineRule="auto" w:line="276" w:before="0" w:after="0"/>
+      </w:pPr>
+      <w:r>
+        <w:rPr>
+          <w:rFonts w:ascii="Arial" w:hAnsi="Arial" w:cs="Arial" w:eastAsia="Arial"/>
+          <w:b w:val="0"/>
+          <w:color w:val="000000"/>
+          <w:sz w:val="36"/>
+        </w:rPr>
+        <w:t>-A GROUP OF MCDONALD'S OWN FRANCHISE OWNERS PUT IT IN WRITING. AND I'M QUOTING HERE...</w:t>
+      </w:r>
+    </w:p>
+    <w:p>
+      <w:pPr>
+        <w:spacing w:lineRule="auto" w:line="276" w:before="0" w:after="0"/>
+      </w:pPr>
+      <w:r>
+        <w:rPr>
+          <w:rFonts w:ascii="Arial" w:hAnsi="Arial" w:cs="Arial" w:eastAsia="Arial"/>
+          <w:b w:val="0"/>
+          <w:color w:val="000000"/>
+          <w:sz w:val="36"/>
+        </w:rPr>
+      </w:r>
+    </w:p>
+    <w:p>
+      <w:pPr>
+        <w:spacing w:lineRule="auto" w:line="276" w:before="0" w:after="0"/>
+      </w:pPr>
+      <w:r>
+        <w:rPr>
+          <w:rFonts w:ascii="Arial" w:hAnsi="Arial" w:cs="Arial" w:eastAsia="Arial"/>
+          <w:b w:val="0"/>
+          <w:color w:val="000000"/>
+          <w:sz w:val="36"/>
+        </w:rPr>
+        <w:t xml:space="preserve">-"MANY GUESTS SAY THEIR EXPERIENCES IN OUR RESTAURANTS SEEM </w:t>
+      </w:r>
+      <w:r>
+        <w:rPr>
+          <w:rFonts w:ascii="Arial" w:hAnsi="Arial" w:cs="Arial" w:eastAsia="Arial"/>
+          <w:b/>
+          <w:color w:val="000000"/>
+          <w:sz w:val="36"/>
+        </w:rPr>
+        <w:t>RUSHED, IMPERSONAL, STERILE AND COLD</w:t>
+      </w:r>
+      <w:r>
+        <w:rPr>
+          <w:rFonts w:ascii="Arial" w:hAnsi="Arial" w:cs="Arial" w:eastAsia="Arial"/>
+          <w:b w:val="0"/>
+          <w:color w:val="000000"/>
+          <w:sz w:val="36"/>
+        </w:rPr>
+        <w:t>."</w:t>
+      </w:r>
+    </w:p>
+    <w:p>
+      <w:pPr>
+        <w:spacing w:lineRule="auto" w:line="276" w:before="0" w:after="0"/>
+      </w:pPr>
+      <w:r>
+        <w:rPr>
+          <w:rFonts w:ascii="Arial" w:hAnsi="Arial" w:cs="Arial" w:eastAsia="Arial"/>
+          <w:b w:val="0"/>
+          <w:color w:val="000000"/>
+          <w:sz w:val="36"/>
+        </w:rPr>
+      </w:r>
+    </w:p>
+    <w:p>
+      <w:pPr>
+        <w:spacing w:lineRule="auto" w:line="276" w:before="0" w:after="0"/>
+      </w:pPr>
+      <w:r>
+        <w:rPr>
+          <w:rFonts w:ascii="Arial" w:hAnsi="Arial" w:cs="Arial" w:eastAsia="Arial"/>
+          <w:b w:val="0"/>
+          <w:color w:val="000000"/>
+          <w:sz w:val="36"/>
+        </w:rPr>
+        <w:t>-THAT'S NOT A CRITIC SAYING IT. THAT'S THE PEOPLE WHO OWN THE RESTAURANTS!!</w:t>
+      </w:r>
+    </w:p>
+    <w:p>
+      <w:pPr>
+        <w:spacing w:lineRule="auto" w:line="276" w:before="0" w:after="0"/>
+      </w:pPr>
+      <w:r>
+        <w:rPr>
+          <w:rFonts w:ascii="Arial" w:hAnsi="Arial" w:cs="Arial" w:eastAsia="Arial"/>
+          <w:b w:val="0"/>
+          <w:color w:val="000000"/>
+          <w:sz w:val="36"/>
+        </w:rPr>
+      </w:r>
+    </w:p>
+    <w:p>
+      <w:pPr>
+        <w:spacing w:lineRule="auto" w:line="276" w:before="0" w:after="0"/>
+      </w:pPr>
+      <w:r>
+        <w:rPr>
+          <w:rFonts w:ascii="Arial" w:hAnsi="Arial" w:cs="Arial" w:eastAsia="Arial"/>
+          <w:b w:val="0"/>
+          <w:color w:val="000000"/>
+          <w:sz w:val="36"/>
+        </w:rPr>
+        <w:t>-AND YOU KNOW EXACTLY WHAT THEY MEAN. YOU PULL UP, AND A COMPUTER VOICE TAKES YOUR ORDER.</w:t>
+      </w:r>
+    </w:p>
+    <w:p>
+      <w:pPr>
+        <w:spacing w:lineRule="auto" w:line="276" w:before="0" w:after="0"/>
+      </w:pPr>
+      <w:r>
+        <w:rPr>
+          <w:rFonts w:ascii="Arial" w:hAnsi="Arial" w:cs="Arial" w:eastAsia="Arial"/>
+          <w:b w:val="0"/>
+          <w:color w:val="000000"/>
+          <w:sz w:val="36"/>
+        </w:rPr>
+      </w:r>
+    </w:p>
+    <w:p>
+      <w:pPr>
+        <w:spacing w:lineRule="auto" w:line="276" w:before="0" w:after="0"/>
+      </w:pPr>
+      <w:r>
+        <w:rPr>
+          <w:rFonts w:ascii="Arial" w:hAnsi="Arial" w:cs="Arial" w:eastAsia="Arial"/>
+          <w:b w:val="0"/>
+          <w:color w:val="000000"/>
+          <w:sz w:val="36"/>
+        </w:rPr>
+        <w:t>-THIS DRIVER FILMED THE AI VOICE AT A MCDONALD'S DRIVE-THRU BACK IN 2023. THE VIDEO WENT VIRAL.</w:t>
+      </w:r>
+    </w:p>
+    <w:p>
+      <w:pPr>
+        <w:spacing w:lineRule="auto" w:line="276" w:before="0" w:after="0"/>
+      </w:pPr>
+      <w:r>
+        <w:rPr>
+          <w:rFonts w:ascii="Arial" w:hAnsi="Arial" w:cs="Arial" w:eastAsia="Arial"/>
+          <w:b w:val="0"/>
+          <w:color w:val="000000"/>
+          <w:sz w:val="36"/>
+        </w:rPr>
+      </w:r>
+    </w:p>
+    <w:p>
+      <w:pPr>
+        <w:spacing w:lineRule="auto" w:line="276" w:before="0" w:after="0"/>
+      </w:pPr>
+      <w:r>
+        <w:rPr>
+          <w:rFonts w:ascii="Arial" w:hAnsi="Arial" w:cs="Arial" w:eastAsia="Arial"/>
+          <w:b w:val="0"/>
+          <w:color w:val="000000"/>
+          <w:sz w:val="36"/>
+        </w:rPr>
+        <w:t xml:space="preserve">-ALL THEY WANTED WAS A SIMPLE ORDER. THE PROBLEM? THE </w:t>
       </w:r>
       <w:r>
         <w:rPr>
@@ -5953,296 +6358,92 @@
       <w:r>
         <w:rPr>
           <w:rFonts w:ascii="Arial" w:hAnsi="Arial" w:cs="Arial" w:eastAsia="Arial"/>
-          <w:b/>
-          <w:color w:val="000000"/>
-          <w:sz w:val="46"/>
-        </w:rPr>
-        <w:t>AND NOW THE BIGGEST CHAINS ARE ADMITTING IT... YOU HATED IT!!</w:t>
-      </w:r>
-    </w:p>
-    <w:p>
-      <w:pPr>
-        <w:spacing w:lineRule="auto" w:line="276" w:before="0" w:after="0"/>
-      </w:pPr>
-      <w:r>
-        <w:rPr>
-          <w:rFonts w:ascii="Arial" w:hAnsi="Arial" w:cs="Arial" w:eastAsia="Arial"/>
-          <w:b w:val="0"/>
-          <w:color w:val="000000"/>
-          <w:sz w:val="36"/>
-        </w:rPr>
-      </w:r>
-    </w:p>
-    <w:p>
-      <w:pPr>
-        <w:spacing w:lineRule="auto" w:line="276" w:before="0" w:after="0"/>
-      </w:pPr>
-      <w:r>
-        <w:rPr>
-          <w:rFonts w:ascii="Arial" w:hAnsi="Arial" w:cs="Arial" w:eastAsia="Arial"/>
-          <w:b w:val="0"/>
-          <w:color w:val="000000"/>
-          <w:sz w:val="36"/>
-        </w:rPr>
-        <w:t>-CHAKRI SOMISETTI RUNS BRAND TECHNOLOGIES AT BURGER KING.</w:t>
-      </w:r>
-    </w:p>
-    <w:p>
-      <w:pPr>
-        <w:spacing w:lineRule="auto" w:line="276" w:before="0" w:after="0"/>
-      </w:pPr>
-      <w:r>
-        <w:rPr>
-          <w:rFonts w:ascii="Arial" w:hAnsi="Arial" w:cs="Arial" w:eastAsia="Arial"/>
-          <w:b w:val="0"/>
-          <w:color w:val="000000"/>
-          <w:sz w:val="36"/>
-        </w:rPr>
-      </w:r>
-    </w:p>
-    <w:p>
-      <w:pPr>
-        <w:spacing w:lineRule="auto" w:line="276" w:before="0" w:after="0"/>
-      </w:pPr>
-      <w:r>
-        <w:rPr>
-          <w:rFonts w:ascii="Arial" w:hAnsi="Arial" w:cs="Arial" w:eastAsia="Arial"/>
-          <w:b w:val="0"/>
-          <w:color w:val="000000"/>
-          <w:sz w:val="36"/>
-        </w:rPr>
-        <w:t>-AND HE JUST SAID IT OUT LOUD AT AN INDUSTRY CONFERENCE.</w:t>
-      </w:r>
-    </w:p>
-    <w:p>
-      <w:pPr>
-        <w:spacing w:lineRule="auto" w:line="276" w:before="0" w:after="0"/>
-      </w:pPr>
-      <w:r>
-        <w:rPr>
-          <w:rFonts w:ascii="Arial" w:hAnsi="Arial" w:cs="Arial" w:eastAsia="Arial"/>
-          <w:b w:val="0"/>
-          <w:color w:val="000000"/>
-          <w:sz w:val="36"/>
-        </w:rPr>
-      </w:r>
-    </w:p>
-    <w:p>
-      <w:pPr>
-        <w:spacing w:lineRule="auto" w:line="276" w:before="0" w:after="0"/>
-      </w:pPr>
-      <w:r>
-        <w:rPr>
-          <w:rFonts w:ascii="Arial" w:hAnsi="Arial" w:cs="Arial" w:eastAsia="Arial"/>
-          <w:b w:val="0"/>
-          <w:color w:val="000000"/>
-          <w:sz w:val="36"/>
-        </w:rPr>
-        <w:t>-HE SAID SOME OF THEIR TEST RESTAURANTS SAW, AND I'M QUOTING HERE...</w:t>
-      </w:r>
-    </w:p>
-    <w:p>
-      <w:pPr>
-        <w:spacing w:lineRule="auto" w:line="276" w:before="0" w:after="0"/>
-      </w:pPr>
-      <w:r>
-        <w:rPr>
-          <w:rFonts w:ascii="Arial" w:hAnsi="Arial" w:cs="Arial" w:eastAsia="Arial"/>
-          <w:b w:val="0"/>
-          <w:color w:val="000000"/>
-          <w:sz w:val="36"/>
-        </w:rPr>
-      </w:r>
-    </w:p>
-    <w:p>
-      <w:pPr>
-        <w:spacing w:lineRule="auto" w:line="276" w:before="0" w:after="0"/>
-      </w:pPr>
-      <w:r>
-        <w:rPr>
-          <w:rFonts w:ascii="Arial" w:hAnsi="Arial" w:cs="Arial" w:eastAsia="Arial"/>
-          <w:b w:val="0"/>
-          <w:color w:val="000000"/>
-          <w:sz w:val="36"/>
-        </w:rPr>
-        <w:t>-"DRIVE OFFS BECAUSE GUESTS DON'T WANT TO TALK TO A BOT."</w:t>
-      </w:r>
-    </w:p>
-    <w:p>
-      <w:pPr>
-        <w:spacing w:lineRule="auto" w:line="276" w:before="0" w:after="0"/>
-      </w:pPr>
-      <w:r>
-        <w:rPr>
-          <w:rFonts w:ascii="Arial" w:hAnsi="Arial" w:cs="Arial" w:eastAsia="Arial"/>
-          <w:b/>
-          <w:color w:val="FF0000"/>
-          <w:sz w:val="36"/>
-        </w:rPr>
-        <w:t>(((TAKE FULLSCREEN - SOMISETTI QUOTE)))</w:t>
-      </w:r>
-    </w:p>
-    <w:p>
-      <w:pPr>
-        <w:spacing w:lineRule="auto" w:line="276" w:before="0" w:after="0"/>
-      </w:pPr>
-      <w:r>
-        <w:rPr>
-          <w:rFonts w:ascii="Arial" w:hAnsi="Arial" w:cs="Arial" w:eastAsia="Arial"/>
-          <w:b w:val="0"/>
-          <w:color w:val="FF0000"/>
-          <w:sz w:val="36"/>
-        </w:rPr>
-        <w:t>"DRIVE OFFS BECAUSE GUESTS DON'T WANT TO TALK TO A BOT."</w:t>
-      </w:r>
-    </w:p>
-    <w:p>
-      <w:pPr>
-        <w:spacing w:lineRule="auto" w:line="276" w:before="0" w:after="0"/>
-      </w:pPr>
-      <w:r>
-        <w:rPr>
-          <w:rFonts w:ascii="Arial" w:hAnsi="Arial" w:cs="Arial" w:eastAsia="Arial"/>
-          <w:b w:val="0"/>
-          <w:color w:val="FF0000"/>
-          <w:sz w:val="36"/>
-        </w:rPr>
-        <w:t>CHAKRI SOMISETTI, BURGER KING, SEPT. 2026</w:t>
-      </w:r>
-    </w:p>
-    <w:p>
-      <w:pPr>
-        <w:spacing w:lineRule="auto" w:line="276" w:before="0" w:after="0"/>
-      </w:pPr>
-      <w:r>
-        <w:rPr>
-          <w:rFonts w:ascii="Arial" w:hAnsi="Arial" w:cs="Arial" w:eastAsia="Arial"/>
-          <w:b w:val="0"/>
-          <w:color w:val="000000"/>
-          <w:sz w:val="36"/>
-        </w:rPr>
-      </w:r>
-    </w:p>
-    <w:p>
-      <w:pPr>
-        <w:spacing w:lineRule="auto" w:line="276" w:before="0" w:after="0"/>
-      </w:pPr>
-      <w:r>
-        <w:rPr>
-          <w:rFonts w:ascii="Arial" w:hAnsi="Arial" w:cs="Arial" w:eastAsia="Arial"/>
-          <w:b w:val="0"/>
-          <w:color w:val="000000"/>
-          <w:sz w:val="36"/>
-        </w:rPr>
-        <w:t>-PEOPLE LITERALLY DROVE AWAY RATHER THAN ORDER FROM THE ROBOT!!</w:t>
-      </w:r>
-    </w:p>
-    <w:p>
-      <w:pPr>
-        <w:spacing w:lineRule="auto" w:line="276" w:before="0" w:after="0"/>
-      </w:pPr>
-      <w:r>
-        <w:rPr>
-          <w:rFonts w:ascii="Arial" w:hAnsi="Arial" w:cs="Arial" w:eastAsia="Arial"/>
-          <w:b w:val="0"/>
-          <w:color w:val="000000"/>
-          <w:sz w:val="36"/>
-        </w:rPr>
-      </w:r>
-    </w:p>
-    <w:p>
-      <w:pPr>
-        <w:spacing w:lineRule="auto" w:line="276" w:before="0" w:after="0"/>
-      </w:pPr>
-      <w:r>
-        <w:rPr>
-          <w:rFonts w:ascii="Arial" w:hAnsi="Arial" w:cs="Arial" w:eastAsia="Arial"/>
-          <w:b w:val="0"/>
-          <w:color w:val="000000"/>
-          <w:sz w:val="36"/>
-        </w:rPr>
-        <w:t>-TACO BELL TOLD THE WALL STREET JOURNAL IT'S RETHINKING ITS AI DRIVE-THRU.</w:t>
-      </w:r>
-    </w:p>
-    <w:p>
-      <w:pPr>
-        <w:spacing w:lineRule="auto" w:line="276" w:before="0" w:after="0"/>
-      </w:pPr>
-      <w:r>
-        <w:rPr>
-          <w:rFonts w:ascii="Arial" w:hAnsi="Arial" w:cs="Arial" w:eastAsia="Arial"/>
-          <w:b w:val="0"/>
-          <w:color w:val="000000"/>
-          <w:sz w:val="36"/>
-        </w:rPr>
-      </w:r>
-    </w:p>
-    <w:p>
-      <w:pPr>
-        <w:spacing w:lineRule="auto" w:line="276" w:before="0" w:after="0"/>
-      </w:pPr>
-      <w:r>
-        <w:rPr>
-          <w:rFonts w:ascii="Arial" w:hAnsi="Arial" w:cs="Arial" w:eastAsia="Arial"/>
-          <w:b w:val="0"/>
-          <w:color w:val="000000"/>
-          <w:sz w:val="36"/>
-        </w:rPr>
-        <w:t>-THAT'S AFTER SOMEBODY ORDERED 18,000 CUPS OF WATER!!</w:t>
-      </w:r>
-    </w:p>
-    <w:p>
-      <w:pPr>
-        <w:spacing w:lineRule="auto" w:line="276" w:before="0" w:after="0"/>
-      </w:pPr>
-      <w:r>
-        <w:rPr>
-          <w:rFonts w:ascii="Arial" w:hAnsi="Arial" w:cs="Arial" w:eastAsia="Arial"/>
-          <w:b w:val="0"/>
-          <w:color w:val="000000"/>
-          <w:sz w:val="36"/>
-        </w:rPr>
-      </w:r>
-    </w:p>
-    <w:p>
-      <w:pPr>
-        <w:spacing w:lineRule="auto" w:line="276" w:before="0" w:after="0"/>
-      </w:pPr>
-      <w:r>
-        <w:rPr>
-          <w:rFonts w:ascii="Arial" w:hAnsi="Arial" w:cs="Arial" w:eastAsia="Arial"/>
-          <w:b w:val="0"/>
-          <w:color w:val="000000"/>
-          <w:sz w:val="36"/>
-        </w:rPr>
-        <w:t>-AND MCDONALD'S TESTED AN AI DRIVE-THRU WITH IBM AT MORE THAN 100 RESTAURANTS.</w:t>
-      </w:r>
-    </w:p>
-    <w:p>
-      <w:pPr>
-        <w:spacing w:lineRule="auto" w:line="276" w:before="0" w:after="0"/>
-      </w:pPr>
-      <w:r>
-        <w:rPr>
-          <w:rFonts w:ascii="Arial" w:hAnsi="Arial" w:cs="Arial" w:eastAsia="Arial"/>
-          <w:b w:val="0"/>
-          <w:color w:val="000000"/>
-          <w:sz w:val="36"/>
-        </w:rPr>
-      </w:r>
-    </w:p>
-    <w:p>
-      <w:pPr>
-        <w:spacing w:lineRule="auto" w:line="276" w:before="0" w:after="0"/>
-      </w:pPr>
-      <w:r>
-        <w:rPr>
-          <w:rFonts w:ascii="Arial" w:hAnsi="Arial" w:cs="Arial" w:eastAsia="Arial"/>
-          <w:b w:val="0"/>
-          <w:color w:val="000000"/>
-          <w:sz w:val="36"/>
-        </w:rPr>
-        <w:t>-SO WHAT DID MCDONALD'S END UP DOING WITH IT???</w:t>
+          <w:b w:val="0"/>
+          <w:color w:val="000000"/>
+          <w:sz w:val="36"/>
+        </w:rPr>
+        <w:t>-THAT AI WAS A TEST MCDONALD'S RAN WITH IBM, AT MORE THAN 100 DRIVE-THRUS.</w:t>
+      </w:r>
+    </w:p>
+    <w:p>
+      <w:pPr>
+        <w:spacing w:lineRule="auto" w:line="276" w:before="0" w:after="0"/>
+      </w:pPr>
+      <w:r>
+        <w:rPr>
+          <w:rFonts w:ascii="Arial" w:hAnsi="Arial" w:cs="Arial" w:eastAsia="Arial"/>
+          <w:b w:val="0"/>
+          <w:color w:val="000000"/>
+          <w:sz w:val="36"/>
+        </w:rPr>
+      </w:r>
+    </w:p>
+    <w:p>
+      <w:pPr>
+        <w:spacing w:lineRule="auto" w:line="276" w:before="0" w:after="0"/>
+      </w:pPr>
+      <w:r>
+        <w:rPr>
+          <w:rFonts w:ascii="Arial" w:hAnsi="Arial" w:cs="Arial" w:eastAsia="Arial"/>
+          <w:b w:val="0"/>
+          <w:color w:val="000000"/>
+          <w:sz w:val="36"/>
+        </w:rPr>
+        <w:t>-AND VIDEOS LIKE THAT ONE KEPT GOING VIRAL.</w:t>
+      </w:r>
+    </w:p>
+    <w:p>
+      <w:pPr>
+        <w:spacing w:lineRule="auto" w:line="276" w:before="0" w:after="0"/>
+      </w:pPr>
+      <w:r>
+        <w:rPr>
+          <w:rFonts w:ascii="Arial" w:hAnsi="Arial" w:cs="Arial" w:eastAsia="Arial"/>
+          <w:b w:val="0"/>
+          <w:color w:val="000000"/>
+          <w:sz w:val="36"/>
+        </w:rPr>
+      </w:r>
+    </w:p>
+    <w:p>
+      <w:pPr>
+        <w:spacing w:lineRule="auto" w:line="276" w:before="0" w:after="0"/>
+      </w:pPr>
+      <w:r>
+        <w:rPr>
+          <w:rFonts w:ascii="Arial" w:hAnsi="Arial" w:cs="Arial" w:eastAsia="Arial"/>
+          <w:b w:val="0"/>
+          <w:color w:val="000000"/>
+          <w:sz w:val="36"/>
+        </w:rPr>
+        <w:t>-CBS NEWS REPORTED SOME PEOPLE SAID IT GOT EVEN SIMPLE ORDERS WRONG.</w:t>
+      </w:r>
+    </w:p>
+    <w:p>
+      <w:pPr>
+        <w:spacing w:lineRule="auto" w:line="276" w:before="0" w:after="0"/>
+      </w:pPr>
+      <w:r>
+        <w:rPr>
+          <w:rFonts w:ascii="Arial" w:hAnsi="Arial" w:cs="Arial" w:eastAsia="Arial"/>
+          <w:b w:val="0"/>
+          <w:color w:val="000000"/>
+          <w:sz w:val="36"/>
+        </w:rPr>
+      </w:r>
+    </w:p>
+    <w:p>
+      <w:pPr>
+        <w:spacing w:lineRule="auto" w:line="276" w:before="0" w:after="0"/>
+      </w:pPr>
+      <w:r>
+        <w:rPr>
+          <w:rFonts w:ascii="Arial" w:hAnsi="Arial" w:cs="Arial" w:eastAsia="Arial"/>
+          <w:b w:val="0"/>
+          <w:color w:val="000000"/>
+          <w:sz w:val="36"/>
+        </w:rPr>
+        <w:t>-SO DID MCDONALD'S KEEP THE ROBOT... OR PULL IT???</w:t>
       </w:r>
     </w:p>
     <w:p>
@@ -6371,88 +6572,61 @@
           <w:color w:val="000000"/>
           <w:sz w:val="36"/>
         </w:rPr>
-        <w:t>-THEY PULLED THE PLUG IN JUNE OF 2024.</w:t>
-      </w:r>
-    </w:p>
-    <w:p>
-      <w:pPr>
-        <w:spacing w:lineRule="auto" w:line="276" w:before="0" w:after="0"/>
-      </w:pPr>
-      <w:r>
-        <w:rPr>
-          <w:rFonts w:ascii="Arial" w:hAnsi="Arial" w:cs="Arial" w:eastAsia="Arial"/>
-          <w:b w:val="0"/>
-          <w:color w:val="000000"/>
-          <w:sz w:val="36"/>
-        </w:rPr>
-      </w:r>
-    </w:p>
-    <w:p>
-      <w:pPr>
-        <w:spacing w:lineRule="auto" w:line="276" w:before="0" w:after="0"/>
-      </w:pPr>
-      <w:r>
-        <w:rPr>
-          <w:rFonts w:ascii="Arial" w:hAnsi="Arial" w:cs="Arial" w:eastAsia="Arial"/>
-          <w:b w:val="0"/>
-          <w:color w:val="000000"/>
-          <w:sz w:val="36"/>
-        </w:rPr>
-        <w:t>-NOW, IN FAIRNESS, JUST A FEW WEEKS AGO MCDONALD'S SAID IT'S TRYING AI AGAIN.</w:t>
-      </w:r>
-    </w:p>
-    <w:p>
-      <w:pPr>
-        <w:spacing w:lineRule="auto" w:line="276" w:before="0" w:after="0"/>
-      </w:pPr>
-      <w:r>
-        <w:rPr>
-          <w:rFonts w:ascii="Arial" w:hAnsi="Arial" w:cs="Arial" w:eastAsia="Arial"/>
-          <w:b w:val="0"/>
-          <w:color w:val="000000"/>
-          <w:sz w:val="36"/>
-        </w:rPr>
-      </w:r>
-    </w:p>
-    <w:p>
-      <w:pPr>
-        <w:spacing w:lineRule="auto" w:line="276" w:before="0" w:after="0"/>
-      </w:pPr>
-      <w:r>
-        <w:rPr>
-          <w:rFonts w:ascii="Arial" w:hAnsi="Arial" w:cs="Arial" w:eastAsia="Arial"/>
-          <w:b w:val="0"/>
-          <w:color w:val="000000"/>
-          <w:sz w:val="36"/>
-        </w:rPr>
-        <w:t>-A NEW VOICE CALLED "ARCHY," TESTING IN ABOUT A DOZEN RESTAURANTS.</w:t>
-      </w:r>
-    </w:p>
-    <w:p>
-      <w:pPr>
-        <w:spacing w:lineRule="auto" w:line="276" w:before="0" w:after="0"/>
-      </w:pPr>
-      <w:r>
-        <w:rPr>
-          <w:rFonts w:ascii="Arial" w:hAnsi="Arial" w:cs="Arial" w:eastAsia="Arial"/>
-          <w:b w:val="0"/>
-          <w:color w:val="000000"/>
-          <w:sz w:val="36"/>
-        </w:rPr>
-      </w:r>
-    </w:p>
-    <w:p>
-      <w:pPr>
-        <w:spacing w:lineRule="auto" w:line="276" w:before="0" w:after="0"/>
-      </w:pPr>
-      <w:r>
-        <w:rPr>
-          <w:rFonts w:ascii="Arial" w:hAnsi="Arial" w:cs="Arial" w:eastAsia="Arial"/>
-          <w:b w:val="0"/>
-          <w:color w:val="000000"/>
-          <w:sz w:val="36"/>
-        </w:rPr>
-        <w:t>-SO THE ROBOTS AREN'T GONE. BUT WAIT UNTIL YOU HEAR WHAT MCDONALD'S IS DOING WITH ITS PEOPLE.</w:t>
+        <w:t>-THEY PULLED THE PLUG. THE ROBOT WAS SWITCHED OFF IN ALL OF THOSE RESTAURANTS BY THE END OF JULY 2024.</w:t>
+      </w:r>
+    </w:p>
+    <w:p>
+      <w:pPr>
+        <w:spacing w:lineRule="auto" w:line="276" w:before="0" w:after="0"/>
+      </w:pPr>
+      <w:r>
+        <w:rPr>
+          <w:rFonts w:ascii="Arial" w:hAnsi="Arial" w:cs="Arial" w:eastAsia="Arial"/>
+          <w:b w:val="0"/>
+          <w:color w:val="000000"/>
+          <w:sz w:val="36"/>
+        </w:rPr>
+      </w:r>
+    </w:p>
+    <w:p>
+      <w:pPr>
+        <w:spacing w:lineRule="auto" w:line="276" w:before="0" w:after="0"/>
+      </w:pPr>
+      <w:r>
+        <w:rPr>
+          <w:rFonts w:ascii="Arial" w:hAnsi="Arial" w:cs="Arial" w:eastAsia="Arial"/>
+          <w:b w:val="0"/>
+          <w:color w:val="000000"/>
+          <w:sz w:val="36"/>
+        </w:rPr>
+        <w:t>-NOW, IN FAIRNESS, MCDONALD'S IS STILL TESTING NEW AI. THE ROBOTS AREN'T GONE FOR GOOD.</w:t>
+      </w:r>
+    </w:p>
+    <w:p>
+      <w:pPr>
+        <w:spacing w:lineRule="auto" w:line="276" w:before="0" w:after="0"/>
+      </w:pPr>
+      <w:r>
+        <w:rPr>
+          <w:rFonts w:ascii="Arial" w:hAnsi="Arial" w:cs="Arial" w:eastAsia="Arial"/>
+          <w:b w:val="0"/>
+          <w:color w:val="000000"/>
+          <w:sz w:val="36"/>
+        </w:rPr>
+      </w:r>
+    </w:p>
+    <w:p>
+      <w:pPr>
+        <w:spacing w:lineRule="auto" w:line="276" w:before="0" w:after="0"/>
+      </w:pPr>
+      <w:r>
+        <w:rPr>
+          <w:rFonts w:ascii="Arial" w:hAnsi="Arial" w:cs="Arial" w:eastAsia="Arial"/>
+          <w:b w:val="0"/>
+          <w:color w:val="000000"/>
+          <w:sz w:val="36"/>
+        </w:rPr>
+        <w:t>-BUT THIS FALL, THE BIG BET IS ON THE PEOPLE BEHIND THE COUNTER.</w:t>
       </w:r>
     </w:p>
     <w:p>
@@ -6479,6 +6653,627 @@
           <w:color w:val="000000"/>
           <w:sz w:val="46"/>
         </w:rPr>
+        <w:t>AND IT'S NOT JUST MCDONALD'S... THE OTHER CHAINS ARE ADMITTING IT TOO!!</w:t>
+      </w:r>
+    </w:p>
+    <w:p>
+      <w:pPr>
+        <w:spacing w:lineRule="auto" w:line="276" w:before="0" w:after="0"/>
+      </w:pPr>
+      <w:r>
+        <w:rPr>
+          <w:rFonts w:ascii="Arial" w:hAnsi="Arial" w:cs="Arial" w:eastAsia="Arial"/>
+          <w:b w:val="0"/>
+          <w:color w:val="000000"/>
+          <w:sz w:val="36"/>
+        </w:rPr>
+      </w:r>
+    </w:p>
+    <w:p>
+      <w:pPr>
+        <w:spacing w:lineRule="auto" w:line="276" w:before="0" w:after="0"/>
+      </w:pPr>
+      <w:r>
+        <w:rPr>
+          <w:rFonts w:ascii="Arial" w:hAnsi="Arial" w:cs="Arial" w:eastAsia="Arial"/>
+          <w:b w:val="0"/>
+          <w:color w:val="000000"/>
+          <w:sz w:val="36"/>
+        </w:rPr>
+        <w:t>-CHAKRI SOMISETTI RUNS BRAND TECHNOLOGIES AT BURGER KING.</w:t>
+      </w:r>
+    </w:p>
+    <w:p>
+      <w:pPr>
+        <w:spacing w:lineRule="auto" w:line="276" w:before="0" w:after="0"/>
+      </w:pPr>
+      <w:r>
+        <w:rPr>
+          <w:rFonts w:ascii="Arial" w:hAnsi="Arial" w:cs="Arial" w:eastAsia="Arial"/>
+          <w:b w:val="0"/>
+          <w:color w:val="000000"/>
+          <w:sz w:val="36"/>
+        </w:rPr>
+      </w:r>
+    </w:p>
+    <w:p>
+      <w:pPr>
+        <w:spacing w:lineRule="auto" w:line="276" w:before="0" w:after="0"/>
+      </w:pPr>
+      <w:r>
+        <w:rPr>
+          <w:rFonts w:ascii="Arial" w:hAnsi="Arial" w:cs="Arial" w:eastAsia="Arial"/>
+          <w:b w:val="0"/>
+          <w:color w:val="000000"/>
+          <w:sz w:val="36"/>
+        </w:rPr>
+        <w:t>-LAST MONTH, AT AN INDUSTRY CONFERENCE, HE SAID SOME OF THEIR TEST RESTAURANTS SAW, AND I'M QUOTING HERE...</w:t>
+      </w:r>
+    </w:p>
+    <w:p>
+      <w:pPr>
+        <w:spacing w:lineRule="auto" w:line="276" w:before="0" w:after="0"/>
+      </w:pPr>
+      <w:r>
+        <w:rPr>
+          <w:rFonts w:ascii="Arial" w:hAnsi="Arial" w:cs="Arial" w:eastAsia="Arial"/>
+          <w:b w:val="0"/>
+          <w:color w:val="000000"/>
+          <w:sz w:val="36"/>
+        </w:rPr>
+      </w:r>
+    </w:p>
+    <w:p>
+      <w:pPr>
+        <w:spacing w:lineRule="auto" w:line="276" w:before="0" w:after="0"/>
+      </w:pPr>
+      <w:r>
+        <w:rPr>
+          <w:rFonts w:ascii="Arial" w:hAnsi="Arial" w:cs="Arial" w:eastAsia="Arial"/>
+          <w:b w:val="0"/>
+          <w:color w:val="000000"/>
+          <w:sz w:val="36"/>
+        </w:rPr>
+        <w:t>-"DRIVE OFFS BECAUSE GUESTS DON'T WANT TO TALK TO A BOT."</w:t>
+      </w:r>
+    </w:p>
+    <w:p>
+      <w:pPr>
+        <w:spacing w:lineRule="auto" w:line="276" w:before="0" w:after="0"/>
+      </w:pPr>
+      <w:r>
+        <w:rPr>
+          <w:rFonts w:ascii="Arial" w:hAnsi="Arial" w:cs="Arial" w:eastAsia="Arial"/>
+          <w:b/>
+          <w:color w:val="FF0000"/>
+          <w:sz w:val="36"/>
+        </w:rPr>
+        <w:t>(((TAKE FULLSCREEN - SOMISETTI QUOTE)))</w:t>
+      </w:r>
+    </w:p>
+    <w:p>
+      <w:pPr>
+        <w:spacing w:lineRule="auto" w:line="276" w:before="0" w:after="0"/>
+      </w:pPr>
+      <w:r>
+        <w:rPr>
+          <w:rFonts w:ascii="Arial" w:hAnsi="Arial" w:cs="Arial" w:eastAsia="Arial"/>
+          <w:b w:val="0"/>
+          <w:color w:val="FF0000"/>
+          <w:sz w:val="36"/>
+        </w:rPr>
+        <w:t>"DRIVE OFFS BECAUSE GUESTS DON'T WANT TO TALK TO A BOT."</w:t>
+      </w:r>
+    </w:p>
+    <w:p>
+      <w:pPr>
+        <w:spacing w:lineRule="auto" w:line="276" w:before="0" w:after="0"/>
+      </w:pPr>
+      <w:r>
+        <w:rPr>
+          <w:rFonts w:ascii="Arial" w:hAnsi="Arial" w:cs="Arial" w:eastAsia="Arial"/>
+          <w:b w:val="0"/>
+          <w:color w:val="FF0000"/>
+          <w:sz w:val="36"/>
+        </w:rPr>
+        <w:t>CHAKRI SOMISETTI, BURGER KING, SEPT. 2026</w:t>
+      </w:r>
+    </w:p>
+    <w:p>
+      <w:pPr>
+        <w:spacing w:lineRule="auto" w:line="276" w:before="0" w:after="0"/>
+      </w:pPr>
+      <w:r>
+        <w:rPr>
+          <w:rFonts w:ascii="Arial" w:hAnsi="Arial" w:cs="Arial" w:eastAsia="Arial"/>
+          <w:b w:val="0"/>
+          <w:color w:val="000000"/>
+          <w:sz w:val="36"/>
+        </w:rPr>
+      </w:r>
+    </w:p>
+    <w:p>
+      <w:pPr>
+        <w:spacing w:lineRule="auto" w:line="276" w:before="0" w:after="0"/>
+      </w:pPr>
+      <w:r>
+        <w:rPr>
+          <w:rFonts w:ascii="Arial" w:hAnsi="Arial" w:cs="Arial" w:eastAsia="Arial"/>
+          <w:b w:val="0"/>
+          <w:color w:val="000000"/>
+          <w:sz w:val="36"/>
+        </w:rPr>
+        <w:t>-PEOPLE LITERALLY DROVE AWAY RATHER THAN ORDER FROM THE ROBOT!!</w:t>
+      </w:r>
+    </w:p>
+    <w:p>
+      <w:pPr>
+        <w:spacing w:lineRule="auto" w:line="276" w:before="0" w:after="0"/>
+      </w:pPr>
+      <w:r>
+        <w:rPr>
+          <w:rFonts w:ascii="Arial" w:hAnsi="Arial" w:cs="Arial" w:eastAsia="Arial"/>
+          <w:b w:val="0"/>
+          <w:color w:val="000000"/>
+          <w:sz w:val="36"/>
+        </w:rPr>
+      </w:r>
+    </w:p>
+    <w:p>
+      <w:pPr>
+        <w:spacing w:lineRule="auto" w:line="276" w:before="0" w:after="0"/>
+      </w:pPr>
+      <w:r>
+        <w:rPr>
+          <w:rFonts w:ascii="Arial" w:hAnsi="Arial" w:cs="Arial" w:eastAsia="Arial"/>
+          <w:b w:val="0"/>
+          <w:color w:val="000000"/>
+          <w:sz w:val="36"/>
+        </w:rPr>
+        <w:t>-NOW BURGER KING SAYS IT'S MAKING IT EASY TO ORDER FROM A REAL PERSON, IF THAT'S WHAT YOU WANT.</w:t>
+      </w:r>
+    </w:p>
+    <w:p>
+      <w:pPr>
+        <w:spacing w:lineRule="auto" w:line="276" w:before="0" w:after="0"/>
+      </w:pPr>
+      <w:r>
+        <w:rPr>
+          <w:rFonts w:ascii="Arial" w:hAnsi="Arial" w:cs="Arial" w:eastAsia="Arial"/>
+          <w:b w:val="0"/>
+          <w:color w:val="000000"/>
+          <w:sz w:val="36"/>
+        </w:rPr>
+      </w:r>
+    </w:p>
+    <w:p>
+      <w:pPr>
+        <w:spacing w:lineRule="auto" w:line="276" w:before="0" w:after="0"/>
+      </w:pPr>
+      <w:r>
+        <w:rPr>
+          <w:rFonts w:ascii="Arial" w:hAnsi="Arial" w:cs="Arial" w:eastAsia="Arial"/>
+          <w:b w:val="0"/>
+          <w:color w:val="000000"/>
+          <w:sz w:val="36"/>
+        </w:rPr>
+        <w:t>-AND AT TACO BELL, SOMEBODY ORDERED 18,000 CUPS OF WATER FROM THE AI.</w:t>
+      </w:r>
+    </w:p>
+    <w:p>
+      <w:pPr>
+        <w:spacing w:lineRule="auto" w:line="276" w:before="0" w:after="0"/>
+      </w:pPr>
+      <w:r>
+        <w:rPr>
+          <w:rFonts w:ascii="Arial" w:hAnsi="Arial" w:cs="Arial" w:eastAsia="Arial"/>
+          <w:b w:val="0"/>
+          <w:color w:val="000000"/>
+          <w:sz w:val="36"/>
+        </w:rPr>
+      </w:r>
+    </w:p>
+    <w:p>
+      <w:pPr>
+        <w:spacing w:lineRule="auto" w:line="276" w:before="0" w:after="0"/>
+      </w:pPr>
+      <w:r>
+        <w:rPr>
+          <w:rFonts w:ascii="Arial" w:hAnsi="Arial" w:cs="Arial" w:eastAsia="Arial"/>
+          <w:b w:val="0"/>
+          <w:color w:val="000000"/>
+          <w:sz w:val="36"/>
+        </w:rPr>
+        <w:t>-AFTER THAT, TACO BELL'S OWN TECH CHIEF TOLD THE WALL STREET JOURNAL THAT AT ITS BUSIEST RESTAURANTS, A HUMAN MIGHT DO IT BETTER.</w:t>
+      </w:r>
+    </w:p>
+    <w:p>
+      <w:pPr>
+        <w:spacing w:lineRule="auto" w:line="276" w:before="0" w:after="0"/>
+      </w:pPr>
+      <w:r>
+        <w:rPr>
+          <w:rFonts w:ascii="Arial" w:hAnsi="Arial" w:cs="Arial" w:eastAsia="Arial"/>
+          <w:b w:val="0"/>
+          <w:color w:val="000000"/>
+          <w:sz w:val="36"/>
+        </w:rPr>
+      </w:r>
+    </w:p>
+    <w:p>
+      <w:pPr>
+        <w:spacing w:lineRule="auto" w:line="276" w:before="0" w:after="0"/>
+      </w:pPr>
+      <w:r>
+        <w:rPr>
+          <w:rFonts w:ascii="Arial" w:hAnsi="Arial" w:cs="Arial" w:eastAsia="Arial"/>
+          <w:b w:val="0"/>
+          <w:color w:val="000000"/>
+          <w:sz w:val="36"/>
+        </w:rPr>
+        <w:t>-TO BE CLEAR, TACO BELL STILL HAS AI IN ABOUT 900 DRIVE-THRUS. BUT EVEN THEY SAY IT'S NOT RIGHT FOR EVERY RESTAURANT.</w:t>
+      </w:r>
+    </w:p>
+    <w:p>
+      <w:pPr>
+        <w:spacing w:lineRule="auto" w:line="276" w:before="0" w:after="0"/>
+      </w:pPr>
+      <w:r>
+        <w:rPr>
+          <w:rFonts w:ascii="Arial" w:hAnsi="Arial" w:cs="Arial" w:eastAsia="Arial"/>
+          <w:b w:val="0"/>
+          <w:color w:val="000000"/>
+          <w:sz w:val="36"/>
+        </w:rPr>
+      </w:r>
+    </w:p>
+    <w:p>
+      <w:pPr>
+        <w:spacing w:lineRule="auto" w:line="276" w:before="0" w:after="0"/>
+      </w:pPr>
+      <w:r>
+        <w:rPr>
+          <w:rFonts w:ascii="Arial" w:hAnsi="Arial" w:cs="Arial" w:eastAsia="Arial"/>
+          <w:b/>
+          <w:color w:val="000000"/>
+          <w:sz w:val="46"/>
+        </w:rPr>
+        <w:t>BUT THE BIGGEST TURNAROUND OF ALL IS HAPPENING AT STARBUCKS!!</w:t>
+      </w:r>
+    </w:p>
+    <w:p>
+      <w:pPr>
+        <w:spacing w:lineRule="auto" w:line="276" w:before="0" w:after="0"/>
+      </w:pPr>
+      <w:r>
+        <w:rPr>
+          <w:rFonts w:ascii="Arial" w:hAnsi="Arial" w:cs="Arial" w:eastAsia="Arial"/>
+          <w:b w:val="0"/>
+          <w:color w:val="000000"/>
+          <w:sz w:val="36"/>
+        </w:rPr>
+      </w:r>
+    </w:p>
+    <w:p>
+      <w:pPr>
+        <w:spacing w:lineRule="auto" w:line="276" w:before="0" w:after="0"/>
+      </w:pPr>
+      <w:r>
+        <w:rPr>
+          <w:rFonts w:ascii="Arial" w:hAnsi="Arial" w:cs="Arial" w:eastAsia="Arial"/>
+          <w:b w:val="0"/>
+          <w:color w:val="000000"/>
+          <w:sz w:val="36"/>
+        </w:rPr>
+        <w:t xml:space="preserve">-IN 2024, STARBUCKS STARTED ROLLING OUT NEW EQUIPMENT CALLED THE </w:t>
+      </w:r>
+      <w:r>
+        <w:rPr>
+          <w:rFonts w:ascii="Arial" w:hAnsi="Arial" w:cs="Arial" w:eastAsia="Arial"/>
+          <w:b/>
+          <w:color w:val="000000"/>
+          <w:sz w:val="36"/>
+        </w:rPr>
+        <w:t>SIREN CRAFT SYSTEM</w:t>
+      </w:r>
+      <w:r>
+        <w:rPr>
+          <w:rFonts w:ascii="Arial" w:hAnsi="Arial" w:cs="Arial" w:eastAsia="Arial"/>
+          <w:b w:val="0"/>
+          <w:color w:val="000000"/>
+          <w:sz w:val="36"/>
+        </w:rPr>
+        <w:t>, TO MAKE YOUR DRINK FASTER.</w:t>
+      </w:r>
+    </w:p>
+    <w:p>
+      <w:pPr>
+        <w:spacing w:lineRule="auto" w:line="276" w:before="0" w:after="0"/>
+      </w:pPr>
+      <w:r>
+        <w:rPr>
+          <w:rFonts w:ascii="Arial" w:hAnsi="Arial" w:cs="Arial" w:eastAsia="Arial"/>
+          <w:b w:val="0"/>
+          <w:color w:val="000000"/>
+          <w:sz w:val="36"/>
+        </w:rPr>
+      </w:r>
+    </w:p>
+    <w:p>
+      <w:pPr>
+        <w:spacing w:lineRule="auto" w:line="276" w:before="0" w:after="0"/>
+      </w:pPr>
+      <w:r>
+        <w:rPr>
+          <w:rFonts w:ascii="Arial" w:hAnsi="Arial" w:cs="Arial" w:eastAsia="Arial"/>
+          <w:b w:val="0"/>
+          <w:color w:val="000000"/>
+          <w:sz w:val="36"/>
+        </w:rPr>
+        <w:t>-THE PLAN WAS TO PUT IT IN ABOUT 10,000 STORES.</w:t>
+      </w:r>
+    </w:p>
+    <w:p>
+      <w:pPr>
+        <w:spacing w:lineRule="auto" w:line="276" w:before="0" w:after="0"/>
+      </w:pPr>
+      <w:r>
+        <w:rPr>
+          <w:rFonts w:ascii="Arial" w:hAnsi="Arial" w:cs="Arial" w:eastAsia="Arial"/>
+          <w:b w:val="0"/>
+          <w:color w:val="000000"/>
+          <w:sz w:val="36"/>
+        </w:rPr>
+      </w:r>
+    </w:p>
+    <w:p>
+      <w:pPr>
+        <w:spacing w:lineRule="auto" w:line="276" w:before="0" w:after="0"/>
+      </w:pPr>
+      <w:r>
+        <w:rPr>
+          <w:rFonts w:ascii="Arial" w:hAnsi="Arial" w:cs="Arial" w:eastAsia="Arial"/>
+          <w:b w:val="0"/>
+          <w:color w:val="000000"/>
+          <w:sz w:val="36"/>
+        </w:rPr>
+        <w:t>-THEN THE NEW CEO, BRIAN NICCOL, HIT THE BRAKES.</w:t>
+      </w:r>
+    </w:p>
+    <w:p>
+      <w:pPr>
+        <w:spacing w:lineRule="auto" w:line="276" w:before="0" w:after="0"/>
+      </w:pPr>
+      <w:r>
+        <w:rPr>
+          <w:rFonts w:ascii="Arial" w:hAnsi="Arial" w:cs="Arial" w:eastAsia="Arial"/>
+          <w:b w:val="0"/>
+          <w:color w:val="000000"/>
+          <w:sz w:val="36"/>
+        </w:rPr>
+      </w:r>
+    </w:p>
+    <w:p>
+      <w:pPr>
+        <w:spacing w:lineRule="auto" w:line="276" w:before="0" w:after="0"/>
+      </w:pPr>
+      <w:r>
+        <w:rPr>
+          <w:rFonts w:ascii="Arial" w:hAnsi="Arial" w:cs="Arial" w:eastAsia="Arial"/>
+          <w:b w:val="0"/>
+          <w:color w:val="000000"/>
+          <w:sz w:val="36"/>
+        </w:rPr>
+        <w:t>-ACCORDING TO CBS NEWS, HE SAID THE EQUIPMENT DOESN'T SOLVE THE EXPERIENCE... STAFFING THE STORES DOES.</w:t>
+      </w:r>
+    </w:p>
+    <w:p>
+      <w:pPr>
+        <w:spacing w:lineRule="auto" w:line="276" w:before="0" w:after="0"/>
+      </w:pPr>
+      <w:r>
+        <w:rPr>
+          <w:rFonts w:ascii="Arial" w:hAnsi="Arial" w:cs="Arial" w:eastAsia="Arial"/>
+          <w:b w:val="0"/>
+          <w:color w:val="000000"/>
+          <w:sz w:val="36"/>
+        </w:rPr>
+      </w:r>
+    </w:p>
+    <w:p>
+      <w:pPr>
+        <w:spacing w:lineRule="auto" w:line="276" w:before="0" w:after="0"/>
+      </w:pPr>
+      <w:r>
+        <w:rPr>
+          <w:rFonts w:ascii="Arial" w:hAnsi="Arial" w:cs="Arial" w:eastAsia="Arial"/>
+          <w:b w:val="0"/>
+          <w:color w:val="000000"/>
+          <w:sz w:val="36"/>
+        </w:rPr>
+        <w:t>-SO INSTEAD OF MORE MACHINES, STARBUCKS STARTED HIRING MORE BARISTAS AT THOUSANDS OF STORES.</w:t>
+      </w:r>
+    </w:p>
+    <w:p>
+      <w:pPr>
+        <w:spacing w:lineRule="auto" w:line="276" w:before="0" w:after="0"/>
+      </w:pPr>
+      <w:r>
+        <w:rPr>
+          <w:rFonts w:ascii="Arial" w:hAnsi="Arial" w:cs="Arial" w:eastAsia="Arial"/>
+          <w:b w:val="0"/>
+          <w:color w:val="000000"/>
+          <w:sz w:val="36"/>
+        </w:rPr>
+      </w:r>
+    </w:p>
+    <w:p>
+      <w:pPr>
+        <w:spacing w:lineRule="auto" w:line="276" w:before="0" w:after="0"/>
+      </w:pPr>
+      <w:r>
+        <w:rPr>
+          <w:rFonts w:ascii="Arial" w:hAnsi="Arial" w:cs="Arial" w:eastAsia="Arial"/>
+          <w:b w:val="0"/>
+          <w:color w:val="000000"/>
+          <w:sz w:val="36"/>
+        </w:rPr>
+        <w:t>-SO DID PEOPLE ACTUALLY NOTICE THE DIFFERENCE???</w:t>
+      </w:r>
+    </w:p>
+    <w:p>
+      <w:pPr>
+        <w:spacing w:lineRule="auto" w:line="276" w:before="0" w:after="0"/>
+      </w:pPr>
+      <w:r>
+        <w:rPr>
+          <w:rFonts w:ascii="Arial" w:hAnsi="Arial" w:cs="Arial" w:eastAsia="Arial"/>
+          <w:b w:val="0"/>
+          <w:color w:val="000000"/>
+          <w:sz w:val="36"/>
+        </w:rPr>
+      </w:r>
+    </w:p>
+    <w:p>
+      <w:pPr>
+        <w:spacing w:lineRule="auto" w:line="276" w:before="0" w:after="0"/>
+      </w:pPr>
+      <w:r>
+        <w:rPr>
+          <w:rFonts w:ascii="Arial" w:hAnsi="Arial" w:cs="Arial" w:eastAsia="Arial"/>
+          <w:b w:val="0"/>
+          <w:color w:val="000000"/>
+          <w:sz w:val="36"/>
+        </w:rPr>
+        <w:t>-HERE'S NICCOL HIMSELF ON BLOOMBERG. CHECK THIS OUT.</w:t>
+      </w:r>
+    </w:p>
+    <w:p>
+      <w:pPr>
+        <w:spacing w:lineRule="auto" w:line="276" w:before="0" w:after="0"/>
+      </w:pPr>
+      <w:r>
+        <w:rPr>
+          <w:rFonts w:ascii="Arial" w:hAnsi="Arial" w:cs="Arial" w:eastAsia="Arial"/>
+          <w:b w:val="0"/>
+          <w:color w:val="000000"/>
+          <w:sz w:val="36"/>
+        </w:rPr>
+      </w:r>
+    </w:p>
+    <w:p>
+      <w:pPr>
+        <w:spacing w:lineRule="auto" w:line="276" w:before="0" w:after="0"/>
+      </w:pPr>
+      <w:r>
+        <w:rPr>
+          <w:rFonts w:ascii="Arial" w:hAnsi="Arial" w:cs="Arial" w:eastAsia="Arial"/>
+          <w:b/>
+          <w:color w:val="FF0000"/>
+          <w:sz w:val="36"/>
+        </w:rPr>
+        <w:t>(((PLAY CLIP 8 HORIZONTAL)))</w:t>
+      </w:r>
+    </w:p>
+    <w:p>
+      <w:pPr>
+        <w:spacing w:lineRule="auto" w:line="276" w:before="0" w:after="0"/>
+      </w:pPr>
+      <w:r>
+        <w:rPr>
+          <w:rFonts w:ascii="Arial" w:hAnsi="Arial" w:cs="Arial" w:eastAsia="Arial"/>
+          <w:b/>
+          <w:color w:val="FF0000"/>
+          <w:sz w:val="36"/>
+        </w:rPr>
+        <w:t xml:space="preserve">((URL: </w:t>
+      </w:r>
+      <w:hyperlink r:id="rId16">
+        <w:r>
+          <w:rPr>
+            <w:color w:val="1155CC"/>
+            <w:u w:val="single"/>
+            <w:rFonts w:ascii="Arial" w:hAnsi="Arial" w:cs="Arial"/>
+            <w:sz w:val="36"/>
+          </w:rPr>
+          <w:t xml:space="preserve">BLOOMBERG TELEVISION — STARBUCKS CEO NICCOL SAYS BARISTAS AND CUSTOMERS ARE EMBRACING CHANGES</w:t>
+        </w:r>
+      </w:hyperlink>
+      <w:r>
+        <w:rPr>
+          <w:rFonts w:ascii="Arial" w:hAnsi="Arial" w:cs="Arial" w:eastAsia="Arial"/>
+          <w:b/>
+          <w:color w:val="FF0000"/>
+          <w:sz w:val="36"/>
+        </w:rPr>
+        <w:t>))</w:t>
+      </w:r>
+    </w:p>
+    <w:p>
+      <w:pPr>
+        <w:spacing w:lineRule="auto" w:line="276" w:before="0" w:after="0"/>
+      </w:pPr>
+      <w:r>
+        <w:rPr>
+          <w:rFonts w:ascii="Arial" w:hAnsi="Arial" w:cs="Arial" w:eastAsia="Arial"/>
+          <w:b/>
+          <w:color w:val="FF0000"/>
+          <w:sz w:val="36"/>
+        </w:rPr>
+        <w:t>OUT:</w:t>
+      </w:r>
+    </w:p>
+    <w:p>
+      <w:pPr>
+        <w:spacing w:lineRule="auto" w:line="276" w:before="0" w:after="0"/>
+      </w:pPr>
+      <w:r>
+        <w:rPr>
+          <w:rFonts w:ascii="Arial" w:hAnsi="Arial" w:cs="Arial" w:eastAsia="Arial"/>
+          <w:b w:val="0"/>
+          <w:color w:val="000000"/>
+          <w:sz w:val="36"/>
+        </w:rPr>
+      </w:r>
+    </w:p>
+    <w:p>
+      <w:pPr>
+        <w:spacing w:lineRule="auto" w:line="276" w:before="0" w:after="0"/>
+      </w:pPr>
+      <w:r>
+        <w:rPr>
+          <w:rFonts w:ascii="Arial" w:hAnsi="Arial" w:cs="Arial" w:eastAsia="Arial"/>
+          <w:b w:val="0"/>
+          <w:color w:val="000000"/>
+          <w:sz w:val="36"/>
+        </w:rPr>
+        <w:t>-MORE BARISTAS INSTEAD OF MORE MACHINES. THAT'S THE WHOLE TURNAROUND PLAN!!</w:t>
+      </w:r>
+    </w:p>
+    <w:p>
+      <w:pPr>
+        <w:spacing w:lineRule="auto" w:line="276" w:before="0" w:after="0"/>
+      </w:pPr>
+      <w:r>
+        <w:rPr>
+          <w:rFonts w:ascii="Arial" w:hAnsi="Arial" w:cs="Arial" w:eastAsia="Arial"/>
+          <w:b w:val="0"/>
+          <w:color w:val="000000"/>
+          <w:sz w:val="36"/>
+        </w:rPr>
+      </w:r>
+    </w:p>
+    <w:p>
+      <w:pPr>
+        <w:spacing w:lineRule="auto" w:line="276" w:before="0" w:after="0"/>
+      </w:pPr>
+      <w:r>
+        <w:rPr>
+          <w:rFonts w:ascii="Arial" w:hAnsi="Arial" w:cs="Arial" w:eastAsia="Arial"/>
+          <w:b/>
+          <w:color w:val="000000"/>
+          <w:sz w:val="46"/>
+        </w:rPr>
         <w:t>AND THIS IS PROOF YOUR COMPLAINTS ACTUALLY GOT HEARD!!</w:t>
       </w:r>
     </w:p>
@@ -6506,211 +7301,85 @@
           <w:color w:val="000000"/>
           <w:sz w:val="36"/>
         </w:rPr>
-        <w:t xml:space="preserve">-STARTING OCTOBER 5TH, MCDONALD'S IS RETRAINING MORE THAN </w:t>
-      </w:r>
+        <w:t>-GARTNER, A RESEARCH FIRM, FOUND 87% OF PEOPLE WANT TO BE ABLE TO REACH A HUMAN. 87%.</w:t>
+      </w:r>
+    </w:p>
+    <w:p>
+      <w:pPr>
+        <w:spacing w:lineRule="auto" w:line="276" w:before="0" w:after="0"/>
+      </w:pPr>
+      <w:r>
+        <w:rPr>
+          <w:rFonts w:ascii="Arial" w:hAnsi="Arial" w:cs="Arial" w:eastAsia="Arial"/>
+          <w:b w:val="0"/>
+          <w:color w:val="000000"/>
+          <w:sz w:val="36"/>
+        </w:rPr>
+      </w:r>
+    </w:p>
+    <w:p>
+      <w:pPr>
+        <w:spacing w:lineRule="auto" w:line="276" w:before="0" w:after="0"/>
+      </w:pPr>
+      <w:r>
+        <w:rPr>
+          <w:rFonts w:ascii="Arial" w:hAnsi="Arial" w:cs="Arial" w:eastAsia="Arial"/>
+          <w:b w:val="0"/>
+          <w:color w:val="000000"/>
+          <w:sz w:val="36"/>
+        </w:rPr>
+        <w:t>-KLARNA, THE BUY-NOW-PAY-LATER COMPANY, PUSHED HARD INTO AI CUSTOMER SERVICE... THEN STARTED HIRING HUMAN AGENTS AGAIN.</w:t>
+      </w:r>
+    </w:p>
+    <w:p>
+      <w:pPr>
+        <w:spacing w:lineRule="auto" w:line="276" w:before="0" w:after="0"/>
+      </w:pPr>
+      <w:r>
+        <w:rPr>
+          <w:rFonts w:ascii="Arial" w:hAnsi="Arial" w:cs="Arial" w:eastAsia="Arial"/>
+          <w:b w:val="0"/>
+          <w:color w:val="000000"/>
+          <w:sz w:val="36"/>
+        </w:rPr>
+      </w:r>
+    </w:p>
+    <w:p>
+      <w:pPr>
+        <w:spacing w:lineRule="auto" w:line="276" w:before="0" w:after="0"/>
+      </w:pPr>
+      <w:r>
+        <w:rPr>
+          <w:rFonts w:ascii="Arial" w:hAnsi="Arial" w:cs="Arial" w:eastAsia="Arial"/>
+          <w:b w:val="0"/>
+          <w:color w:val="000000"/>
+          <w:sz w:val="36"/>
+        </w:rPr>
+        <w:t>YOUR FEEDBACK WAS HEARD, AND IT MADE A DIFFERENCE!!</w:t>
+      </w:r>
+    </w:p>
+    <w:p>
+      <w:pPr>
+        <w:spacing w:lineRule="auto" w:line="276" w:before="0" w:after="0"/>
+      </w:pPr>
+      <w:r>
+        <w:rPr>
+          <w:rFonts w:ascii="Arial" w:hAnsi="Arial" w:cs="Arial" w:eastAsia="Arial"/>
+          <w:b w:val="0"/>
+          <w:color w:val="000000"/>
+          <w:sz w:val="36"/>
+        </w:rPr>
+      </w:r>
+    </w:p>
+    <w:p>
+      <w:pPr>
+        <w:spacing w:lineRule="auto" w:line="276" w:before="0" w:after="0"/>
+      </w:pPr>
       <w:r>
         <w:rPr>
           <w:rFonts w:ascii="Arial" w:hAnsi="Arial" w:cs="Arial" w:eastAsia="Arial"/>
           <w:b/>
           <w:color w:val="000000"/>
-          <w:sz w:val="36"/>
-        </w:rPr>
-        <w:t>2 MILLION WORKERS</w:t>
-      </w:r>
-      <w:r>
-        <w:rPr>
-          <w:rFonts w:ascii="Arial" w:hAnsi="Arial" w:cs="Arial" w:eastAsia="Arial"/>
-          <w:b w:val="0"/>
-          <w:color w:val="000000"/>
-          <w:sz w:val="36"/>
-        </w:rPr>
-        <w:t>.</w:t>
-      </w:r>
-    </w:p>
-    <w:p>
-      <w:pPr>
-        <w:spacing w:lineRule="auto" w:line="276" w:before="0" w:after="0"/>
-      </w:pPr>
-      <w:r>
-        <w:rPr>
-          <w:rFonts w:ascii="Arial" w:hAnsi="Arial" w:cs="Arial" w:eastAsia="Arial"/>
-          <w:b w:val="0"/>
-          <w:color w:val="000000"/>
-          <w:sz w:val="36"/>
-        </w:rPr>
-      </w:r>
-    </w:p>
-    <w:p>
-      <w:pPr>
-        <w:spacing w:lineRule="auto" w:line="276" w:before="0" w:after="0"/>
-      </w:pPr>
-      <w:r>
-        <w:rPr>
-          <w:rFonts w:ascii="Arial" w:hAnsi="Arial" w:cs="Arial" w:eastAsia="Arial"/>
-          <w:b w:val="0"/>
-          <w:color w:val="000000"/>
-          <w:sz w:val="36"/>
-        </w:rPr>
-        <w:t>-IT'S CALLED "MAKE IT GOLDEN."</w:t>
-      </w:r>
-    </w:p>
-    <w:p>
-      <w:pPr>
-        <w:spacing w:lineRule="auto" w:line="276" w:before="0" w:after="0"/>
-      </w:pPr>
-      <w:r>
-        <w:rPr>
-          <w:rFonts w:ascii="Arial" w:hAnsi="Arial" w:cs="Arial" w:eastAsia="Arial"/>
-          <w:b w:val="0"/>
-          <w:color w:val="000000"/>
-          <w:sz w:val="36"/>
-        </w:rPr>
-      </w:r>
-    </w:p>
-    <w:p>
-      <w:pPr>
-        <w:spacing w:lineRule="auto" w:line="276" w:before="0" w:after="0"/>
-      </w:pPr>
-      <w:r>
-        <w:rPr>
-          <w:rFonts w:ascii="Arial" w:hAnsi="Arial" w:cs="Arial" w:eastAsia="Arial"/>
-          <w:b w:val="0"/>
-          <w:color w:val="000000"/>
-          <w:sz w:val="36"/>
-        </w:rPr>
-        <w:t>-IT'S ALL ABOUT HOSPITALITY... HOW THEY TREAT YOU AT THE COUNTER AND AT THE WINDOW.</w:t>
-      </w:r>
-    </w:p>
-    <w:p>
-      <w:pPr>
-        <w:spacing w:lineRule="auto" w:line="276" w:before="0" w:after="0"/>
-      </w:pPr>
-      <w:r>
-        <w:rPr>
-          <w:rFonts w:ascii="Arial" w:hAnsi="Arial" w:cs="Arial" w:eastAsia="Arial"/>
-          <w:b w:val="0"/>
-          <w:color w:val="000000"/>
-          <w:sz w:val="36"/>
-        </w:rPr>
-      </w:r>
-    </w:p>
-    <w:p>
-      <w:pPr>
-        <w:spacing w:lineRule="auto" w:line="276" w:before="0" w:after="0"/>
-      </w:pPr>
-      <w:r>
-        <w:rPr>
-          <w:rFonts w:ascii="Arial" w:hAnsi="Arial" w:cs="Arial" w:eastAsia="Arial"/>
-          <w:b w:val="0"/>
-          <w:color w:val="000000"/>
-          <w:sz w:val="36"/>
-        </w:rPr>
-        <w:t>-AND IT'S NOT JUST BURGERS.</w:t>
-      </w:r>
-    </w:p>
-    <w:p>
-      <w:pPr>
-        <w:spacing w:lineRule="auto" w:line="276" w:before="0" w:after="0"/>
-      </w:pPr>
-      <w:r>
-        <w:rPr>
-          <w:rFonts w:ascii="Arial" w:hAnsi="Arial" w:cs="Arial" w:eastAsia="Arial"/>
-          <w:b w:val="0"/>
-          <w:color w:val="000000"/>
-          <w:sz w:val="36"/>
-        </w:rPr>
-      </w:r>
-    </w:p>
-    <w:p>
-      <w:pPr>
-        <w:spacing w:lineRule="auto" w:line="276" w:before="0" w:after="0"/>
-      </w:pPr>
-      <w:r>
-        <w:rPr>
-          <w:rFonts w:ascii="Arial" w:hAnsi="Arial" w:cs="Arial" w:eastAsia="Arial"/>
-          <w:b w:val="0"/>
-          <w:color w:val="000000"/>
-          <w:sz w:val="36"/>
-        </w:rPr>
-        <w:t>-GARTNER, A RESEARCH FIRM, FOUND 87% OF PEOPLE WANT TO BE ABLE TO REACH A HUMAN. 87%.</w:t>
-      </w:r>
-    </w:p>
-    <w:p>
-      <w:pPr>
-        <w:spacing w:lineRule="auto" w:line="276" w:before="0" w:after="0"/>
-      </w:pPr>
-      <w:r>
-        <w:rPr>
-          <w:rFonts w:ascii="Arial" w:hAnsi="Arial" w:cs="Arial" w:eastAsia="Arial"/>
-          <w:b w:val="0"/>
-          <w:color w:val="000000"/>
-          <w:sz w:val="36"/>
-        </w:rPr>
-      </w:r>
-    </w:p>
-    <w:p>
-      <w:pPr>
-        <w:spacing w:lineRule="auto" w:line="276" w:before="0" w:after="0"/>
-      </w:pPr>
-      <w:r>
-        <w:rPr>
-          <w:rFonts w:ascii="Arial" w:hAnsi="Arial" w:cs="Arial" w:eastAsia="Arial"/>
-          <w:b w:val="0"/>
-          <w:color w:val="000000"/>
-          <w:sz w:val="36"/>
-        </w:rPr>
-        <w:t>-KLARNA, THE BUY-NOW-PAY-LATER COMPANY, PUSHED HARD INTO AI CUSTOMER SERVICE... THEN STARTED HIRING HUMAN AGENTS AGAIN.</w:t>
-      </w:r>
-    </w:p>
-    <w:p>
-      <w:pPr>
-        <w:spacing w:lineRule="auto" w:line="276" w:before="0" w:after="0"/>
-      </w:pPr>
-      <w:r>
-        <w:rPr>
-          <w:rFonts w:ascii="Arial" w:hAnsi="Arial" w:cs="Arial" w:eastAsia="Arial"/>
-          <w:b w:val="0"/>
-          <w:color w:val="000000"/>
-          <w:sz w:val="36"/>
-        </w:rPr>
-      </w:r>
-    </w:p>
-    <w:p>
-      <w:pPr>
-        <w:spacing w:lineRule="auto" w:line="276" w:before="0" w:after="0"/>
-      </w:pPr>
-      <w:r>
-        <w:rPr>
-          <w:rFonts w:ascii="Arial" w:hAnsi="Arial" w:cs="Arial" w:eastAsia="Arial"/>
-          <w:b w:val="0"/>
-          <w:color w:val="000000"/>
-          <w:sz w:val="36"/>
-        </w:rPr>
-        <w:t>YOUR FEEDBACK WAS HEARD, AND IT MADE A DIFFERENCE!!</w:t>
-      </w:r>
-    </w:p>
-    <w:p>
-      <w:pPr>
-        <w:spacing w:lineRule="auto" w:line="276" w:before="0" w:after="0"/>
-      </w:pPr>
-      <w:r>
-        <w:rPr>
-          <w:rFonts w:ascii="Arial" w:hAnsi="Arial" w:cs="Arial" w:eastAsia="Arial"/>
-          <w:b w:val="0"/>
-          <w:color w:val="000000"/>
-          <w:sz w:val="36"/>
-        </w:rPr>
-      </w:r>
-    </w:p>
-    <w:p>
-      <w:pPr>
-        <w:spacing w:lineRule="auto" w:line="276" w:before="0" w:after="0"/>
-      </w:pPr>
-      <w:r>
-        <w:rPr>
-          <w:rFonts w:ascii="Arial" w:hAnsi="Arial" w:cs="Arial" w:eastAsia="Arial"/>
-          <w:b/>
-          <w:color w:val="000000"/>
           <w:sz w:val="46"/>
         </w:rPr>
         <w:t>HERE'S HOW YOU CAN GET A REAL PERSON</w:t>
@@ -6767,34 +7436,34 @@
           <w:color w:val="000000"/>
           <w:sz w:val="36"/>
         </w:rPr>
-        <w:t>-BECAUSE MCDONALD'S SAYS IT WANTS AN EMPLOYEE ON HAND FOR ANYONE WHO PREFERS ONE.</w:t>
-      </w:r>
-    </w:p>
-    <w:p>
-      <w:pPr>
-        <w:spacing w:lineRule="auto" w:line="276" w:before="0" w:after="0"/>
-      </w:pPr>
-      <w:r>
-        <w:rPr>
-          <w:rFonts w:ascii="Arial" w:hAnsi="Arial" w:cs="Arial" w:eastAsia="Arial"/>
-          <w:b w:val="0"/>
-          <w:color w:val="000000"/>
-          <w:sz w:val="36"/>
-        </w:rPr>
-      </w:r>
-    </w:p>
-    <w:p>
-      <w:pPr>
-        <w:spacing w:lineRule="auto" w:line="276" w:before="0" w:after="0"/>
-      </w:pPr>
-      <w:r>
-        <w:rPr>
-          <w:rFonts w:ascii="Arial" w:hAnsi="Arial" w:cs="Arial" w:eastAsia="Arial"/>
-          <w:b w:val="0"/>
-          <w:color w:val="000000"/>
-          <w:sz w:val="36"/>
-        </w:rPr>
-        <w:t>-NUMBER TWO. AT THE SPEAKER, ASK FOR A PERSON.</w:t>
+        <w:t>-BECAUSE MCDONALD'S IS TRAINING ITS WORKERS TO GREET YOU AND CHECK ON YOU IN THE LOBBY.</w:t>
+      </w:r>
+    </w:p>
+    <w:p>
+      <w:pPr>
+        <w:spacing w:lineRule="auto" w:line="276" w:before="0" w:after="0"/>
+      </w:pPr>
+      <w:r>
+        <w:rPr>
+          <w:rFonts w:ascii="Arial" w:hAnsi="Arial" w:cs="Arial" w:eastAsia="Arial"/>
+          <w:b w:val="0"/>
+          <w:color w:val="000000"/>
+          <w:sz w:val="36"/>
+        </w:rPr>
+      </w:r>
+    </w:p>
+    <w:p>
+      <w:pPr>
+        <w:spacing w:lineRule="auto" w:line="276" w:before="0" w:after="0"/>
+      </w:pPr>
+      <w:r>
+        <w:rPr>
+          <w:rFonts w:ascii="Arial" w:hAnsi="Arial" w:cs="Arial" w:eastAsia="Arial"/>
+          <w:b w:val="0"/>
+          <w:color w:val="000000"/>
+          <w:sz w:val="36"/>
+        </w:rPr>
+        <w:t>-NUMBER TWO. AT THE DRIVE-THRU SPEAKER, ASK FOR A PERSON.</w:t>
       </w:r>
     </w:p>
     <w:p>

</xml_diff>

<commit_message>
10/07 bible: shorter, sourced Story C (McDonald's is bringing the humans back)
Co-Authored-By: Claude Opus 5.5 <noreply@anthropic.com>
Claude-Session: https://claude.ai/code/session_01TNJ6mpHv7cQth7iuoFbymm
</commit_message>
<xml_diff>
--- a/runs/W_10072026/10_07 LIVE BIBLE.docx
+++ b/runs/W_10072026/10_07 LIVE BIBLE.docx
@@ -5607,61 +5607,61 @@
           <w:color w:val="000000"/>
           <w:sz w:val="46"/>
         </w:rPr>
-        <w:t>THEY REPLACED THE CASHIER WITH A ROBOT... NOW THEY'RE BRINGING THE HUMANS BACK!!</w:t>
-      </w:r>
-    </w:p>
-    <w:p>
-      <w:pPr>
-        <w:spacing w:lineRule="auto" w:line="276" w:before="0" w:after="0"/>
-      </w:pPr>
-      <w:r>
-        <w:rPr>
-          <w:rFonts w:ascii="Arial" w:hAnsi="Arial" w:cs="Arial" w:eastAsia="Arial"/>
-          <w:b w:val="0"/>
-          <w:color w:val="000000"/>
-          <w:sz w:val="36"/>
-        </w:rPr>
-      </w:r>
-    </w:p>
-    <w:p>
-      <w:pPr>
-        <w:spacing w:lineRule="auto" w:line="276" w:before="0" w:after="0"/>
-      </w:pPr>
-      <w:r>
-        <w:rPr>
-          <w:rFonts w:ascii="Arial" w:hAnsi="Arial" w:cs="Arial" w:eastAsia="Arial"/>
-          <w:b w:val="0"/>
-          <w:color w:val="000000"/>
-          <w:sz w:val="36"/>
-        </w:rPr>
-        <w:t>-FOR YEARS, FAST FOOD HAS BEEN SWAPPING PEOPLE FOR KIOSKS, APPS AND AI VOICES AT THE DRIVE-THRU.</w:t>
-      </w:r>
-    </w:p>
-    <w:p>
-      <w:pPr>
-        <w:spacing w:lineRule="auto" w:line="276" w:before="0" w:after="0"/>
-      </w:pPr>
-      <w:r>
-        <w:rPr>
-          <w:rFonts w:ascii="Arial" w:hAnsi="Arial" w:cs="Arial" w:eastAsia="Arial"/>
-          <w:b w:val="0"/>
-          <w:color w:val="000000"/>
-          <w:sz w:val="36"/>
-        </w:rPr>
-      </w:r>
-    </w:p>
-    <w:p>
-      <w:pPr>
-        <w:spacing w:lineRule="auto" w:line="276" w:before="0" w:after="0"/>
-      </w:pPr>
-      <w:r>
-        <w:rPr>
-          <w:rFonts w:ascii="Arial" w:hAnsi="Arial" w:cs="Arial" w:eastAsia="Arial"/>
-          <w:b w:val="0"/>
-          <w:color w:val="000000"/>
-          <w:sz w:val="36"/>
-        </w:rPr>
-        <w:t>-AND NOW THE BIGGEST BURGER CHAIN IN THE WORLD IS BETTING ON PEOPLE AGAIN!!</w:t>
+        <w:t>MCDONALD'S IS BRINGING THE HUMANS BACK!!</w:t>
+      </w:r>
+    </w:p>
+    <w:p>
+      <w:pPr>
+        <w:spacing w:lineRule="auto" w:line="276" w:before="0" w:after="0"/>
+      </w:pPr>
+      <w:r>
+        <w:rPr>
+          <w:rFonts w:ascii="Arial" w:hAnsi="Arial" w:cs="Arial" w:eastAsia="Arial"/>
+          <w:b w:val="0"/>
+          <w:color w:val="000000"/>
+          <w:sz w:val="36"/>
+        </w:rPr>
+      </w:r>
+    </w:p>
+    <w:p>
+      <w:pPr>
+        <w:spacing w:lineRule="auto" w:line="276" w:before="0" w:after="0"/>
+      </w:pPr>
+      <w:r>
+        <w:rPr>
+          <w:rFonts w:ascii="Arial" w:hAnsi="Arial" w:cs="Arial" w:eastAsia="Arial"/>
+          <w:b w:val="0"/>
+          <w:color w:val="000000"/>
+          <w:sz w:val="36"/>
+        </w:rPr>
+        <w:t>-FOR YEARS, MCDONALD'S PUSHED YOU TO KIOSKS, MOBILE ORDERING AND AI.</w:t>
+      </w:r>
+    </w:p>
+    <w:p>
+      <w:pPr>
+        <w:spacing w:lineRule="auto" w:line="276" w:before="0" w:after="0"/>
+      </w:pPr>
+      <w:r>
+        <w:rPr>
+          <w:rFonts w:ascii="Arial" w:hAnsi="Arial" w:cs="Arial" w:eastAsia="Arial"/>
+          <w:b w:val="0"/>
+          <w:color w:val="000000"/>
+          <w:sz w:val="36"/>
+        </w:rPr>
+      </w:r>
+    </w:p>
+    <w:p>
+      <w:pPr>
+        <w:spacing w:lineRule="auto" w:line="276" w:before="0" w:after="0"/>
+      </w:pPr>
+      <w:r>
+        <w:rPr>
+          <w:rFonts w:ascii="Arial" w:hAnsi="Arial" w:cs="Arial" w:eastAsia="Arial"/>
+          <w:b w:val="0"/>
+          <w:color w:val="000000"/>
+          <w:sz w:val="36"/>
+        </w:rPr>
+        <w:t>-NOW IT'S MAKING A MAJOR SHIFT... BACK TO PEOPLE.</w:t>
       </w:r>
     </w:p>
     <w:p>
@@ -5706,34 +5706,7 @@
           <w:color w:val="000000"/>
           <w:sz w:val="36"/>
         </w:rPr>
-        <w:t xml:space="preserve"> AROUND THE WORLD.</w:t>
-      </w:r>
-    </w:p>
-    <w:p>
-      <w:pPr>
-        <w:spacing w:lineRule="auto" w:line="276" w:before="0" w:after="0"/>
-      </w:pPr>
-      <w:r>
-        <w:rPr>
-          <w:rFonts w:ascii="Arial" w:hAnsi="Arial" w:cs="Arial" w:eastAsia="Arial"/>
-          <w:b w:val="0"/>
-          <w:color w:val="000000"/>
-          <w:sz w:val="36"/>
-        </w:rPr>
-      </w:r>
-    </w:p>
-    <w:p>
-      <w:pPr>
-        <w:spacing w:lineRule="auto" w:line="276" w:before="0" w:after="0"/>
-      </w:pPr>
-      <w:r>
-        <w:rPr>
-          <w:rFonts w:ascii="Arial" w:hAnsi="Arial" w:cs="Arial" w:eastAsia="Arial"/>
-          <w:b w:val="0"/>
-          <w:color w:val="000000"/>
-          <w:sz w:val="36"/>
-        </w:rPr>
-        <w:t>-OCTOBER 5TH IS MCDONALD'S FOUNDER'S DAY. RAY KROC'S BIRTHDAY.</w:t>
+        <w:t xml:space="preserve"> AROUND THE WORLD. 2 MILLION!!</w:t>
       </w:r>
     </w:p>
     <w:p>
@@ -5778,34 +5751,34 @@
           <w:color w:val="000000"/>
           <w:sz w:val="36"/>
         </w:rPr>
-        <w:t>," AND IT'S ALL ABOUT HOSPITALITY... HOW THEY TREAT YOU.</w:t>
-      </w:r>
-    </w:p>
-    <w:p>
-      <w:pPr>
-        <w:spacing w:lineRule="auto" w:line="276" w:before="0" w:after="0"/>
-      </w:pPr>
-      <w:r>
-        <w:rPr>
-          <w:rFonts w:ascii="Arial" w:hAnsi="Arial" w:cs="Arial" w:eastAsia="Arial"/>
-          <w:b w:val="0"/>
-          <w:color w:val="000000"/>
-          <w:sz w:val="36"/>
-        </w:rPr>
-      </w:r>
-    </w:p>
-    <w:p>
-      <w:pPr>
-        <w:spacing w:lineRule="auto" w:line="276" w:before="0" w:after="0"/>
-      </w:pPr>
-      <w:r>
-        <w:rPr>
-          <w:rFonts w:ascii="Arial" w:hAnsi="Arial" w:cs="Arial" w:eastAsia="Arial"/>
-          <w:b w:val="0"/>
-          <w:color w:val="000000"/>
-          <w:sz w:val="36"/>
-        </w:rPr>
-        <w:t>-MCDONALD'S GLOBAL CHIEF PEOPLE OFFICER, TIFFANIE BOYD, CALLS IT "THE LARGEST UPSKILLING EFFORT IN THE COMPANY'S HISTORY."</w:t>
+        <w:t>," AND THE GOAL IS BETTER HOSPITALITY. HOW THEY TREAT YOU.</w:t>
+      </w:r>
+    </w:p>
+    <w:p>
+      <w:pPr>
+        <w:spacing w:lineRule="auto" w:line="276" w:before="0" w:after="0"/>
+      </w:pPr>
+      <w:r>
+        <w:rPr>
+          <w:rFonts w:ascii="Arial" w:hAnsi="Arial" w:cs="Arial" w:eastAsia="Arial"/>
+          <w:b w:val="0"/>
+          <w:color w:val="000000"/>
+          <w:sz w:val="36"/>
+        </w:rPr>
+      </w:r>
+    </w:p>
+    <w:p>
+      <w:pPr>
+        <w:spacing w:lineRule="auto" w:line="276" w:before="0" w:after="0"/>
+      </w:pPr>
+      <w:r>
+        <w:rPr>
+          <w:rFonts w:ascii="Arial" w:hAnsi="Arial" w:cs="Arial" w:eastAsia="Arial"/>
+          <w:b w:val="0"/>
+          <w:color w:val="000000"/>
+          <w:sz w:val="36"/>
+        </w:rPr>
+        <w:t>-IT'S THE BIGGEST TRAINING EFFORT IN THE COMPANY'S HISTORY.</w:t>
       </w:r>
     </w:p>
     <w:p>
@@ -5832,196 +5805,79 @@
           <w:color w:val="000000"/>
           <w:sz w:val="46"/>
         </w:rPr>
-        <w:t>AND WAIT UNTIL YOU HEAR WHAT THEY'RE TELLING WORKERS TO DO!!</w:t>
-      </w:r>
-    </w:p>
-    <w:p>
-      <w:pPr>
-        <w:spacing w:lineRule="auto" w:line="276" w:before="0" w:after="0"/>
-      </w:pPr>
-      <w:r>
-        <w:rPr>
-          <w:rFonts w:ascii="Arial" w:hAnsi="Arial" w:cs="Arial" w:eastAsia="Arial"/>
-          <w:b w:val="0"/>
-          <w:color w:val="000000"/>
-          <w:sz w:val="36"/>
-        </w:rPr>
-      </w:r>
-    </w:p>
-    <w:p>
-      <w:pPr>
-        <w:spacing w:lineRule="auto" w:line="276" w:before="0" w:after="0"/>
-      </w:pPr>
-      <w:r>
-        <w:rPr>
-          <w:rFonts w:ascii="Arial" w:hAnsi="Arial" w:cs="Arial" w:eastAsia="Arial"/>
-          <w:b w:val="0"/>
-          <w:color w:val="000000"/>
-          <w:sz w:val="36"/>
-        </w:rPr>
-        <w:t>-GREET YOU WHEN YOU WALK IN.</w:t>
-      </w:r>
-    </w:p>
-    <w:p>
-      <w:pPr>
-        <w:spacing w:lineRule="auto" w:line="276" w:before="0" w:after="0"/>
-      </w:pPr>
-      <w:r>
-        <w:rPr>
-          <w:rFonts w:ascii="Arial" w:hAnsi="Arial" w:cs="Arial" w:eastAsia="Arial"/>
-          <w:b w:val="0"/>
-          <w:color w:val="000000"/>
-          <w:sz w:val="36"/>
-        </w:rPr>
-      </w:r>
-    </w:p>
-    <w:p>
-      <w:pPr>
-        <w:spacing w:lineRule="auto" w:line="276" w:before="0" w:after="0"/>
-      </w:pPr>
-      <w:r>
-        <w:rPr>
-          <w:rFonts w:ascii="Arial" w:hAnsi="Arial" w:cs="Arial" w:eastAsia="Arial"/>
-          <w:b w:val="0"/>
-          <w:color w:val="000000"/>
-          <w:sz w:val="36"/>
-        </w:rPr>
-        <w:t>-CHECK ON YOU IN THE LOBBY... AND AGAIN BEFORE YOU LEAVE.</w:t>
-      </w:r>
-    </w:p>
-    <w:p>
-      <w:pPr>
-        <w:spacing w:lineRule="auto" w:line="276" w:before="0" w:after="0"/>
-      </w:pPr>
-      <w:r>
-        <w:rPr>
-          <w:rFonts w:ascii="Arial" w:hAnsi="Arial" w:cs="Arial" w:eastAsia="Arial"/>
-          <w:b w:val="0"/>
-          <w:color w:val="000000"/>
-          <w:sz w:val="36"/>
-        </w:rPr>
-      </w:r>
-    </w:p>
-    <w:p>
-      <w:pPr>
-        <w:spacing w:lineRule="auto" w:line="276" w:before="0" w:after="0"/>
-      </w:pPr>
-      <w:r>
-        <w:rPr>
-          <w:rFonts w:ascii="Arial" w:hAnsi="Arial" w:cs="Arial" w:eastAsia="Arial"/>
-          <w:b w:val="0"/>
-          <w:color w:val="000000"/>
-          <w:sz w:val="36"/>
-        </w:rPr>
-        <w:t>-AND ACCORDING TO THE WALL STREET JOURNAL, FRIENDLY SERVICE WILL NOW COUNT WHEN MCDONALD'S GRADES ITS FRANCHISE RESTAURANTS.</w:t>
-      </w:r>
-    </w:p>
-    <w:p>
-      <w:pPr>
-        <w:spacing w:lineRule="auto" w:line="276" w:before="0" w:after="0"/>
-      </w:pPr>
-      <w:r>
-        <w:rPr>
-          <w:rFonts w:ascii="Arial" w:hAnsi="Arial" w:cs="Arial" w:eastAsia="Arial"/>
-          <w:b w:val="0"/>
-          <w:color w:val="000000"/>
-          <w:sz w:val="36"/>
-        </w:rPr>
-      </w:r>
-    </w:p>
-    <w:p>
-      <w:pPr>
-        <w:spacing w:lineRule="auto" w:line="276" w:before="0" w:after="0"/>
-      </w:pPr>
-      <w:r>
-        <w:rPr>
-          <w:rFonts w:ascii="Arial" w:hAnsi="Arial" w:cs="Arial" w:eastAsia="Arial"/>
-          <w:b w:val="0"/>
-          <w:color w:val="000000"/>
-          <w:sz w:val="36"/>
-        </w:rPr>
-        <w:t>-SO IF YOUR LOCAL MCDONALD'S IS RUDE TO YOU, THAT'S GOING ON ITS REPORT CARD!!</w:t>
-      </w:r>
-    </w:p>
-    <w:p>
-      <w:pPr>
-        <w:spacing w:lineRule="auto" w:line="276" w:before="0" w:after="0"/>
-      </w:pPr>
-      <w:r>
-        <w:rPr>
-          <w:rFonts w:ascii="Arial" w:hAnsi="Arial" w:cs="Arial" w:eastAsia="Arial"/>
-          <w:b w:val="0"/>
-          <w:color w:val="000000"/>
-          <w:sz w:val="36"/>
-        </w:rPr>
-      </w:r>
-    </w:p>
-    <w:p>
-      <w:pPr>
-        <w:spacing w:lineRule="auto" w:line="276" w:before="0" w:after="0"/>
-      </w:pPr>
+        <w:t>AND WAIT UNTIL YOU HEAR WHAT THEY'RE TRAINING WORKERS TO SAY!!</w:t>
+      </w:r>
+    </w:p>
+    <w:p>
+      <w:pPr>
+        <w:spacing w:lineRule="auto" w:line="276" w:before="0" w:after="0"/>
+      </w:pPr>
+      <w:r>
+        <w:rPr>
+          <w:rFonts w:ascii="Arial" w:hAnsi="Arial" w:cs="Arial" w:eastAsia="Arial"/>
+          <w:b w:val="0"/>
+          <w:color w:val="000000"/>
+          <w:sz w:val="36"/>
+        </w:rPr>
+      </w:r>
+    </w:p>
+    <w:p>
+      <w:pPr>
+        <w:spacing w:lineRule="auto" w:line="276" w:before="0" w:after="0"/>
+      </w:pPr>
+      <w:r>
+        <w:rPr>
+          <w:rFonts w:ascii="Arial" w:hAnsi="Arial" w:cs="Arial" w:eastAsia="Arial"/>
+          <w:b w:val="0"/>
+          <w:color w:val="000000"/>
+          <w:sz w:val="36"/>
+        </w:rPr>
+        <w:t>-THE WALL STREET JOURNAL GOT A COPY OF AN INTERNAL MCDONALD'S TRAINING DOCUMENT.</w:t>
+      </w:r>
+    </w:p>
+    <w:p>
+      <w:pPr>
+        <w:spacing w:lineRule="auto" w:line="276" w:before="0" w:after="0"/>
+      </w:pPr>
+      <w:r>
+        <w:rPr>
+          <w:rFonts w:ascii="Arial" w:hAnsi="Arial" w:cs="Arial" w:eastAsia="Arial"/>
+          <w:b w:val="0"/>
+          <w:color w:val="000000"/>
+          <w:sz w:val="36"/>
+        </w:rPr>
+      </w:r>
+    </w:p>
+    <w:p>
+      <w:pPr>
+        <w:spacing w:lineRule="auto" w:line="276" w:before="0" w:after="0"/>
+      </w:pPr>
+      <w:r>
+        <w:rPr>
+          <w:rFonts w:ascii="Arial" w:hAnsi="Arial" w:cs="Arial" w:eastAsia="Arial"/>
+          <w:b w:val="0"/>
+          <w:color w:val="000000"/>
+          <w:sz w:val="36"/>
+        </w:rPr>
+        <w:t>-WORKERS ARE SUPPOSED TO GREET YOU WITH ENERGY... "</w:t>
+      </w:r>
       <w:r>
         <w:rPr>
           <w:rFonts w:ascii="Arial" w:hAnsi="Arial" w:cs="Arial" w:eastAsia="Arial"/>
           <w:b/>
           <w:color w:val="000000"/>
-          <w:sz w:val="46"/>
-        </w:rPr>
-        <w:t>SO WHY IS MCDONALD'S DOING THIS NOW???</w:t>
-      </w:r>
-    </w:p>
-    <w:p>
-      <w:pPr>
-        <w:spacing w:lineRule="auto" w:line="276" w:before="0" w:after="0"/>
-      </w:pPr>
-      <w:r>
-        <w:rPr>
-          <w:rFonts w:ascii="Arial" w:hAnsi="Arial" w:cs="Arial" w:eastAsia="Arial"/>
-          <w:b w:val="0"/>
-          <w:color w:val="000000"/>
-          <w:sz w:val="36"/>
-        </w:rPr>
-      </w:r>
-    </w:p>
-    <w:p>
-      <w:pPr>
-        <w:spacing w:lineRule="auto" w:line="276" w:before="0" w:after="0"/>
-      </w:pPr>
-      <w:r>
-        <w:rPr>
-          <w:rFonts w:ascii="Arial" w:hAnsi="Arial" w:cs="Arial" w:eastAsia="Arial"/>
-          <w:b w:val="0"/>
-          <w:color w:val="000000"/>
-          <w:sz w:val="36"/>
-        </w:rPr>
-        <w:t>-A GROUP OF MCDONALD'S OWN FRANCHISE OWNERS PUT IT IN WRITING. AND I'M QUOTING HERE...</w:t>
-      </w:r>
-    </w:p>
-    <w:p>
-      <w:pPr>
-        <w:spacing w:lineRule="auto" w:line="276" w:before="0" w:after="0"/>
-      </w:pPr>
-      <w:r>
-        <w:rPr>
-          <w:rFonts w:ascii="Arial" w:hAnsi="Arial" w:cs="Arial" w:eastAsia="Arial"/>
-          <w:b w:val="0"/>
-          <w:color w:val="000000"/>
-          <w:sz w:val="36"/>
-        </w:rPr>
-      </w:r>
-    </w:p>
-    <w:p>
-      <w:pPr>
-        <w:spacing w:lineRule="auto" w:line="276" w:before="0" w:after="0"/>
-      </w:pPr>
-      <w:r>
-        <w:rPr>
-          <w:rFonts w:ascii="Arial" w:hAnsi="Arial" w:cs="Arial" w:eastAsia="Arial"/>
-          <w:b w:val="0"/>
-          <w:color w:val="000000"/>
-          <w:sz w:val="36"/>
-        </w:rPr>
-        <w:t xml:space="preserve">-"MANY GUESTS SAY THEIR EXPERIENCES IN OUR RESTAURANTS SEEM </w:t>
+          <w:sz w:val="36"/>
+        </w:rPr>
+        <w:t>ENJOY YOUR MEAL!</w:t>
+      </w:r>
+      <w:r>
+        <w:rPr>
+          <w:rFonts w:ascii="Arial" w:hAnsi="Arial" w:cs="Arial" w:eastAsia="Arial"/>
+          <w:b w:val="0"/>
+          <w:color w:val="000000"/>
+          <w:sz w:val="36"/>
+        </w:rPr>
+        <w:t>" AND "</w:t>
       </w:r>
       <w:r>
         <w:rPr>
@@ -6030,124 +5886,151 @@
           <w:color w:val="000000"/>
           <w:sz w:val="36"/>
         </w:rPr>
-        <w:t>RUSHED, IMPERSONAL, STERILE AND COLD</w:t>
-      </w:r>
-      <w:r>
-        <w:rPr>
-          <w:rFonts w:ascii="Arial" w:hAnsi="Arial" w:cs="Arial" w:eastAsia="Arial"/>
-          <w:b w:val="0"/>
-          <w:color w:val="000000"/>
-          <w:sz w:val="36"/>
-        </w:rPr>
-        <w:t>."</w:t>
-      </w:r>
-    </w:p>
-    <w:p>
-      <w:pPr>
-        <w:spacing w:lineRule="auto" w:line="276" w:before="0" w:after="0"/>
-      </w:pPr>
-      <w:r>
-        <w:rPr>
-          <w:rFonts w:ascii="Arial" w:hAnsi="Arial" w:cs="Arial" w:eastAsia="Arial"/>
-          <w:b w:val="0"/>
-          <w:color w:val="000000"/>
-          <w:sz w:val="36"/>
-        </w:rPr>
-      </w:r>
-    </w:p>
-    <w:p>
-      <w:pPr>
-        <w:spacing w:lineRule="auto" w:line="276" w:before="0" w:after="0"/>
-      </w:pPr>
-      <w:r>
-        <w:rPr>
-          <w:rFonts w:ascii="Arial" w:hAnsi="Arial" w:cs="Arial" w:eastAsia="Arial"/>
-          <w:b w:val="0"/>
-          <w:color w:val="000000"/>
-          <w:sz w:val="36"/>
-        </w:rPr>
-        <w:t>-THAT'S NOT A CRITIC SAYING IT. THAT'S THE PEOPLE WHO OWN THE RESTAURANTS!!</w:t>
-      </w:r>
-    </w:p>
-    <w:p>
-      <w:pPr>
-        <w:spacing w:lineRule="auto" w:line="276" w:before="0" w:after="0"/>
-      </w:pPr>
-      <w:r>
-        <w:rPr>
-          <w:rFonts w:ascii="Arial" w:hAnsi="Arial" w:cs="Arial" w:eastAsia="Arial"/>
-          <w:b w:val="0"/>
-          <w:color w:val="000000"/>
-          <w:sz w:val="36"/>
-        </w:rPr>
-      </w:r>
-    </w:p>
-    <w:p>
-      <w:pPr>
-        <w:spacing w:lineRule="auto" w:line="276" w:before="0" w:after="0"/>
-      </w:pPr>
-      <w:r>
-        <w:rPr>
-          <w:rFonts w:ascii="Arial" w:hAnsi="Arial" w:cs="Arial" w:eastAsia="Arial"/>
-          <w:b w:val="0"/>
-          <w:color w:val="000000"/>
-          <w:sz w:val="36"/>
-        </w:rPr>
-        <w:t>-AND YOU KNOW EXACTLY WHAT THEY MEAN. YOU PULL UP, AND A COMPUTER VOICE TAKES YOUR ORDER.</w:t>
-      </w:r>
-    </w:p>
-    <w:p>
-      <w:pPr>
-        <w:spacing w:lineRule="auto" w:line="276" w:before="0" w:after="0"/>
-      </w:pPr>
-      <w:r>
-        <w:rPr>
-          <w:rFonts w:ascii="Arial" w:hAnsi="Arial" w:cs="Arial" w:eastAsia="Arial"/>
-          <w:b w:val="0"/>
-          <w:color w:val="000000"/>
-          <w:sz w:val="36"/>
-        </w:rPr>
-      </w:r>
-    </w:p>
-    <w:p>
-      <w:pPr>
-        <w:spacing w:lineRule="auto" w:line="276" w:before="0" w:after="0"/>
-      </w:pPr>
-      <w:r>
-        <w:rPr>
-          <w:rFonts w:ascii="Arial" w:hAnsi="Arial" w:cs="Arial" w:eastAsia="Arial"/>
-          <w:b w:val="0"/>
-          <w:color w:val="000000"/>
-          <w:sz w:val="36"/>
-        </w:rPr>
-        <w:t>-THIS DRIVER FILMED THE AI VOICE AT A MCDONALD'S DRIVE-THRU BACK IN 2023. THE VIDEO WENT VIRAL.</w:t>
-      </w:r>
-    </w:p>
-    <w:p>
-      <w:pPr>
-        <w:spacing w:lineRule="auto" w:line="276" w:before="0" w:after="0"/>
-      </w:pPr>
-      <w:r>
-        <w:rPr>
-          <w:rFonts w:ascii="Arial" w:hAnsi="Arial" w:cs="Arial" w:eastAsia="Arial"/>
-          <w:b w:val="0"/>
-          <w:color w:val="000000"/>
-          <w:sz w:val="36"/>
-        </w:rPr>
-      </w:r>
-    </w:p>
-    <w:p>
-      <w:pPr>
-        <w:spacing w:lineRule="auto" w:line="276" w:before="0" w:after="0"/>
-      </w:pPr>
-      <w:r>
-        <w:rPr>
-          <w:rFonts w:ascii="Arial" w:hAnsi="Arial" w:cs="Arial" w:eastAsia="Arial"/>
-          <w:b w:val="0"/>
-          <w:color w:val="000000"/>
-          <w:sz w:val="36"/>
-        </w:rPr>
-        <w:t xml:space="preserve">-ALL THEY WANTED WAS A SIMPLE ORDER. THE PROBLEM? THE </w:t>
+        <w:t>SEE YOU SOON!</w:t>
+      </w:r>
+      <w:r>
+        <w:rPr>
+          <w:rFonts w:ascii="Arial" w:hAnsi="Arial" w:cs="Arial" w:eastAsia="Arial"/>
+          <w:b w:val="0"/>
+          <w:color w:val="000000"/>
+          <w:sz w:val="36"/>
+        </w:rPr>
+        <w:t>"</w:t>
+      </w:r>
+    </w:p>
+    <w:p>
+      <w:pPr>
+        <w:spacing w:lineRule="auto" w:line="276" w:before="0" w:after="0"/>
+      </w:pPr>
+      <w:r>
+        <w:rPr>
+          <w:rFonts w:ascii="Arial" w:hAnsi="Arial" w:cs="Arial" w:eastAsia="Arial"/>
+          <w:b w:val="0"/>
+          <w:color w:val="000000"/>
+          <w:sz w:val="36"/>
+        </w:rPr>
+      </w:r>
+    </w:p>
+    <w:p>
+      <w:pPr>
+        <w:spacing w:lineRule="auto" w:line="276" w:before="0" w:after="0"/>
+      </w:pPr>
+      <w:r>
+        <w:rPr>
+          <w:rFonts w:ascii="Arial" w:hAnsi="Arial" w:cs="Arial" w:eastAsia="Arial"/>
+          <w:b w:val="0"/>
+          <w:color w:val="000000"/>
+          <w:sz w:val="36"/>
+        </w:rPr>
+        <w:t>-AND ACCORDING TO THE JOURNAL, MCDONALD'S OWN FRANCHISE OWNERS ADMITTED THE PROBLEM.</w:t>
+      </w:r>
+    </w:p>
+    <w:p>
+      <w:pPr>
+        <w:spacing w:lineRule="auto" w:line="276" w:before="0" w:after="0"/>
+      </w:pPr>
+      <w:r>
+        <w:rPr>
+          <w:rFonts w:ascii="Arial" w:hAnsi="Arial" w:cs="Arial" w:eastAsia="Arial"/>
+          <w:b w:val="0"/>
+          <w:color w:val="000000"/>
+          <w:sz w:val="36"/>
+        </w:rPr>
+      </w:r>
+    </w:p>
+    <w:p>
+      <w:pPr>
+        <w:spacing w:lineRule="auto" w:line="276" w:before="0" w:after="0"/>
+      </w:pPr>
+      <w:r>
+        <w:rPr>
+          <w:rFonts w:ascii="Arial" w:hAnsi="Arial" w:cs="Arial" w:eastAsia="Arial"/>
+          <w:b w:val="0"/>
+          <w:color w:val="000000"/>
+          <w:sz w:val="36"/>
+        </w:rPr>
+        <w:t>-THEY SAID MANY GUESTS FEEL THEIR VISITS ARE "RUSHED, IMPERSONAL, STERILE AND COLD."</w:t>
+      </w:r>
+    </w:p>
+    <w:p>
+      <w:pPr>
+        <w:spacing w:lineRule="auto" w:line="276" w:before="0" w:after="0"/>
+      </w:pPr>
+      <w:r>
+        <w:rPr>
+          <w:rFonts w:ascii="Arial" w:hAnsi="Arial" w:cs="Arial" w:eastAsia="Arial"/>
+          <w:b w:val="0"/>
+          <w:color w:val="000000"/>
+          <w:sz w:val="36"/>
+        </w:rPr>
+      </w:r>
+    </w:p>
+    <w:p>
+      <w:pPr>
+        <w:spacing w:lineRule="auto" w:line="276" w:before="0" w:after="0"/>
+      </w:pPr>
+      <w:r>
+        <w:rPr>
+          <w:rFonts w:ascii="Arial" w:hAnsi="Arial" w:cs="Arial" w:eastAsia="Arial"/>
+          <w:b w:val="0"/>
+          <w:color w:val="000000"/>
+          <w:sz w:val="36"/>
+        </w:rPr>
+        <w:t>-YOU KNOW EXACTLY WHAT THEY MEAN. YOU PULL UP, AND A COMPUTER VOICE TAKES YOUR ORDER.</w:t>
+      </w:r>
+    </w:p>
+    <w:p>
+      <w:pPr>
+        <w:spacing w:lineRule="auto" w:line="276" w:before="0" w:after="0"/>
+      </w:pPr>
+      <w:r>
+        <w:rPr>
+          <w:rFonts w:ascii="Arial" w:hAnsi="Arial" w:cs="Arial" w:eastAsia="Arial"/>
+          <w:b w:val="0"/>
+          <w:color w:val="000000"/>
+          <w:sz w:val="36"/>
+        </w:rPr>
+      </w:r>
+    </w:p>
+    <w:p>
+      <w:pPr>
+        <w:spacing w:lineRule="auto" w:line="276" w:before="0" w:after="0"/>
+      </w:pPr>
+      <w:r>
+        <w:rPr>
+          <w:rFonts w:ascii="Arial" w:hAnsi="Arial" w:cs="Arial" w:eastAsia="Arial"/>
+          <w:b w:val="0"/>
+          <w:color w:val="000000"/>
+          <w:sz w:val="36"/>
+        </w:rPr>
+        <w:t>-THIS DRIVER FILMED THE AI VOICE AT A MCDONALD'S DRIVE-THRU. ALL THEY WANTED WAS A SIMPLE ORDER.</w:t>
+      </w:r>
+    </w:p>
+    <w:p>
+      <w:pPr>
+        <w:spacing w:lineRule="auto" w:line="276" w:before="0" w:after="0"/>
+      </w:pPr>
+      <w:r>
+        <w:rPr>
+          <w:rFonts w:ascii="Arial" w:hAnsi="Arial" w:cs="Arial" w:eastAsia="Arial"/>
+          <w:b w:val="0"/>
+          <w:color w:val="000000"/>
+          <w:sz w:val="36"/>
+        </w:rPr>
+      </w:r>
+    </w:p>
+    <w:p>
+      <w:pPr>
+        <w:spacing w:lineRule="auto" w:line="276" w:before="0" w:after="0"/>
+      </w:pPr>
+      <w:r>
+        <w:rPr>
+          <w:rFonts w:ascii="Arial" w:hAnsi="Arial" w:cs="Arial" w:eastAsia="Arial"/>
+          <w:b w:val="0"/>
+          <w:color w:val="000000"/>
+          <w:sz w:val="36"/>
+        </w:rPr>
+        <w:t xml:space="preserve">-SO HOW MANY </w:t>
       </w:r>
       <w:r>
         <w:rPr>
@@ -6165,34 +6048,7 @@
           <w:color w:val="000000"/>
           <w:sz w:val="36"/>
         </w:rPr>
-        <w:t>.</w:t>
-      </w:r>
-    </w:p>
-    <w:p>
-      <w:pPr>
-        <w:spacing w:lineRule="auto" w:line="276" w:before="0" w:after="0"/>
-      </w:pPr>
-      <w:r>
-        <w:rPr>
-          <w:rFonts w:ascii="Arial" w:hAnsi="Arial" w:cs="Arial" w:eastAsia="Arial"/>
-          <w:b w:val="0"/>
-          <w:color w:val="000000"/>
-          <w:sz w:val="36"/>
-        </w:rPr>
-      </w:r>
-    </w:p>
-    <w:p>
-      <w:pPr>
-        <w:spacing w:lineRule="auto" w:line="276" w:before="0" w:after="0"/>
-      </w:pPr>
-      <w:r>
-        <w:rPr>
-          <w:rFonts w:ascii="Arial" w:hAnsi="Arial" w:cs="Arial" w:eastAsia="Arial"/>
-          <w:b w:val="0"/>
-          <w:color w:val="000000"/>
-          <w:sz w:val="36"/>
-        </w:rPr>
-        <w:t>-SO HOW MANY NUGGETS DO YOU THINK THE ROBOT ENDED UP ADDING???</w:t>
+        <w:t xml:space="preserve"> DO YOU THINK THE ROBOT ENDED UP ADDING???</w:t>
       </w:r>
     </w:p>
     <w:p>
@@ -6358,119 +6214,353 @@
       <w:r>
         <w:rPr>
           <w:rFonts w:ascii="Arial" w:hAnsi="Arial" w:cs="Arial" w:eastAsia="Arial"/>
-          <w:b w:val="0"/>
-          <w:color w:val="000000"/>
-          <w:sz w:val="36"/>
-        </w:rPr>
-        <w:t>-THAT AI WAS A TEST MCDONALD'S RAN WITH IBM, AT MORE THAN 100 DRIVE-THRUS.</w:t>
-      </w:r>
-    </w:p>
-    <w:p>
-      <w:pPr>
-        <w:spacing w:lineRule="auto" w:line="276" w:before="0" w:after="0"/>
-      </w:pPr>
-      <w:r>
-        <w:rPr>
-          <w:rFonts w:ascii="Arial" w:hAnsi="Arial" w:cs="Arial" w:eastAsia="Arial"/>
-          <w:b w:val="0"/>
-          <w:color w:val="000000"/>
-          <w:sz w:val="36"/>
-        </w:rPr>
-      </w:r>
-    </w:p>
-    <w:p>
-      <w:pPr>
-        <w:spacing w:lineRule="auto" w:line="276" w:before="0" w:after="0"/>
-      </w:pPr>
-      <w:r>
-        <w:rPr>
-          <w:rFonts w:ascii="Arial" w:hAnsi="Arial" w:cs="Arial" w:eastAsia="Arial"/>
-          <w:b w:val="0"/>
-          <w:color w:val="000000"/>
-          <w:sz w:val="36"/>
-        </w:rPr>
-        <w:t>-AND VIDEOS LIKE THAT ONE KEPT GOING VIRAL.</w:t>
-      </w:r>
-    </w:p>
-    <w:p>
-      <w:pPr>
-        <w:spacing w:lineRule="auto" w:line="276" w:before="0" w:after="0"/>
-      </w:pPr>
-      <w:r>
-        <w:rPr>
-          <w:rFonts w:ascii="Arial" w:hAnsi="Arial" w:cs="Arial" w:eastAsia="Arial"/>
-          <w:b w:val="0"/>
-          <w:color w:val="000000"/>
-          <w:sz w:val="36"/>
-        </w:rPr>
-      </w:r>
-    </w:p>
-    <w:p>
-      <w:pPr>
-        <w:spacing w:lineRule="auto" w:line="276" w:before="0" w:after="0"/>
-      </w:pPr>
-      <w:r>
-        <w:rPr>
-          <w:rFonts w:ascii="Arial" w:hAnsi="Arial" w:cs="Arial" w:eastAsia="Arial"/>
-          <w:b w:val="0"/>
-          <w:color w:val="000000"/>
-          <w:sz w:val="36"/>
-        </w:rPr>
-        <w:t>-CBS NEWS REPORTED SOME PEOPLE SAID IT GOT EVEN SIMPLE ORDERS WRONG.</w:t>
-      </w:r>
-    </w:p>
-    <w:p>
-      <w:pPr>
-        <w:spacing w:lineRule="auto" w:line="276" w:before="0" w:after="0"/>
-      </w:pPr>
-      <w:r>
-        <w:rPr>
-          <w:rFonts w:ascii="Arial" w:hAnsi="Arial" w:cs="Arial" w:eastAsia="Arial"/>
-          <w:b w:val="0"/>
-          <w:color w:val="000000"/>
-          <w:sz w:val="36"/>
-        </w:rPr>
-      </w:r>
-    </w:p>
-    <w:p>
-      <w:pPr>
-        <w:spacing w:lineRule="auto" w:line="276" w:before="0" w:after="0"/>
-      </w:pPr>
-      <w:r>
-        <w:rPr>
-          <w:rFonts w:ascii="Arial" w:hAnsi="Arial" w:cs="Arial" w:eastAsia="Arial"/>
-          <w:b w:val="0"/>
-          <w:color w:val="000000"/>
-          <w:sz w:val="36"/>
-        </w:rPr>
-        <w:t>-SO DID MCDONALD'S KEEP THE ROBOT... OR PULL IT???</w:t>
-      </w:r>
-    </w:p>
-    <w:p>
-      <w:pPr>
-        <w:spacing w:lineRule="auto" w:line="276" w:before="0" w:after="0"/>
-      </w:pPr>
-      <w:r>
-        <w:rPr>
-          <w:rFonts w:ascii="Arial" w:hAnsi="Arial" w:cs="Arial" w:eastAsia="Arial"/>
-          <w:b w:val="0"/>
-          <w:color w:val="000000"/>
-          <w:sz w:val="36"/>
-        </w:rPr>
-      </w:r>
-    </w:p>
-    <w:p>
-      <w:pPr>
-        <w:spacing w:lineRule="auto" w:line="276" w:before="0" w:after="0"/>
-      </w:pPr>
-      <w:r>
-        <w:rPr>
-          <w:rFonts w:ascii="Arial" w:hAnsi="Arial" w:cs="Arial" w:eastAsia="Arial"/>
-          <w:b w:val="0"/>
-          <w:color w:val="000000"/>
-          <w:sz w:val="36"/>
-        </w:rPr>
-        <w:t>-HERE'S WHAT HAPPENED. THIS IS WILD.</w:t>
+          <w:b/>
+          <w:color w:val="000000"/>
+          <w:sz w:val="46"/>
+        </w:rPr>
+        <w:t>AND IT'S NOT JUST MCDONALD'S... THE BIG CHAINS ARE ALL BRINGING PEOPLE BACK!!</w:t>
+      </w:r>
+    </w:p>
+    <w:p>
+      <w:pPr>
+        <w:spacing w:lineRule="auto" w:line="276" w:before="0" w:after="0"/>
+      </w:pPr>
+      <w:r>
+        <w:rPr>
+          <w:rFonts w:ascii="Arial" w:hAnsi="Arial" w:cs="Arial" w:eastAsia="Arial"/>
+          <w:b w:val="0"/>
+          <w:color w:val="000000"/>
+          <w:sz w:val="36"/>
+        </w:rPr>
+      </w:r>
+    </w:p>
+    <w:p>
+      <w:pPr>
+        <w:spacing w:lineRule="auto" w:line="276" w:before="0" w:after="0"/>
+      </w:pPr>
+      <w:r>
+        <w:rPr>
+          <w:rFonts w:ascii="Arial" w:hAnsi="Arial" w:cs="Arial" w:eastAsia="Arial"/>
+          <w:b w:val="0"/>
+          <w:color w:val="000000"/>
+          <w:sz w:val="36"/>
+        </w:rPr>
+        <w:t>-BURGER KING'S PRESIDENT, TOM CURTIS, TOLD THE WALL STREET JOURNAL PEOPLE WANT A HUMAN CONNECTION.</w:t>
+      </w:r>
+    </w:p>
+    <w:p>
+      <w:pPr>
+        <w:spacing w:lineRule="auto" w:line="276" w:before="0" w:after="0"/>
+      </w:pPr>
+      <w:r>
+        <w:rPr>
+          <w:rFonts w:ascii="Arial" w:hAnsi="Arial" w:cs="Arial" w:eastAsia="Arial"/>
+          <w:b w:val="0"/>
+          <w:color w:val="000000"/>
+          <w:sz w:val="36"/>
+        </w:rPr>
+      </w:r>
+    </w:p>
+    <w:p>
+      <w:pPr>
+        <w:spacing w:lineRule="auto" w:line="276" w:before="0" w:after="0"/>
+      </w:pPr>
+      <w:r>
+        <w:rPr>
+          <w:rFonts w:ascii="Arial" w:hAnsi="Arial" w:cs="Arial" w:eastAsia="Arial"/>
+          <w:b w:val="0"/>
+          <w:color w:val="000000"/>
+          <w:sz w:val="36"/>
+        </w:rPr>
+        <w:t>-AND I'M QUOTING HERE: "WE HAVE TO LEAN IN TO THAT BECAUSE THAT'S EVAPORATING IN THE FAST FOOD SPACE."</w:t>
+      </w:r>
+    </w:p>
+    <w:p>
+      <w:pPr>
+        <w:spacing w:lineRule="auto" w:line="276" w:before="0" w:after="0"/>
+      </w:pPr>
+      <w:r>
+        <w:rPr>
+          <w:rFonts w:ascii="Arial" w:hAnsi="Arial" w:cs="Arial" w:eastAsia="Arial"/>
+          <w:b w:val="0"/>
+          <w:color w:val="000000"/>
+          <w:sz w:val="36"/>
+        </w:rPr>
+      </w:r>
+    </w:p>
+    <w:p>
+      <w:pPr>
+        <w:spacing w:lineRule="auto" w:line="276" w:before="0" w:after="0"/>
+      </w:pPr>
+      <w:r>
+        <w:rPr>
+          <w:rFonts w:ascii="Arial" w:hAnsi="Arial" w:cs="Arial" w:eastAsia="Arial"/>
+          <w:b w:val="0"/>
+          <w:color w:val="000000"/>
+          <w:sz w:val="36"/>
+        </w:rPr>
+        <w:t>-BURGER KING SAYS IT'S MAKING IT EASIER TO ORDER FROM A REAL PERSON AT THE DRIVE-THRU.</w:t>
+      </w:r>
+    </w:p>
+    <w:p>
+      <w:pPr>
+        <w:spacing w:lineRule="auto" w:line="276" w:before="0" w:after="0"/>
+      </w:pPr>
+      <w:r>
+        <w:rPr>
+          <w:rFonts w:ascii="Arial" w:hAnsi="Arial" w:cs="Arial" w:eastAsia="Arial"/>
+          <w:b w:val="0"/>
+          <w:color w:val="000000"/>
+          <w:sz w:val="36"/>
+        </w:rPr>
+      </w:r>
+    </w:p>
+    <w:p>
+      <w:pPr>
+        <w:spacing w:lineRule="auto" w:line="276" w:before="0" w:after="0"/>
+      </w:pPr>
+      <w:r>
+        <w:rPr>
+          <w:rFonts w:ascii="Arial" w:hAnsi="Arial" w:cs="Arial" w:eastAsia="Arial"/>
+          <w:b w:val="0"/>
+          <w:color w:val="000000"/>
+          <w:sz w:val="36"/>
+        </w:rPr>
+        <w:t>-PORTILLO'S, THE CHICAGO HOT DOG CHAIN, NOW HAS WORKERS OUTSIDE TAKING YOUR DRIVE-THRU ORDER IN PERSON.</w:t>
+      </w:r>
+    </w:p>
+    <w:p>
+      <w:pPr>
+        <w:spacing w:lineRule="auto" w:line="276" w:before="0" w:after="0"/>
+      </w:pPr>
+      <w:r>
+        <w:rPr>
+          <w:rFonts w:ascii="Arial" w:hAnsi="Arial" w:cs="Arial" w:eastAsia="Arial"/>
+          <w:b w:val="0"/>
+          <w:color w:val="000000"/>
+          <w:sz w:val="36"/>
+        </w:rPr>
+      </w:r>
+    </w:p>
+    <w:p>
+      <w:pPr>
+        <w:spacing w:lineRule="auto" w:line="276" w:before="0" w:after="0"/>
+      </w:pPr>
+      <w:r>
+        <w:rPr>
+          <w:rFonts w:ascii="Arial" w:hAnsi="Arial" w:cs="Arial" w:eastAsia="Arial"/>
+          <w:b/>
+          <w:color w:val="000000"/>
+          <w:sz w:val="46"/>
+        </w:rPr>
+        <w:t>BUT THE BIGGEST TURNAROUND IS HAPPENING AT STARBUCKS!!</w:t>
+      </w:r>
+    </w:p>
+    <w:p>
+      <w:pPr>
+        <w:spacing w:lineRule="auto" w:line="276" w:before="0" w:after="0"/>
+      </w:pPr>
+      <w:r>
+        <w:rPr>
+          <w:rFonts w:ascii="Arial" w:hAnsi="Arial" w:cs="Arial" w:eastAsia="Arial"/>
+          <w:b w:val="0"/>
+          <w:color w:val="000000"/>
+          <w:sz w:val="36"/>
+        </w:rPr>
+      </w:r>
+    </w:p>
+    <w:p>
+      <w:pPr>
+        <w:spacing w:lineRule="auto" w:line="276" w:before="0" w:after="0"/>
+      </w:pPr>
+      <w:r>
+        <w:rPr>
+          <w:rFonts w:ascii="Arial" w:hAnsi="Arial" w:cs="Arial" w:eastAsia="Arial"/>
+          <w:b w:val="0"/>
+          <w:color w:val="000000"/>
+          <w:sz w:val="36"/>
+        </w:rPr>
+        <w:t xml:space="preserve">-STARBUCKS WAS ROLLING OUT NEW EQUIPMENT CALLED THE </w:t>
+      </w:r>
+      <w:r>
+        <w:rPr>
+          <w:rFonts w:ascii="Arial" w:hAnsi="Arial" w:cs="Arial" w:eastAsia="Arial"/>
+          <w:b/>
+          <w:color w:val="000000"/>
+          <w:sz w:val="36"/>
+        </w:rPr>
+        <w:t>SIREN CRAFT SYSTEM</w:t>
+      </w:r>
+      <w:r>
+        <w:rPr>
+          <w:rFonts w:ascii="Arial" w:hAnsi="Arial" w:cs="Arial" w:eastAsia="Arial"/>
+          <w:b w:val="0"/>
+          <w:color w:val="000000"/>
+          <w:sz w:val="36"/>
+        </w:rPr>
+        <w:t>, TO MAKE YOUR DRINK FASTER.</w:t>
+      </w:r>
+    </w:p>
+    <w:p>
+      <w:pPr>
+        <w:spacing w:lineRule="auto" w:line="276" w:before="0" w:after="0"/>
+      </w:pPr>
+      <w:r>
+        <w:rPr>
+          <w:rFonts w:ascii="Arial" w:hAnsi="Arial" w:cs="Arial" w:eastAsia="Arial"/>
+          <w:b w:val="0"/>
+          <w:color w:val="000000"/>
+          <w:sz w:val="36"/>
+        </w:rPr>
+      </w:r>
+    </w:p>
+    <w:p>
+      <w:pPr>
+        <w:spacing w:lineRule="auto" w:line="276" w:before="0" w:after="0"/>
+      </w:pPr>
+      <w:r>
+        <w:rPr>
+          <w:rFonts w:ascii="Arial" w:hAnsi="Arial" w:cs="Arial" w:eastAsia="Arial"/>
+          <w:b w:val="0"/>
+          <w:color w:val="000000"/>
+          <w:sz w:val="36"/>
+        </w:rPr>
+        <w:t>-THE PLAN WAS ABOUT 10,000 STORES.</w:t>
+      </w:r>
+    </w:p>
+    <w:p>
+      <w:pPr>
+        <w:spacing w:lineRule="auto" w:line="276" w:before="0" w:after="0"/>
+      </w:pPr>
+      <w:r>
+        <w:rPr>
+          <w:rFonts w:ascii="Arial" w:hAnsi="Arial" w:cs="Arial" w:eastAsia="Arial"/>
+          <w:b w:val="0"/>
+          <w:color w:val="000000"/>
+          <w:sz w:val="36"/>
+        </w:rPr>
+      </w:r>
+    </w:p>
+    <w:p>
+      <w:pPr>
+        <w:spacing w:lineRule="auto" w:line="276" w:before="0" w:after="0"/>
+      </w:pPr>
+      <w:r>
+        <w:rPr>
+          <w:rFonts w:ascii="Arial" w:hAnsi="Arial" w:cs="Arial" w:eastAsia="Arial"/>
+          <w:b w:val="0"/>
+          <w:color w:val="000000"/>
+          <w:sz w:val="36"/>
+        </w:rPr>
+        <w:t>-THEN CEO BRIAN NICCOL STOPPED IT.</w:t>
+      </w:r>
+    </w:p>
+    <w:p>
+      <w:pPr>
+        <w:spacing w:lineRule="auto" w:line="276" w:before="0" w:after="0"/>
+      </w:pPr>
+      <w:r>
+        <w:rPr>
+          <w:rFonts w:ascii="Arial" w:hAnsi="Arial" w:cs="Arial" w:eastAsia="Arial"/>
+          <w:b w:val="0"/>
+          <w:color w:val="000000"/>
+          <w:sz w:val="36"/>
+        </w:rPr>
+      </w:r>
+    </w:p>
+    <w:p>
+      <w:pPr>
+        <w:spacing w:lineRule="auto" w:line="276" w:before="0" w:after="0"/>
+      </w:pPr>
+      <w:r>
+        <w:rPr>
+          <w:rFonts w:ascii="Arial" w:hAnsi="Arial" w:cs="Arial" w:eastAsia="Arial"/>
+          <w:b w:val="0"/>
+          <w:color w:val="000000"/>
+          <w:sz w:val="36"/>
+        </w:rPr>
+        <w:t>-ACCORDING TO CBS NEWS, HE SAID THE EQUIPMENT DOESN'T SOLVE THE EXPERIENCE... STAFFING THE STORES DOES.</w:t>
+      </w:r>
+    </w:p>
+    <w:p>
+      <w:pPr>
+        <w:spacing w:lineRule="auto" w:line="276" w:before="0" w:after="0"/>
+      </w:pPr>
+      <w:r>
+        <w:rPr>
+          <w:rFonts w:ascii="Arial" w:hAnsi="Arial" w:cs="Arial" w:eastAsia="Arial"/>
+          <w:b w:val="0"/>
+          <w:color w:val="000000"/>
+          <w:sz w:val="36"/>
+        </w:rPr>
+      </w:r>
+    </w:p>
+    <w:p>
+      <w:pPr>
+        <w:spacing w:lineRule="auto" w:line="276" w:before="0" w:after="0"/>
+      </w:pPr>
+      <w:r>
+        <w:rPr>
+          <w:rFonts w:ascii="Arial" w:hAnsi="Arial" w:cs="Arial" w:eastAsia="Arial"/>
+          <w:b w:val="0"/>
+          <w:color w:val="000000"/>
+          <w:sz w:val="36"/>
+        </w:rPr>
+        <w:t>-SO STARBUCKS STARTED HIRING MORE BARISTAS AT THOUSANDS OF STORES INSTEAD.</w:t>
+      </w:r>
+    </w:p>
+    <w:p>
+      <w:pPr>
+        <w:spacing w:lineRule="auto" w:line="276" w:before="0" w:after="0"/>
+      </w:pPr>
+      <w:r>
+        <w:rPr>
+          <w:rFonts w:ascii="Arial" w:hAnsi="Arial" w:cs="Arial" w:eastAsia="Arial"/>
+          <w:b w:val="0"/>
+          <w:color w:val="000000"/>
+          <w:sz w:val="36"/>
+        </w:rPr>
+      </w:r>
+    </w:p>
+    <w:p>
+      <w:pPr>
+        <w:spacing w:lineRule="auto" w:line="276" w:before="0" w:after="0"/>
+      </w:pPr>
+      <w:r>
+        <w:rPr>
+          <w:rFonts w:ascii="Arial" w:hAnsi="Arial" w:cs="Arial" w:eastAsia="Arial"/>
+          <w:b w:val="0"/>
+          <w:color w:val="000000"/>
+          <w:sz w:val="36"/>
+        </w:rPr>
+        <w:t>-SO IS IT WORKING? ARE PEOPLE NOTICING THE DIFFERENCE???</w:t>
+      </w:r>
+    </w:p>
+    <w:p>
+      <w:pPr>
+        <w:spacing w:lineRule="auto" w:line="276" w:before="0" w:after="0"/>
+      </w:pPr>
+      <w:r>
+        <w:rPr>
+          <w:rFonts w:ascii="Arial" w:hAnsi="Arial" w:cs="Arial" w:eastAsia="Arial"/>
+          <w:b w:val="0"/>
+          <w:color w:val="000000"/>
+          <w:sz w:val="36"/>
+        </w:rPr>
+      </w:r>
+    </w:p>
+    <w:p>
+      <w:pPr>
+        <w:spacing w:lineRule="auto" w:line="276" w:before="0" w:after="0"/>
+      </w:pPr>
+      <w:r>
+        <w:rPr>
+          <w:rFonts w:ascii="Arial" w:hAnsi="Arial" w:cs="Arial" w:eastAsia="Arial"/>
+          <w:b w:val="0"/>
+          <w:color w:val="000000"/>
+          <w:sz w:val="36"/>
+        </w:rPr>
+        <w:t>-HERE'S NICCOL HIMSELF ON BLOOMBERG. CHECK THIS OUT.</w:t>
       </w:r>
     </w:p>
     <w:p>
@@ -6514,681 +6604,6 @@
         <w:t xml:space="preserve">((URL: </w:t>
       </w:r>
       <w:hyperlink r:id="rId15">
-        <w:r>
-          <w:rPr>
-            <w:color w:val="1155CC"/>
-            <w:u w:val="single"/>
-            <w:rFonts w:ascii="Arial" w:hAnsi="Arial" w:cs="Arial"/>
-            <w:sz w:val="36"/>
-          </w:rPr>
-          <w:t xml:space="preserve">STRAIGHT ARROW NEWS — MCDONALD'S ENDING ITS AI DRIVE-THRU TEST WITH IBM</w:t>
-        </w:r>
-      </w:hyperlink>
-      <w:r>
-        <w:rPr>
-          <w:rFonts w:ascii="Arial" w:hAnsi="Arial" w:cs="Arial" w:eastAsia="Arial"/>
-          <w:b/>
-          <w:color w:val="FF0000"/>
-          <w:sz w:val="36"/>
-        </w:rPr>
-        <w:t>))</w:t>
-      </w:r>
-    </w:p>
-    <w:p>
-      <w:pPr>
-        <w:spacing w:lineRule="auto" w:line="276" w:before="0" w:after="0"/>
-      </w:pPr>
-      <w:r>
-        <w:rPr>
-          <w:rFonts w:ascii="Arial" w:hAnsi="Arial" w:cs="Arial" w:eastAsia="Arial"/>
-          <w:b/>
-          <w:color w:val="FF0000"/>
-          <w:sz w:val="36"/>
-        </w:rPr>
-        <w:t>OUT:</w:t>
-      </w:r>
-    </w:p>
-    <w:p>
-      <w:pPr>
-        <w:spacing w:lineRule="auto" w:line="276" w:before="0" w:after="0"/>
-      </w:pPr>
-      <w:r>
-        <w:rPr>
-          <w:rFonts w:ascii="Arial" w:hAnsi="Arial" w:cs="Arial" w:eastAsia="Arial"/>
-          <w:b w:val="0"/>
-          <w:color w:val="000000"/>
-          <w:sz w:val="36"/>
-        </w:rPr>
-      </w:r>
-    </w:p>
-    <w:p>
-      <w:pPr>
-        <w:spacing w:lineRule="auto" w:line="276" w:before="0" w:after="0"/>
-      </w:pPr>
-      <w:r>
-        <w:rPr>
-          <w:rFonts w:ascii="Arial" w:hAnsi="Arial" w:cs="Arial" w:eastAsia="Arial"/>
-          <w:b w:val="0"/>
-          <w:color w:val="000000"/>
-          <w:sz w:val="36"/>
-        </w:rPr>
-        <w:t>-THEY PULLED THE PLUG. THE ROBOT WAS SWITCHED OFF IN ALL OF THOSE RESTAURANTS BY THE END OF JULY 2024.</w:t>
-      </w:r>
-    </w:p>
-    <w:p>
-      <w:pPr>
-        <w:spacing w:lineRule="auto" w:line="276" w:before="0" w:after="0"/>
-      </w:pPr>
-      <w:r>
-        <w:rPr>
-          <w:rFonts w:ascii="Arial" w:hAnsi="Arial" w:cs="Arial" w:eastAsia="Arial"/>
-          <w:b w:val="0"/>
-          <w:color w:val="000000"/>
-          <w:sz w:val="36"/>
-        </w:rPr>
-      </w:r>
-    </w:p>
-    <w:p>
-      <w:pPr>
-        <w:spacing w:lineRule="auto" w:line="276" w:before="0" w:after="0"/>
-      </w:pPr>
-      <w:r>
-        <w:rPr>
-          <w:rFonts w:ascii="Arial" w:hAnsi="Arial" w:cs="Arial" w:eastAsia="Arial"/>
-          <w:b w:val="0"/>
-          <w:color w:val="000000"/>
-          <w:sz w:val="36"/>
-        </w:rPr>
-        <w:t>-NOW, IN FAIRNESS, MCDONALD'S IS STILL TESTING NEW AI. THE ROBOTS AREN'T GONE FOR GOOD.</w:t>
-      </w:r>
-    </w:p>
-    <w:p>
-      <w:pPr>
-        <w:spacing w:lineRule="auto" w:line="276" w:before="0" w:after="0"/>
-      </w:pPr>
-      <w:r>
-        <w:rPr>
-          <w:rFonts w:ascii="Arial" w:hAnsi="Arial" w:cs="Arial" w:eastAsia="Arial"/>
-          <w:b w:val="0"/>
-          <w:color w:val="000000"/>
-          <w:sz w:val="36"/>
-        </w:rPr>
-      </w:r>
-    </w:p>
-    <w:p>
-      <w:pPr>
-        <w:spacing w:lineRule="auto" w:line="276" w:before="0" w:after="0"/>
-      </w:pPr>
-      <w:r>
-        <w:rPr>
-          <w:rFonts w:ascii="Arial" w:hAnsi="Arial" w:cs="Arial" w:eastAsia="Arial"/>
-          <w:b w:val="0"/>
-          <w:color w:val="000000"/>
-          <w:sz w:val="36"/>
-        </w:rPr>
-        <w:t>-BUT THIS FALL, THE BIG BET IS ON THE PEOPLE BEHIND THE COUNTER.</w:t>
-      </w:r>
-    </w:p>
-    <w:p>
-      <w:pPr>
-        <w:spacing w:lineRule="auto" w:line="276" w:before="0" w:after="0"/>
-      </w:pPr>
-      <w:r>
-        <w:rPr>
-          <w:rFonts w:ascii="Arial" w:hAnsi="Arial" w:cs="Arial" w:eastAsia="Arial"/>
-          <w:b w:val="0"/>
-          <w:color w:val="000000"/>
-          <w:sz w:val="36"/>
-        </w:rPr>
-      </w:r>
-    </w:p>
-    <w:p>
-      <w:pPr>
-        <w:spacing w:lineRule="auto" w:line="276" w:before="0" w:after="0"/>
-      </w:pPr>
-      <w:r>
-        <w:rPr>
-          <w:rFonts w:ascii="Arial" w:hAnsi="Arial" w:cs="Arial" w:eastAsia="Arial"/>
-          <w:b/>
-          <w:color w:val="000000"/>
-          <w:sz w:val="46"/>
-        </w:rPr>
-        <w:t>AND IT'S NOT JUST MCDONALD'S... THE OTHER CHAINS ARE ADMITTING IT TOO!!</w:t>
-      </w:r>
-    </w:p>
-    <w:p>
-      <w:pPr>
-        <w:spacing w:lineRule="auto" w:line="276" w:before="0" w:after="0"/>
-      </w:pPr>
-      <w:r>
-        <w:rPr>
-          <w:rFonts w:ascii="Arial" w:hAnsi="Arial" w:cs="Arial" w:eastAsia="Arial"/>
-          <w:b w:val="0"/>
-          <w:color w:val="000000"/>
-          <w:sz w:val="36"/>
-        </w:rPr>
-      </w:r>
-    </w:p>
-    <w:p>
-      <w:pPr>
-        <w:spacing w:lineRule="auto" w:line="276" w:before="0" w:after="0"/>
-      </w:pPr>
-      <w:r>
-        <w:rPr>
-          <w:rFonts w:ascii="Arial" w:hAnsi="Arial" w:cs="Arial" w:eastAsia="Arial"/>
-          <w:b w:val="0"/>
-          <w:color w:val="000000"/>
-          <w:sz w:val="36"/>
-        </w:rPr>
-        <w:t>-CHAKRI SOMISETTI RUNS BRAND TECHNOLOGIES AT BURGER KING.</w:t>
-      </w:r>
-    </w:p>
-    <w:p>
-      <w:pPr>
-        <w:spacing w:lineRule="auto" w:line="276" w:before="0" w:after="0"/>
-      </w:pPr>
-      <w:r>
-        <w:rPr>
-          <w:rFonts w:ascii="Arial" w:hAnsi="Arial" w:cs="Arial" w:eastAsia="Arial"/>
-          <w:b w:val="0"/>
-          <w:color w:val="000000"/>
-          <w:sz w:val="36"/>
-        </w:rPr>
-      </w:r>
-    </w:p>
-    <w:p>
-      <w:pPr>
-        <w:spacing w:lineRule="auto" w:line="276" w:before="0" w:after="0"/>
-      </w:pPr>
-      <w:r>
-        <w:rPr>
-          <w:rFonts w:ascii="Arial" w:hAnsi="Arial" w:cs="Arial" w:eastAsia="Arial"/>
-          <w:b w:val="0"/>
-          <w:color w:val="000000"/>
-          <w:sz w:val="36"/>
-        </w:rPr>
-        <w:t>-LAST MONTH, AT AN INDUSTRY CONFERENCE, HE SAID SOME OF THEIR TEST RESTAURANTS SAW, AND I'M QUOTING HERE...</w:t>
-      </w:r>
-    </w:p>
-    <w:p>
-      <w:pPr>
-        <w:spacing w:lineRule="auto" w:line="276" w:before="0" w:after="0"/>
-      </w:pPr>
-      <w:r>
-        <w:rPr>
-          <w:rFonts w:ascii="Arial" w:hAnsi="Arial" w:cs="Arial" w:eastAsia="Arial"/>
-          <w:b w:val="0"/>
-          <w:color w:val="000000"/>
-          <w:sz w:val="36"/>
-        </w:rPr>
-      </w:r>
-    </w:p>
-    <w:p>
-      <w:pPr>
-        <w:spacing w:lineRule="auto" w:line="276" w:before="0" w:after="0"/>
-      </w:pPr>
-      <w:r>
-        <w:rPr>
-          <w:rFonts w:ascii="Arial" w:hAnsi="Arial" w:cs="Arial" w:eastAsia="Arial"/>
-          <w:b w:val="0"/>
-          <w:color w:val="000000"/>
-          <w:sz w:val="36"/>
-        </w:rPr>
-        <w:t>-"DRIVE OFFS BECAUSE GUESTS DON'T WANT TO TALK TO A BOT."</w:t>
-      </w:r>
-    </w:p>
-    <w:p>
-      <w:pPr>
-        <w:spacing w:lineRule="auto" w:line="276" w:before="0" w:after="0"/>
-      </w:pPr>
-      <w:r>
-        <w:rPr>
-          <w:rFonts w:ascii="Arial" w:hAnsi="Arial" w:cs="Arial" w:eastAsia="Arial"/>
-          <w:b/>
-          <w:color w:val="FF0000"/>
-          <w:sz w:val="36"/>
-        </w:rPr>
-        <w:t>(((TAKE FULLSCREEN - SOMISETTI QUOTE)))</w:t>
-      </w:r>
-    </w:p>
-    <w:p>
-      <w:pPr>
-        <w:spacing w:lineRule="auto" w:line="276" w:before="0" w:after="0"/>
-      </w:pPr>
-      <w:r>
-        <w:rPr>
-          <w:rFonts w:ascii="Arial" w:hAnsi="Arial" w:cs="Arial" w:eastAsia="Arial"/>
-          <w:b w:val="0"/>
-          <w:color w:val="FF0000"/>
-          <w:sz w:val="36"/>
-        </w:rPr>
-        <w:t>"DRIVE OFFS BECAUSE GUESTS DON'T WANT TO TALK TO A BOT."</w:t>
-      </w:r>
-    </w:p>
-    <w:p>
-      <w:pPr>
-        <w:spacing w:lineRule="auto" w:line="276" w:before="0" w:after="0"/>
-      </w:pPr>
-      <w:r>
-        <w:rPr>
-          <w:rFonts w:ascii="Arial" w:hAnsi="Arial" w:cs="Arial" w:eastAsia="Arial"/>
-          <w:b w:val="0"/>
-          <w:color w:val="FF0000"/>
-          <w:sz w:val="36"/>
-        </w:rPr>
-        <w:t>CHAKRI SOMISETTI, BURGER KING, SEPT. 2026</w:t>
-      </w:r>
-    </w:p>
-    <w:p>
-      <w:pPr>
-        <w:spacing w:lineRule="auto" w:line="276" w:before="0" w:after="0"/>
-      </w:pPr>
-      <w:r>
-        <w:rPr>
-          <w:rFonts w:ascii="Arial" w:hAnsi="Arial" w:cs="Arial" w:eastAsia="Arial"/>
-          <w:b w:val="0"/>
-          <w:color w:val="000000"/>
-          <w:sz w:val="36"/>
-        </w:rPr>
-      </w:r>
-    </w:p>
-    <w:p>
-      <w:pPr>
-        <w:spacing w:lineRule="auto" w:line="276" w:before="0" w:after="0"/>
-      </w:pPr>
-      <w:r>
-        <w:rPr>
-          <w:rFonts w:ascii="Arial" w:hAnsi="Arial" w:cs="Arial" w:eastAsia="Arial"/>
-          <w:b w:val="0"/>
-          <w:color w:val="000000"/>
-          <w:sz w:val="36"/>
-        </w:rPr>
-        <w:t>-PEOPLE LITERALLY DROVE AWAY RATHER THAN ORDER FROM THE ROBOT!!</w:t>
-      </w:r>
-    </w:p>
-    <w:p>
-      <w:pPr>
-        <w:spacing w:lineRule="auto" w:line="276" w:before="0" w:after="0"/>
-      </w:pPr>
-      <w:r>
-        <w:rPr>
-          <w:rFonts w:ascii="Arial" w:hAnsi="Arial" w:cs="Arial" w:eastAsia="Arial"/>
-          <w:b w:val="0"/>
-          <w:color w:val="000000"/>
-          <w:sz w:val="36"/>
-        </w:rPr>
-      </w:r>
-    </w:p>
-    <w:p>
-      <w:pPr>
-        <w:spacing w:lineRule="auto" w:line="276" w:before="0" w:after="0"/>
-      </w:pPr>
-      <w:r>
-        <w:rPr>
-          <w:rFonts w:ascii="Arial" w:hAnsi="Arial" w:cs="Arial" w:eastAsia="Arial"/>
-          <w:b w:val="0"/>
-          <w:color w:val="000000"/>
-          <w:sz w:val="36"/>
-        </w:rPr>
-        <w:t>-NOW BURGER KING SAYS IT'S MAKING IT EASY TO ORDER FROM A REAL PERSON, IF THAT'S WHAT YOU WANT.</w:t>
-      </w:r>
-    </w:p>
-    <w:p>
-      <w:pPr>
-        <w:spacing w:lineRule="auto" w:line="276" w:before="0" w:after="0"/>
-      </w:pPr>
-      <w:r>
-        <w:rPr>
-          <w:rFonts w:ascii="Arial" w:hAnsi="Arial" w:cs="Arial" w:eastAsia="Arial"/>
-          <w:b w:val="0"/>
-          <w:color w:val="000000"/>
-          <w:sz w:val="36"/>
-        </w:rPr>
-      </w:r>
-    </w:p>
-    <w:p>
-      <w:pPr>
-        <w:spacing w:lineRule="auto" w:line="276" w:before="0" w:after="0"/>
-      </w:pPr>
-      <w:r>
-        <w:rPr>
-          <w:rFonts w:ascii="Arial" w:hAnsi="Arial" w:cs="Arial" w:eastAsia="Arial"/>
-          <w:b w:val="0"/>
-          <w:color w:val="000000"/>
-          <w:sz w:val="36"/>
-        </w:rPr>
-        <w:t>-AND AT TACO BELL, SOMEBODY ORDERED 18,000 CUPS OF WATER FROM THE AI.</w:t>
-      </w:r>
-    </w:p>
-    <w:p>
-      <w:pPr>
-        <w:spacing w:lineRule="auto" w:line="276" w:before="0" w:after="0"/>
-      </w:pPr>
-      <w:r>
-        <w:rPr>
-          <w:rFonts w:ascii="Arial" w:hAnsi="Arial" w:cs="Arial" w:eastAsia="Arial"/>
-          <w:b w:val="0"/>
-          <w:color w:val="000000"/>
-          <w:sz w:val="36"/>
-        </w:rPr>
-      </w:r>
-    </w:p>
-    <w:p>
-      <w:pPr>
-        <w:spacing w:lineRule="auto" w:line="276" w:before="0" w:after="0"/>
-      </w:pPr>
-      <w:r>
-        <w:rPr>
-          <w:rFonts w:ascii="Arial" w:hAnsi="Arial" w:cs="Arial" w:eastAsia="Arial"/>
-          <w:b w:val="0"/>
-          <w:color w:val="000000"/>
-          <w:sz w:val="36"/>
-        </w:rPr>
-        <w:t>-AFTER THAT, TACO BELL'S OWN TECH CHIEF TOLD THE WALL STREET JOURNAL THAT AT ITS BUSIEST RESTAURANTS, A HUMAN MIGHT DO IT BETTER.</w:t>
-      </w:r>
-    </w:p>
-    <w:p>
-      <w:pPr>
-        <w:spacing w:lineRule="auto" w:line="276" w:before="0" w:after="0"/>
-      </w:pPr>
-      <w:r>
-        <w:rPr>
-          <w:rFonts w:ascii="Arial" w:hAnsi="Arial" w:cs="Arial" w:eastAsia="Arial"/>
-          <w:b w:val="0"/>
-          <w:color w:val="000000"/>
-          <w:sz w:val="36"/>
-        </w:rPr>
-      </w:r>
-    </w:p>
-    <w:p>
-      <w:pPr>
-        <w:spacing w:lineRule="auto" w:line="276" w:before="0" w:after="0"/>
-      </w:pPr>
-      <w:r>
-        <w:rPr>
-          <w:rFonts w:ascii="Arial" w:hAnsi="Arial" w:cs="Arial" w:eastAsia="Arial"/>
-          <w:b w:val="0"/>
-          <w:color w:val="000000"/>
-          <w:sz w:val="36"/>
-        </w:rPr>
-        <w:t>-TO BE CLEAR, TACO BELL STILL HAS AI IN ABOUT 900 DRIVE-THRUS. BUT EVEN THEY SAY IT'S NOT RIGHT FOR EVERY RESTAURANT.</w:t>
-      </w:r>
-    </w:p>
-    <w:p>
-      <w:pPr>
-        <w:spacing w:lineRule="auto" w:line="276" w:before="0" w:after="0"/>
-      </w:pPr>
-      <w:r>
-        <w:rPr>
-          <w:rFonts w:ascii="Arial" w:hAnsi="Arial" w:cs="Arial" w:eastAsia="Arial"/>
-          <w:b w:val="0"/>
-          <w:color w:val="000000"/>
-          <w:sz w:val="36"/>
-        </w:rPr>
-      </w:r>
-    </w:p>
-    <w:p>
-      <w:pPr>
-        <w:spacing w:lineRule="auto" w:line="276" w:before="0" w:after="0"/>
-      </w:pPr>
-      <w:r>
-        <w:rPr>
-          <w:rFonts w:ascii="Arial" w:hAnsi="Arial" w:cs="Arial" w:eastAsia="Arial"/>
-          <w:b/>
-          <w:color w:val="000000"/>
-          <w:sz w:val="46"/>
-        </w:rPr>
-        <w:t>BUT THE BIGGEST TURNAROUND OF ALL IS HAPPENING AT STARBUCKS!!</w:t>
-      </w:r>
-    </w:p>
-    <w:p>
-      <w:pPr>
-        <w:spacing w:lineRule="auto" w:line="276" w:before="0" w:after="0"/>
-      </w:pPr>
-      <w:r>
-        <w:rPr>
-          <w:rFonts w:ascii="Arial" w:hAnsi="Arial" w:cs="Arial" w:eastAsia="Arial"/>
-          <w:b w:val="0"/>
-          <w:color w:val="000000"/>
-          <w:sz w:val="36"/>
-        </w:rPr>
-      </w:r>
-    </w:p>
-    <w:p>
-      <w:pPr>
-        <w:spacing w:lineRule="auto" w:line="276" w:before="0" w:after="0"/>
-      </w:pPr>
-      <w:r>
-        <w:rPr>
-          <w:rFonts w:ascii="Arial" w:hAnsi="Arial" w:cs="Arial" w:eastAsia="Arial"/>
-          <w:b w:val="0"/>
-          <w:color w:val="000000"/>
-          <w:sz w:val="36"/>
-        </w:rPr>
-        <w:t xml:space="preserve">-IN 2024, STARBUCKS STARTED ROLLING OUT NEW EQUIPMENT CALLED THE </w:t>
-      </w:r>
-      <w:r>
-        <w:rPr>
-          <w:rFonts w:ascii="Arial" w:hAnsi="Arial" w:cs="Arial" w:eastAsia="Arial"/>
-          <w:b/>
-          <w:color w:val="000000"/>
-          <w:sz w:val="36"/>
-        </w:rPr>
-        <w:t>SIREN CRAFT SYSTEM</w:t>
-      </w:r>
-      <w:r>
-        <w:rPr>
-          <w:rFonts w:ascii="Arial" w:hAnsi="Arial" w:cs="Arial" w:eastAsia="Arial"/>
-          <w:b w:val="0"/>
-          <w:color w:val="000000"/>
-          <w:sz w:val="36"/>
-        </w:rPr>
-        <w:t>, TO MAKE YOUR DRINK FASTER.</w:t>
-      </w:r>
-    </w:p>
-    <w:p>
-      <w:pPr>
-        <w:spacing w:lineRule="auto" w:line="276" w:before="0" w:after="0"/>
-      </w:pPr>
-      <w:r>
-        <w:rPr>
-          <w:rFonts w:ascii="Arial" w:hAnsi="Arial" w:cs="Arial" w:eastAsia="Arial"/>
-          <w:b w:val="0"/>
-          <w:color w:val="000000"/>
-          <w:sz w:val="36"/>
-        </w:rPr>
-      </w:r>
-    </w:p>
-    <w:p>
-      <w:pPr>
-        <w:spacing w:lineRule="auto" w:line="276" w:before="0" w:after="0"/>
-      </w:pPr>
-      <w:r>
-        <w:rPr>
-          <w:rFonts w:ascii="Arial" w:hAnsi="Arial" w:cs="Arial" w:eastAsia="Arial"/>
-          <w:b w:val="0"/>
-          <w:color w:val="000000"/>
-          <w:sz w:val="36"/>
-        </w:rPr>
-        <w:t>-THE PLAN WAS TO PUT IT IN ABOUT 10,000 STORES.</w:t>
-      </w:r>
-    </w:p>
-    <w:p>
-      <w:pPr>
-        <w:spacing w:lineRule="auto" w:line="276" w:before="0" w:after="0"/>
-      </w:pPr>
-      <w:r>
-        <w:rPr>
-          <w:rFonts w:ascii="Arial" w:hAnsi="Arial" w:cs="Arial" w:eastAsia="Arial"/>
-          <w:b w:val="0"/>
-          <w:color w:val="000000"/>
-          <w:sz w:val="36"/>
-        </w:rPr>
-      </w:r>
-    </w:p>
-    <w:p>
-      <w:pPr>
-        <w:spacing w:lineRule="auto" w:line="276" w:before="0" w:after="0"/>
-      </w:pPr>
-      <w:r>
-        <w:rPr>
-          <w:rFonts w:ascii="Arial" w:hAnsi="Arial" w:cs="Arial" w:eastAsia="Arial"/>
-          <w:b w:val="0"/>
-          <w:color w:val="000000"/>
-          <w:sz w:val="36"/>
-        </w:rPr>
-        <w:t>-THEN THE NEW CEO, BRIAN NICCOL, HIT THE BRAKES.</w:t>
-      </w:r>
-    </w:p>
-    <w:p>
-      <w:pPr>
-        <w:spacing w:lineRule="auto" w:line="276" w:before="0" w:after="0"/>
-      </w:pPr>
-      <w:r>
-        <w:rPr>
-          <w:rFonts w:ascii="Arial" w:hAnsi="Arial" w:cs="Arial" w:eastAsia="Arial"/>
-          <w:b w:val="0"/>
-          <w:color w:val="000000"/>
-          <w:sz w:val="36"/>
-        </w:rPr>
-      </w:r>
-    </w:p>
-    <w:p>
-      <w:pPr>
-        <w:spacing w:lineRule="auto" w:line="276" w:before="0" w:after="0"/>
-      </w:pPr>
-      <w:r>
-        <w:rPr>
-          <w:rFonts w:ascii="Arial" w:hAnsi="Arial" w:cs="Arial" w:eastAsia="Arial"/>
-          <w:b w:val="0"/>
-          <w:color w:val="000000"/>
-          <w:sz w:val="36"/>
-        </w:rPr>
-        <w:t>-ACCORDING TO CBS NEWS, HE SAID THE EQUIPMENT DOESN'T SOLVE THE EXPERIENCE... STAFFING THE STORES DOES.</w:t>
-      </w:r>
-    </w:p>
-    <w:p>
-      <w:pPr>
-        <w:spacing w:lineRule="auto" w:line="276" w:before="0" w:after="0"/>
-      </w:pPr>
-      <w:r>
-        <w:rPr>
-          <w:rFonts w:ascii="Arial" w:hAnsi="Arial" w:cs="Arial" w:eastAsia="Arial"/>
-          <w:b w:val="0"/>
-          <w:color w:val="000000"/>
-          <w:sz w:val="36"/>
-        </w:rPr>
-      </w:r>
-    </w:p>
-    <w:p>
-      <w:pPr>
-        <w:spacing w:lineRule="auto" w:line="276" w:before="0" w:after="0"/>
-      </w:pPr>
-      <w:r>
-        <w:rPr>
-          <w:rFonts w:ascii="Arial" w:hAnsi="Arial" w:cs="Arial" w:eastAsia="Arial"/>
-          <w:b w:val="0"/>
-          <w:color w:val="000000"/>
-          <w:sz w:val="36"/>
-        </w:rPr>
-        <w:t>-SO INSTEAD OF MORE MACHINES, STARBUCKS STARTED HIRING MORE BARISTAS AT THOUSANDS OF STORES.</w:t>
-      </w:r>
-    </w:p>
-    <w:p>
-      <w:pPr>
-        <w:spacing w:lineRule="auto" w:line="276" w:before="0" w:after="0"/>
-      </w:pPr>
-      <w:r>
-        <w:rPr>
-          <w:rFonts w:ascii="Arial" w:hAnsi="Arial" w:cs="Arial" w:eastAsia="Arial"/>
-          <w:b w:val="0"/>
-          <w:color w:val="000000"/>
-          <w:sz w:val="36"/>
-        </w:rPr>
-      </w:r>
-    </w:p>
-    <w:p>
-      <w:pPr>
-        <w:spacing w:lineRule="auto" w:line="276" w:before="0" w:after="0"/>
-      </w:pPr>
-      <w:r>
-        <w:rPr>
-          <w:rFonts w:ascii="Arial" w:hAnsi="Arial" w:cs="Arial" w:eastAsia="Arial"/>
-          <w:b w:val="0"/>
-          <w:color w:val="000000"/>
-          <w:sz w:val="36"/>
-        </w:rPr>
-        <w:t>-SO DID PEOPLE ACTUALLY NOTICE THE DIFFERENCE???</w:t>
-      </w:r>
-    </w:p>
-    <w:p>
-      <w:pPr>
-        <w:spacing w:lineRule="auto" w:line="276" w:before="0" w:after="0"/>
-      </w:pPr>
-      <w:r>
-        <w:rPr>
-          <w:rFonts w:ascii="Arial" w:hAnsi="Arial" w:cs="Arial" w:eastAsia="Arial"/>
-          <w:b w:val="0"/>
-          <w:color w:val="000000"/>
-          <w:sz w:val="36"/>
-        </w:rPr>
-      </w:r>
-    </w:p>
-    <w:p>
-      <w:pPr>
-        <w:spacing w:lineRule="auto" w:line="276" w:before="0" w:after="0"/>
-      </w:pPr>
-      <w:r>
-        <w:rPr>
-          <w:rFonts w:ascii="Arial" w:hAnsi="Arial" w:cs="Arial" w:eastAsia="Arial"/>
-          <w:b w:val="0"/>
-          <w:color w:val="000000"/>
-          <w:sz w:val="36"/>
-        </w:rPr>
-        <w:t>-HERE'S NICCOL HIMSELF ON BLOOMBERG. CHECK THIS OUT.</w:t>
-      </w:r>
-    </w:p>
-    <w:p>
-      <w:pPr>
-        <w:spacing w:lineRule="auto" w:line="276" w:before="0" w:after="0"/>
-      </w:pPr>
-      <w:r>
-        <w:rPr>
-          <w:rFonts w:ascii="Arial" w:hAnsi="Arial" w:cs="Arial" w:eastAsia="Arial"/>
-          <w:b w:val="0"/>
-          <w:color w:val="000000"/>
-          <w:sz w:val="36"/>
-        </w:rPr>
-      </w:r>
-    </w:p>
-    <w:p>
-      <w:pPr>
-        <w:spacing w:lineRule="auto" w:line="276" w:before="0" w:after="0"/>
-      </w:pPr>
-      <w:r>
-        <w:rPr>
-          <w:rFonts w:ascii="Arial" w:hAnsi="Arial" w:cs="Arial" w:eastAsia="Arial"/>
-          <w:b/>
-          <w:color w:val="FF0000"/>
-          <w:sz w:val="36"/>
-        </w:rPr>
-        <w:t>(((PLAY CLIP 8 HORIZONTAL)))</w:t>
-      </w:r>
-    </w:p>
-    <w:p>
-      <w:pPr>
-        <w:spacing w:lineRule="auto" w:line="276" w:before="0" w:after="0"/>
-      </w:pPr>
-      <w:r>
-        <w:rPr>
-          <w:rFonts w:ascii="Arial" w:hAnsi="Arial" w:cs="Arial" w:eastAsia="Arial"/>
-          <w:b/>
-          <w:color w:val="FF0000"/>
-          <w:sz w:val="36"/>
-        </w:rPr>
-        <w:t xml:space="preserve">((URL: </w:t>
-      </w:r>
-      <w:hyperlink r:id="rId16">
         <w:r>
           <w:rPr>
             <w:color w:val="1155CC"/>
@@ -7247,7 +6662,61 @@
           <w:color w:val="000000"/>
           <w:sz w:val="36"/>
         </w:rPr>
-        <w:t>-MORE BARISTAS INSTEAD OF MORE MACHINES. THAT'S THE WHOLE TURNAROUND PLAN!!</w:t>
+        <w:t>-MORE BARISTAS INSTEAD OF MORE MACHINES!!</w:t>
+      </w:r>
+    </w:p>
+    <w:p>
+      <w:pPr>
+        <w:spacing w:lineRule="auto" w:line="276" w:before="0" w:after="0"/>
+      </w:pPr>
+      <w:r>
+        <w:rPr>
+          <w:rFonts w:ascii="Arial" w:hAnsi="Arial" w:cs="Arial" w:eastAsia="Arial"/>
+          <w:b w:val="0"/>
+          <w:color w:val="000000"/>
+          <w:sz w:val="36"/>
+        </w:rPr>
+      </w:r>
+    </w:p>
+    <w:p>
+      <w:pPr>
+        <w:spacing w:lineRule="auto" w:line="276" w:before="0" w:after="0"/>
+      </w:pPr>
+      <w:r>
+        <w:rPr>
+          <w:rFonts w:ascii="Arial" w:hAnsi="Arial" w:cs="Arial" w:eastAsia="Arial"/>
+          <w:b w:val="0"/>
+          <w:color w:val="000000"/>
+          <w:sz w:val="36"/>
+        </w:rPr>
+        <w:t>-AFTER YEARS OF "MORE TECHNOLOGY," THESE COMPANIES ARE ADMITTING IT... SOMETIMES YOU JUST WANT TO TALK TO A PERSON.</w:t>
+      </w:r>
+    </w:p>
+    <w:p>
+      <w:pPr>
+        <w:spacing w:lineRule="auto" w:line="276" w:before="0" w:after="0"/>
+      </w:pPr>
+      <w:r>
+        <w:rPr>
+          <w:rFonts w:ascii="Arial" w:hAnsi="Arial" w:cs="Arial" w:eastAsia="Arial"/>
+          <w:b w:val="0"/>
+          <w:color w:val="000000"/>
+          <w:sz w:val="36"/>
+        </w:rPr>
+      </w:r>
+    </w:p>
+    <w:p>
+      <w:pPr>
+        <w:spacing w:lineRule="auto" w:line="276" w:before="0" w:after="0"/>
+      </w:pPr>
+      <w:r>
+        <w:rPr>
+          <w:rFonts w:ascii="Arial" w:hAnsi="Arial" w:cs="Arial" w:eastAsia="Arial"/>
+          <w:b w:val="0"/>
+          <w:color w:val="000000"/>
+          <w:sz w:val="36"/>
+        </w:rPr>
+        <w:t>YOUR FEEDBACK WAS HEARD, AND IT MADE A DIFFERENCE!!</w:t>
       </w:r>
     </w:p>
     <w:p>
@@ -7274,114 +6743,6 @@
           <w:color w:val="000000"/>
           <w:sz w:val="46"/>
         </w:rPr>
-        <w:t>AND THIS IS PROOF YOUR COMPLAINTS ACTUALLY GOT HEARD!!</w:t>
-      </w:r>
-    </w:p>
-    <w:p>
-      <w:pPr>
-        <w:spacing w:lineRule="auto" w:line="276" w:before="0" w:after="0"/>
-      </w:pPr>
-      <w:r>
-        <w:rPr>
-          <w:rFonts w:ascii="Arial" w:hAnsi="Arial" w:cs="Arial" w:eastAsia="Arial"/>
-          <w:b w:val="0"/>
-          <w:color w:val="000000"/>
-          <w:sz w:val="36"/>
-        </w:rPr>
-      </w:r>
-    </w:p>
-    <w:p>
-      <w:pPr>
-        <w:spacing w:lineRule="auto" w:line="276" w:before="0" w:after="0"/>
-      </w:pPr>
-      <w:r>
-        <w:rPr>
-          <w:rFonts w:ascii="Arial" w:hAnsi="Arial" w:cs="Arial" w:eastAsia="Arial"/>
-          <w:b w:val="0"/>
-          <w:color w:val="000000"/>
-          <w:sz w:val="36"/>
-        </w:rPr>
-        <w:t>-GARTNER, A RESEARCH FIRM, FOUND 87% OF PEOPLE WANT TO BE ABLE TO REACH A HUMAN. 87%.</w:t>
-      </w:r>
-    </w:p>
-    <w:p>
-      <w:pPr>
-        <w:spacing w:lineRule="auto" w:line="276" w:before="0" w:after="0"/>
-      </w:pPr>
-      <w:r>
-        <w:rPr>
-          <w:rFonts w:ascii="Arial" w:hAnsi="Arial" w:cs="Arial" w:eastAsia="Arial"/>
-          <w:b w:val="0"/>
-          <w:color w:val="000000"/>
-          <w:sz w:val="36"/>
-        </w:rPr>
-      </w:r>
-    </w:p>
-    <w:p>
-      <w:pPr>
-        <w:spacing w:lineRule="auto" w:line="276" w:before="0" w:after="0"/>
-      </w:pPr>
-      <w:r>
-        <w:rPr>
-          <w:rFonts w:ascii="Arial" w:hAnsi="Arial" w:cs="Arial" w:eastAsia="Arial"/>
-          <w:b w:val="0"/>
-          <w:color w:val="000000"/>
-          <w:sz w:val="36"/>
-        </w:rPr>
-        <w:t>-KLARNA, THE BUY-NOW-PAY-LATER COMPANY, PUSHED HARD INTO AI CUSTOMER SERVICE... THEN STARTED HIRING HUMAN AGENTS AGAIN.</w:t>
-      </w:r>
-    </w:p>
-    <w:p>
-      <w:pPr>
-        <w:spacing w:lineRule="auto" w:line="276" w:before="0" w:after="0"/>
-      </w:pPr>
-      <w:r>
-        <w:rPr>
-          <w:rFonts w:ascii="Arial" w:hAnsi="Arial" w:cs="Arial" w:eastAsia="Arial"/>
-          <w:b w:val="0"/>
-          <w:color w:val="000000"/>
-          <w:sz w:val="36"/>
-        </w:rPr>
-      </w:r>
-    </w:p>
-    <w:p>
-      <w:pPr>
-        <w:spacing w:lineRule="auto" w:line="276" w:before="0" w:after="0"/>
-      </w:pPr>
-      <w:r>
-        <w:rPr>
-          <w:rFonts w:ascii="Arial" w:hAnsi="Arial" w:cs="Arial" w:eastAsia="Arial"/>
-          <w:b w:val="0"/>
-          <w:color w:val="000000"/>
-          <w:sz w:val="36"/>
-        </w:rPr>
-        <w:t>YOUR FEEDBACK WAS HEARD, AND IT MADE A DIFFERENCE!!</w:t>
-      </w:r>
-    </w:p>
-    <w:p>
-      <w:pPr>
-        <w:spacing w:lineRule="auto" w:line="276" w:before="0" w:after="0"/>
-      </w:pPr>
-      <w:r>
-        <w:rPr>
-          <w:rFonts w:ascii="Arial" w:hAnsi="Arial" w:cs="Arial" w:eastAsia="Arial"/>
-          <w:b w:val="0"/>
-          <w:color w:val="000000"/>
-          <w:sz w:val="36"/>
-        </w:rPr>
-      </w:r>
-    </w:p>
-    <w:p>
-      <w:pPr>
-        <w:spacing w:lineRule="auto" w:line="276" w:before="0" w:after="0"/>
-      </w:pPr>
-      <w:r>
-        <w:rPr>
-          <w:rFonts w:ascii="Arial" w:hAnsi="Arial" w:cs="Arial" w:eastAsia="Arial"/>
-          <w:b/>
-          <w:color w:val="000000"/>
-          <w:sz w:val="46"/>
-        </w:rPr>
         <w:t>HERE'S HOW YOU CAN GET A REAL PERSON</w:t>
       </w:r>
     </w:p>
@@ -7409,142 +6770,34 @@
           <w:color w:val="000000"/>
           <w:sz w:val="36"/>
         </w:rPr>
-        <w:t>-NUMBER ONE. WALK INSIDE AND ORDER AT THE COUNTER.</w:t>
-      </w:r>
-    </w:p>
-    <w:p>
-      <w:pPr>
-        <w:spacing w:lineRule="auto" w:line="276" w:before="0" w:after="0"/>
-      </w:pPr>
-      <w:r>
-        <w:rPr>
-          <w:rFonts w:ascii="Arial" w:hAnsi="Arial" w:cs="Arial" w:eastAsia="Arial"/>
-          <w:b w:val="0"/>
-          <w:color w:val="000000"/>
-          <w:sz w:val="36"/>
-        </w:rPr>
-      </w:r>
-    </w:p>
-    <w:p>
-      <w:pPr>
-        <w:spacing w:lineRule="auto" w:line="276" w:before="0" w:after="0"/>
-      </w:pPr>
-      <w:r>
-        <w:rPr>
-          <w:rFonts w:ascii="Arial" w:hAnsi="Arial" w:cs="Arial" w:eastAsia="Arial"/>
-          <w:b w:val="0"/>
-          <w:color w:val="000000"/>
-          <w:sz w:val="36"/>
-        </w:rPr>
-        <w:t>-BECAUSE MCDONALD'S IS TRAINING ITS WORKERS TO GREET YOU AND CHECK ON YOU IN THE LOBBY.</w:t>
-      </w:r>
-    </w:p>
-    <w:p>
-      <w:pPr>
-        <w:spacing w:lineRule="auto" w:line="276" w:before="0" w:after="0"/>
-      </w:pPr>
-      <w:r>
-        <w:rPr>
-          <w:rFonts w:ascii="Arial" w:hAnsi="Arial" w:cs="Arial" w:eastAsia="Arial"/>
-          <w:b w:val="0"/>
-          <w:color w:val="000000"/>
-          <w:sz w:val="36"/>
-        </w:rPr>
-      </w:r>
-    </w:p>
-    <w:p>
-      <w:pPr>
-        <w:spacing w:lineRule="auto" w:line="276" w:before="0" w:after="0"/>
-      </w:pPr>
-      <w:r>
-        <w:rPr>
-          <w:rFonts w:ascii="Arial" w:hAnsi="Arial" w:cs="Arial" w:eastAsia="Arial"/>
-          <w:b w:val="0"/>
-          <w:color w:val="000000"/>
-          <w:sz w:val="36"/>
-        </w:rPr>
-        <w:t>-NUMBER TWO. AT THE DRIVE-THRU SPEAKER, ASK FOR A PERSON.</w:t>
-      </w:r>
-    </w:p>
-    <w:p>
-      <w:pPr>
-        <w:spacing w:lineRule="auto" w:line="276" w:before="0" w:after="0"/>
-      </w:pPr>
-      <w:r>
-        <w:rPr>
-          <w:rFonts w:ascii="Arial" w:hAnsi="Arial" w:cs="Arial" w:eastAsia="Arial"/>
-          <w:b w:val="0"/>
-          <w:color w:val="000000"/>
-          <w:sz w:val="36"/>
-        </w:rPr>
-      </w:r>
-    </w:p>
-    <w:p>
-      <w:pPr>
-        <w:spacing w:lineRule="auto" w:line="276" w:before="0" w:after="0"/>
-      </w:pPr>
-      <w:r>
-        <w:rPr>
-          <w:rFonts w:ascii="Arial" w:hAnsi="Arial" w:cs="Arial" w:eastAsia="Arial"/>
-          <w:b w:val="0"/>
-          <w:color w:val="000000"/>
-          <w:sz w:val="36"/>
-        </w:rPr>
-        <w:t>-BURGER KING SAYS IT'S ADDING AN EASY WAY TO REACH A HUMAN.</w:t>
-      </w:r>
-    </w:p>
-    <w:p>
-      <w:pPr>
-        <w:spacing w:lineRule="auto" w:line="276" w:before="0" w:after="0"/>
-      </w:pPr>
-      <w:r>
-        <w:rPr>
-          <w:rFonts w:ascii="Arial" w:hAnsi="Arial" w:cs="Arial" w:eastAsia="Arial"/>
-          <w:b w:val="0"/>
-          <w:color w:val="000000"/>
-          <w:sz w:val="36"/>
-        </w:rPr>
-      </w:r>
-    </w:p>
-    <w:p>
-      <w:pPr>
-        <w:spacing w:lineRule="auto" w:line="276" w:before="0" w:after="0"/>
-      </w:pPr>
-      <w:r>
-        <w:rPr>
-          <w:rFonts w:ascii="Arial" w:hAnsi="Arial" w:cs="Arial" w:eastAsia="Arial"/>
-          <w:b w:val="0"/>
-          <w:color w:val="000000"/>
-          <w:sz w:val="36"/>
-        </w:rPr>
-        <w:t>-NUMBER THREE. WATCH THE ORDER SCREEN AS YOU TALK, AND FIX IT BEFORE YOU PAY.</w:t>
-      </w:r>
-    </w:p>
-    <w:p>
-      <w:pPr>
-        <w:spacing w:lineRule="auto" w:line="276" w:before="0" w:after="0"/>
-      </w:pPr>
-      <w:r>
-        <w:rPr>
-          <w:rFonts w:ascii="Arial" w:hAnsi="Arial" w:cs="Arial" w:eastAsia="Arial"/>
-          <w:b w:val="0"/>
-          <w:color w:val="000000"/>
-          <w:sz w:val="36"/>
-        </w:rPr>
-      </w:r>
-    </w:p>
-    <w:p>
-      <w:pPr>
-        <w:spacing w:lineRule="auto" w:line="276" w:before="0" w:after="0"/>
-      </w:pPr>
-      <w:r>
-        <w:rPr>
-          <w:rFonts w:ascii="Arial" w:hAnsi="Arial" w:cs="Arial" w:eastAsia="Arial"/>
-          <w:b w:val="0"/>
-          <w:color w:val="000000"/>
-          <w:sz w:val="36"/>
-        </w:rPr>
-        <w:t>-THEN CHECK THE BAG BEFORE YOU LEAVE THE LOT.</w:t>
+        <w:t>-NUMBER ONE. WALK INSIDE AND ORDER AT THE COUNTER, BECAUSE THAT'S WHERE THE PEOPLE ARE.</w:t>
+      </w:r>
+    </w:p>
+    <w:p>
+      <w:pPr>
+        <w:spacing w:lineRule="auto" w:line="276" w:before="0" w:after="0"/>
+      </w:pPr>
+      <w:r>
+        <w:rPr>
+          <w:rFonts w:ascii="Arial" w:hAnsi="Arial" w:cs="Arial" w:eastAsia="Arial"/>
+          <w:b w:val="0"/>
+          <w:color w:val="000000"/>
+          <w:sz w:val="36"/>
+        </w:rPr>
+      </w:r>
+    </w:p>
+    <w:p>
+      <w:pPr>
+        <w:spacing w:lineRule="auto" w:line="276" w:before="0" w:after="0"/>
+      </w:pPr>
+      <w:r>
+        <w:rPr>
+          <w:rFonts w:ascii="Arial" w:hAnsi="Arial" w:cs="Arial" w:eastAsia="Arial"/>
+          <w:b w:val="0"/>
+          <w:color w:val="000000"/>
+          <w:sz w:val="36"/>
+        </w:rPr>
+        <w:t>-NUMBER TWO. AT THE DRIVE-THRU SPEAKER, JUST ASK FOR A PERSON.</w:t>
       </w:r>
     </w:p>
     <w:p>

</xml_diff>

<commit_message>
Story C: cut franchise-owner beat, consumer-first BK and Starbucks lines
Co-Authored-By: Claude Opus 5.5 <noreply@anthropic.com>
Claude-Session: https://claude.ai/code/session_01TNJ6mpHv7cQth7iuoFbymm
</commit_message>
<xml_diff>
--- a/runs/W_10072026/10_07 LIVE BIBLE.docx
+++ b/runs/W_10072026/10_07 LIVE BIBLE.docx
@@ -1996,8 +1996,8 @@
       <w:r>
         <w:rPr>
           <w:rFonts w:ascii="Arial" w:hAnsi="Arial" w:cs="Arial" w:eastAsia="Arial"/>
-          <w:b/>
-          <w:color w:val="FF0000"/>
+          <w:b w:val="0"/>
+          <w:color w:val="000000"/>
           <w:sz w:val="36"/>
         </w:rPr>
         <w:t>BUTT</w:t>
@@ -5305,11 +5305,25 @@
       <w:r>
         <w:rPr>
           <w:rFonts w:ascii="Arial" w:hAnsi="Arial" w:cs="Arial" w:eastAsia="Arial"/>
+          <w:b w:val="0"/>
+          <w:color w:val="000000"/>
+          <w:sz w:val="36"/>
+        </w:rPr>
+        <w:t>BUTT</w:t>
+      </w:r>
+    </w:p>
+    <w:p>
+      <w:pPr>
+        <w:spacing w:lineRule="auto" w:line="276" w:before="0" w:after="0"/>
+      </w:pPr>
+      <w:r>
+        <w:rPr>
+          <w:rFonts w:ascii="Arial" w:hAnsi="Arial" w:cs="Arial" w:eastAsia="Arial"/>
           <w:b/>
           <w:color w:val="FF0000"/>
           <w:sz w:val="36"/>
         </w:rPr>
-        <w:t>BUTT</w:t>
+        <w:t>((0:48–1:08 (OUTCUE: "YOUR CUSTOMER'S")))</w:t>
       </w:r>
     </w:p>
     <w:p>
@@ -5323,7 +5337,20 @@
           <w:color w:val="FF0000"/>
           <w:sz w:val="36"/>
         </w:rPr>
-        <w:t>((0:48–1:08 (OUTCUE: "YOUR CUSTOMER'S")))</w:t>
+        <w:t>OUT: "YOUR CUSTOMER'S"</w:t>
+      </w:r>
+    </w:p>
+    <w:p>
+      <w:pPr>
+        <w:spacing w:lineRule="auto" w:line="276" w:before="0" w:after="0"/>
+      </w:pPr>
+      <w:r>
+        <w:rPr>
+          <w:rFonts w:ascii="Arial" w:hAnsi="Arial" w:cs="Arial" w:eastAsia="Arial"/>
+          <w:b w:val="0"/>
+          <w:color w:val="000000"/>
+          <w:sz w:val="36"/>
+        </w:rPr>
       </w:r>
     </w:p>
     <w:p>
@@ -5337,7 +5364,169 @@
           <w:color w:val="FF0000"/>
           <w:sz w:val="36"/>
         </w:rPr>
-        <w:t>OUT: "YOUR CUSTOMER'S"</w:t>
+        <w:t>(((DECIDE - SOUND UP SO INSTACART BRAGS IN ITS OWN WORDS, OR MUTE AS BROLL WITH JEFF TALKING OVER? HORIZONTAL SOURCE, CROP TO VERTICAL)))</w:t>
+      </w:r>
+    </w:p>
+    <w:p>
+      <w:pPr>
+        <w:spacing w:lineRule="auto" w:line="276" w:before="0" w:after="0"/>
+      </w:pPr>
+      <w:r>
+        <w:rPr>
+          <w:rFonts w:ascii="Arial" w:hAnsi="Arial" w:cs="Arial" w:eastAsia="Arial"/>
+          <w:b w:val="0"/>
+          <w:color w:val="000000"/>
+          <w:sz w:val="36"/>
+        </w:rPr>
+      </w:r>
+    </w:p>
+    <w:p>
+      <w:pPr>
+        <w:spacing w:lineRule="auto" w:line="276" w:before="0" w:after="0"/>
+      </w:pPr>
+      <w:r>
+        <w:rPr>
+          <w:rFonts w:ascii="Arial" w:hAnsi="Arial" w:cs="Arial" w:eastAsia="Arial"/>
+          <w:b w:val="0"/>
+          <w:color w:val="000000"/>
+          <w:sz w:val="36"/>
+        </w:rPr>
+        <w:t>-THAT'S INSTACART PITCHING THE STORES ON ADS AIMED AT YOU, RIGHT THERE IN THE AISLE!!</w:t>
+      </w:r>
+    </w:p>
+    <w:p>
+      <w:pPr>
+        <w:spacing w:lineRule="auto" w:line="276" w:before="0" w:after="0"/>
+      </w:pPr>
+      <w:r>
+        <w:rPr>
+          <w:rFonts w:ascii="Arial" w:hAnsi="Arial" w:cs="Arial" w:eastAsia="Arial"/>
+          <w:b w:val="0"/>
+          <w:color w:val="000000"/>
+          <w:sz w:val="36"/>
+        </w:rPr>
+      </w:r>
+    </w:p>
+    <w:p>
+      <w:pPr>
+        <w:spacing w:lineRule="auto" w:line="276" w:before="0" w:after="0"/>
+      </w:pPr>
+      <w:r>
+        <w:rPr>
+          <w:rFonts w:ascii="Arial" w:hAnsi="Arial" w:cs="Arial" w:eastAsia="Arial"/>
+          <w:b w:val="0"/>
+          <w:color w:val="000000"/>
+          <w:sz w:val="36"/>
+        </w:rPr>
+        <w:t>-THE CAMERAS AND THE CARTS DON'T NEED YOUR PHONE. THOSE YOU CAN'T SWITCH OFF.</w:t>
+      </w:r>
+    </w:p>
+    <w:p>
+      <w:pPr>
+        <w:spacing w:lineRule="auto" w:line="276" w:before="0" w:after="0"/>
+      </w:pPr>
+      <w:r>
+        <w:rPr>
+          <w:rFonts w:ascii="Arial" w:hAnsi="Arial" w:cs="Arial" w:eastAsia="Arial"/>
+          <w:b w:val="0"/>
+          <w:color w:val="000000"/>
+          <w:sz w:val="36"/>
+        </w:rPr>
+      </w:r>
+    </w:p>
+    <w:p>
+      <w:pPr>
+        <w:spacing w:lineRule="auto" w:line="276" w:before="0" w:after="0"/>
+      </w:pPr>
+      <w:r>
+        <w:rPr>
+          <w:rFonts w:ascii="Arial" w:hAnsi="Arial" w:cs="Arial" w:eastAsia="Arial"/>
+          <w:b w:val="0"/>
+          <w:color w:val="000000"/>
+          <w:sz w:val="36"/>
+        </w:rPr>
+        <w:t>-SO NOW YOU KNOW EXACTLY WHAT THAT CART IS DOING WHEN YOU PUSH IT DOWN THE AISLE.</w:t>
+      </w:r>
+    </w:p>
+    <w:p>
+      <w:pPr>
+        <w:spacing w:lineRule="auto" w:line="276" w:before="0" w:after="0"/>
+      </w:pPr>
+      <w:r>
+        <w:rPr>
+          <w:rFonts w:ascii="Arial" w:hAnsi="Arial" w:cs="Arial" w:eastAsia="Arial"/>
+          <w:b w:val="0"/>
+          <w:color w:val="000000"/>
+          <w:sz w:val="36"/>
+        </w:rPr>
+      </w:r>
+    </w:p>
+    <w:p>
+      <w:pPr>
+        <w:spacing w:lineRule="auto" w:line="276" w:before="0" w:after="0"/>
+      </w:pPr>
+      <w:r>
+        <w:rPr>
+          <w:rFonts w:ascii="Arial" w:hAnsi="Arial" w:cs="Arial" w:eastAsia="Arial"/>
+          <w:b w:val="0"/>
+          <w:color w:val="000000"/>
+          <w:sz w:val="36"/>
+        </w:rPr>
+        <w:t>-NOW, REMEMBER THE DRIVE-THRU ROBOT THAT NEVER GOT YOUR ORDER RIGHT?</w:t>
+      </w:r>
+    </w:p>
+    <w:p>
+      <w:pPr>
+        <w:spacing w:lineRule="auto" w:line="276" w:before="0" w:after="0"/>
+      </w:pPr>
+      <w:r>
+        <w:rPr>
+          <w:rFonts w:ascii="Arial" w:hAnsi="Arial" w:cs="Arial" w:eastAsia="Arial"/>
+          <w:b w:val="0"/>
+          <w:color w:val="000000"/>
+          <w:sz w:val="36"/>
+        </w:rPr>
+      </w:r>
+    </w:p>
+    <w:p>
+      <w:pPr>
+        <w:spacing w:lineRule="auto" w:line="276" w:before="0" w:after="0"/>
+      </w:pPr>
+      <w:r>
+        <w:rPr>
+          <w:rFonts w:ascii="Arial" w:hAnsi="Arial" w:cs="Arial" w:eastAsia="Arial"/>
+          <w:b w:val="0"/>
+          <w:color w:val="000000"/>
+          <w:sz w:val="36"/>
+        </w:rPr>
+        <w:t>-WAIT UNTIL YOU SEE WHAT'S HAPPENING TO IT.</w:t>
+      </w:r>
+    </w:p>
+    <w:p>
+      <w:pPr>
+        <w:spacing w:lineRule="auto" w:line="276" w:before="0" w:after="0"/>
+      </w:pPr>
+      <w:r>
+        <w:rPr>
+          <w:rFonts w:ascii="Arial" w:hAnsi="Arial" w:cs="Arial" w:eastAsia="Arial"/>
+          <w:b w:val="0"/>
+          <w:color w:val="000000"/>
+          <w:sz w:val="36"/>
+        </w:rPr>
+      </w:r>
+    </w:p>
+    <w:p>
+      <w:pPr>
+        <w:spacing w:lineRule="auto" w:line="276" w:before="0" w:after="0"/>
+      </w:pPr>
+      <w:r>
+        <w:rPr>
+          <w:rFonts w:ascii="Arial" w:hAnsi="Arial" w:cs="Arial" w:eastAsia="Arial"/>
+          <w:b w:val="0"/>
+          <w:color w:val="000000"/>
+          <w:sz w:val="36"/>
+        </w:rPr>
+        <w:t>-BUT FIRST, A QUICK WORD FROM OUR SPONSOR.</w:t>
       </w:r>
     </w:p>
     <w:p>
@@ -5364,169 +5553,7 @@
           <w:color w:val="FF0000"/>
           <w:sz w:val="36"/>
         </w:rPr>
-        <w:t>(((DECIDE - SOUND UP SO INSTACART BRAGS IN ITS OWN WORDS, OR MUTE AS BROLL WITH JEFF TALKING OVER? HORIZONTAL SOURCE, CROP TO VERTICAL)))</w:t>
-      </w:r>
-    </w:p>
-    <w:p>
-      <w:pPr>
-        <w:spacing w:lineRule="auto" w:line="276" w:before="0" w:after="0"/>
-      </w:pPr>
-      <w:r>
-        <w:rPr>
-          <w:rFonts w:ascii="Arial" w:hAnsi="Arial" w:cs="Arial" w:eastAsia="Arial"/>
-          <w:b w:val="0"/>
-          <w:color w:val="000000"/>
-          <w:sz w:val="36"/>
-        </w:rPr>
-      </w:r>
-    </w:p>
-    <w:p>
-      <w:pPr>
-        <w:spacing w:lineRule="auto" w:line="276" w:before="0" w:after="0"/>
-      </w:pPr>
-      <w:r>
-        <w:rPr>
-          <w:rFonts w:ascii="Arial" w:hAnsi="Arial" w:cs="Arial" w:eastAsia="Arial"/>
-          <w:b w:val="0"/>
-          <w:color w:val="000000"/>
-          <w:sz w:val="36"/>
-        </w:rPr>
-        <w:t>-THAT'S INSTACART PITCHING THE STORES ON ADS AIMED AT YOU, RIGHT THERE IN THE AISLE!!</w:t>
-      </w:r>
-    </w:p>
-    <w:p>
-      <w:pPr>
-        <w:spacing w:lineRule="auto" w:line="276" w:before="0" w:after="0"/>
-      </w:pPr>
-      <w:r>
-        <w:rPr>
-          <w:rFonts w:ascii="Arial" w:hAnsi="Arial" w:cs="Arial" w:eastAsia="Arial"/>
-          <w:b w:val="0"/>
-          <w:color w:val="000000"/>
-          <w:sz w:val="36"/>
-        </w:rPr>
-      </w:r>
-    </w:p>
-    <w:p>
-      <w:pPr>
-        <w:spacing w:lineRule="auto" w:line="276" w:before="0" w:after="0"/>
-      </w:pPr>
-      <w:r>
-        <w:rPr>
-          <w:rFonts w:ascii="Arial" w:hAnsi="Arial" w:cs="Arial" w:eastAsia="Arial"/>
-          <w:b w:val="0"/>
-          <w:color w:val="000000"/>
-          <w:sz w:val="36"/>
-        </w:rPr>
-        <w:t>-THE CAMERAS AND THE CARTS DON'T NEED YOUR PHONE. THOSE YOU CAN'T SWITCH OFF.</w:t>
-      </w:r>
-    </w:p>
-    <w:p>
-      <w:pPr>
-        <w:spacing w:lineRule="auto" w:line="276" w:before="0" w:after="0"/>
-      </w:pPr>
-      <w:r>
-        <w:rPr>
-          <w:rFonts w:ascii="Arial" w:hAnsi="Arial" w:cs="Arial" w:eastAsia="Arial"/>
-          <w:b w:val="0"/>
-          <w:color w:val="000000"/>
-          <w:sz w:val="36"/>
-        </w:rPr>
-      </w:r>
-    </w:p>
-    <w:p>
-      <w:pPr>
-        <w:spacing w:lineRule="auto" w:line="276" w:before="0" w:after="0"/>
-      </w:pPr>
-      <w:r>
-        <w:rPr>
-          <w:rFonts w:ascii="Arial" w:hAnsi="Arial" w:cs="Arial" w:eastAsia="Arial"/>
-          <w:b w:val="0"/>
-          <w:color w:val="000000"/>
-          <w:sz w:val="36"/>
-        </w:rPr>
-        <w:t>-SO NOW YOU KNOW EXACTLY WHAT THAT CART IS DOING WHEN YOU PUSH IT DOWN THE AISLE.</w:t>
-      </w:r>
-    </w:p>
-    <w:p>
-      <w:pPr>
-        <w:spacing w:lineRule="auto" w:line="276" w:before="0" w:after="0"/>
-      </w:pPr>
-      <w:r>
-        <w:rPr>
-          <w:rFonts w:ascii="Arial" w:hAnsi="Arial" w:cs="Arial" w:eastAsia="Arial"/>
-          <w:b w:val="0"/>
-          <w:color w:val="000000"/>
-          <w:sz w:val="36"/>
-        </w:rPr>
-      </w:r>
-    </w:p>
-    <w:p>
-      <w:pPr>
-        <w:spacing w:lineRule="auto" w:line="276" w:before="0" w:after="0"/>
-      </w:pPr>
-      <w:r>
-        <w:rPr>
-          <w:rFonts w:ascii="Arial" w:hAnsi="Arial" w:cs="Arial" w:eastAsia="Arial"/>
-          <w:b w:val="0"/>
-          <w:color w:val="000000"/>
-          <w:sz w:val="36"/>
-        </w:rPr>
-        <w:t>-NOW, REMEMBER THE DRIVE-THRU ROBOT THAT NEVER GOT YOUR ORDER RIGHT?</w:t>
-      </w:r>
-    </w:p>
-    <w:p>
-      <w:pPr>
-        <w:spacing w:lineRule="auto" w:line="276" w:before="0" w:after="0"/>
-      </w:pPr>
-      <w:r>
-        <w:rPr>
-          <w:rFonts w:ascii="Arial" w:hAnsi="Arial" w:cs="Arial" w:eastAsia="Arial"/>
-          <w:b w:val="0"/>
-          <w:color w:val="000000"/>
-          <w:sz w:val="36"/>
-        </w:rPr>
-      </w:r>
-    </w:p>
-    <w:p>
-      <w:pPr>
-        <w:spacing w:lineRule="auto" w:line="276" w:before="0" w:after="0"/>
-      </w:pPr>
-      <w:r>
-        <w:rPr>
-          <w:rFonts w:ascii="Arial" w:hAnsi="Arial" w:cs="Arial" w:eastAsia="Arial"/>
-          <w:b w:val="0"/>
-          <w:color w:val="000000"/>
-          <w:sz w:val="36"/>
-        </w:rPr>
-        <w:t>-WAIT UNTIL YOU SEE WHAT'S HAPPENING TO IT.</w:t>
-      </w:r>
-    </w:p>
-    <w:p>
-      <w:pPr>
-        <w:spacing w:lineRule="auto" w:line="276" w:before="0" w:after="0"/>
-      </w:pPr>
-      <w:r>
-        <w:rPr>
-          <w:rFonts w:ascii="Arial" w:hAnsi="Arial" w:cs="Arial" w:eastAsia="Arial"/>
-          <w:b w:val="0"/>
-          <w:color w:val="000000"/>
-          <w:sz w:val="36"/>
-        </w:rPr>
-      </w:r>
-    </w:p>
-    <w:p>
-      <w:pPr>
-        <w:spacing w:lineRule="auto" w:line="276" w:before="0" w:after="0"/>
-      </w:pPr>
-      <w:r>
-        <w:rPr>
-          <w:rFonts w:ascii="Arial" w:hAnsi="Arial" w:cs="Arial" w:eastAsia="Arial"/>
-          <w:b w:val="0"/>
-          <w:color w:val="000000"/>
-          <w:sz w:val="36"/>
-        </w:rPr>
-        <w:t>-BUT FIRST, A QUICK WORD FROM OUR SPONSOR.</w:t>
+        <w:t>(((SPONSOR TEASE - KILL BANNERS)))</w:t>
       </w:r>
     </w:p>
     <w:p>
@@ -5553,7 +5580,7 @@
           <w:color w:val="FF0000"/>
           <w:sz w:val="36"/>
         </w:rPr>
-        <w:t>(((SPONSOR TEASE - KILL BANNERS)))</w:t>
+        <w:t>(((PLAY SPONSOR - CHAPTER)))</w:t>
       </w:r>
     </w:p>
     <w:p>
@@ -5577,118 +5604,262 @@
         <w:rPr>
           <w:rFonts w:ascii="Arial" w:hAnsi="Arial" w:cs="Arial" w:eastAsia="Arial"/>
           <w:b/>
-          <w:color w:val="FF0000"/>
-          <w:sz w:val="36"/>
-        </w:rPr>
-        <w:t>(((PLAY SPONSOR - CHAPTER)))</w:t>
-      </w:r>
-    </w:p>
-    <w:p>
-      <w:pPr>
-        <w:spacing w:lineRule="auto" w:line="276" w:before="0" w:after="0"/>
-      </w:pPr>
-      <w:r>
-        <w:rPr>
-          <w:rFonts w:ascii="Arial" w:hAnsi="Arial" w:cs="Arial" w:eastAsia="Arial"/>
-          <w:b w:val="0"/>
-          <w:color w:val="000000"/>
-          <w:sz w:val="36"/>
-        </w:rPr>
-      </w:r>
-    </w:p>
-    <w:p>
-      <w:pPr>
-        <w:spacing w:lineRule="auto" w:line="276" w:before="0" w:after="0"/>
-      </w:pPr>
+          <w:color w:val="000000"/>
+          <w:sz w:val="46"/>
+        </w:rPr>
+        <w:t>MCDONALD'S IS BRINGING THE HUMANS BACK!!</w:t>
+      </w:r>
+    </w:p>
+    <w:p>
+      <w:pPr>
+        <w:spacing w:lineRule="auto" w:line="276" w:before="0" w:after="0"/>
+      </w:pPr>
+      <w:r>
+        <w:rPr>
+          <w:rFonts w:ascii="Arial" w:hAnsi="Arial" w:cs="Arial" w:eastAsia="Arial"/>
+          <w:b w:val="0"/>
+          <w:color w:val="000000"/>
+          <w:sz w:val="36"/>
+        </w:rPr>
+      </w:r>
+    </w:p>
+    <w:p>
+      <w:pPr>
+        <w:spacing w:lineRule="auto" w:line="276" w:before="0" w:after="0"/>
+      </w:pPr>
+      <w:r>
+        <w:rPr>
+          <w:rFonts w:ascii="Arial" w:hAnsi="Arial" w:cs="Arial" w:eastAsia="Arial"/>
+          <w:b w:val="0"/>
+          <w:color w:val="000000"/>
+          <w:sz w:val="36"/>
+        </w:rPr>
+        <w:t>-FOR YEARS, MCDONALD'S PUSHED YOU TO KIOSKS, MOBILE ORDERING AND AI.</w:t>
+      </w:r>
+    </w:p>
+    <w:p>
+      <w:pPr>
+        <w:spacing w:lineRule="auto" w:line="276" w:before="0" w:after="0"/>
+      </w:pPr>
+      <w:r>
+        <w:rPr>
+          <w:rFonts w:ascii="Arial" w:hAnsi="Arial" w:cs="Arial" w:eastAsia="Arial"/>
+          <w:b w:val="0"/>
+          <w:color w:val="000000"/>
+          <w:sz w:val="36"/>
+        </w:rPr>
+      </w:r>
+    </w:p>
+    <w:p>
+      <w:pPr>
+        <w:spacing w:lineRule="auto" w:line="276" w:before="0" w:after="0"/>
+      </w:pPr>
+      <w:r>
+        <w:rPr>
+          <w:rFonts w:ascii="Arial" w:hAnsi="Arial" w:cs="Arial" w:eastAsia="Arial"/>
+          <w:b w:val="0"/>
+          <w:color w:val="000000"/>
+          <w:sz w:val="36"/>
+        </w:rPr>
+        <w:t>-NOW IT'S MAKING A MAJOR SHIFT... BACK TO PEOPLE.</w:t>
+      </w:r>
+    </w:p>
+    <w:p>
+      <w:pPr>
+        <w:spacing w:lineRule="auto" w:line="276" w:before="0" w:after="0"/>
+      </w:pPr>
+      <w:r>
+        <w:rPr>
+          <w:rFonts w:ascii="Arial" w:hAnsi="Arial" w:cs="Arial" w:eastAsia="Arial"/>
+          <w:b w:val="0"/>
+          <w:color w:val="000000"/>
+          <w:sz w:val="36"/>
+        </w:rPr>
+      </w:r>
+    </w:p>
+    <w:p>
+      <w:pPr>
+        <w:spacing w:lineRule="auto" w:line="276" w:before="0" w:after="0"/>
+      </w:pPr>
+      <w:r>
+        <w:rPr>
+          <w:rFonts w:ascii="Arial" w:hAnsi="Arial" w:cs="Arial" w:eastAsia="Arial"/>
+          <w:b w:val="0"/>
+          <w:color w:val="000000"/>
+          <w:sz w:val="36"/>
+        </w:rPr>
+        <w:t xml:space="preserve">-STARTING OCTOBER 5TH, MCDONALD'S IS RETRAINING MORE THAN </w:t>
+      </w:r>
       <w:r>
         <w:rPr>
           <w:rFonts w:ascii="Arial" w:hAnsi="Arial" w:cs="Arial" w:eastAsia="Arial"/>
           <w:b/>
           <w:color w:val="000000"/>
+          <w:sz w:val="36"/>
+        </w:rPr>
+        <w:t>2 MILLION WORKERS</w:t>
+      </w:r>
+      <w:r>
+        <w:rPr>
+          <w:rFonts w:ascii="Arial" w:hAnsi="Arial" w:cs="Arial" w:eastAsia="Arial"/>
+          <w:b w:val="0"/>
+          <w:color w:val="000000"/>
+          <w:sz w:val="36"/>
+        </w:rPr>
+        <w:t xml:space="preserve"> AROUND THE WORLD. 2 MILLION!!</w:t>
+      </w:r>
+    </w:p>
+    <w:p>
+      <w:pPr>
+        <w:spacing w:lineRule="auto" w:line="276" w:before="0" w:after="0"/>
+      </w:pPr>
+      <w:r>
+        <w:rPr>
+          <w:rFonts w:ascii="Arial" w:hAnsi="Arial" w:cs="Arial" w:eastAsia="Arial"/>
+          <w:b w:val="0"/>
+          <w:color w:val="000000"/>
+          <w:sz w:val="36"/>
+        </w:rPr>
+      </w:r>
+    </w:p>
+    <w:p>
+      <w:pPr>
+        <w:spacing w:lineRule="auto" w:line="276" w:before="0" w:after="0"/>
+      </w:pPr>
+      <w:r>
+        <w:rPr>
+          <w:rFonts w:ascii="Arial" w:hAnsi="Arial" w:cs="Arial" w:eastAsia="Arial"/>
+          <w:b w:val="0"/>
+          <w:color w:val="000000"/>
+          <w:sz w:val="36"/>
+        </w:rPr>
+        <w:t>-IT'S CALLED "</w:t>
+      </w:r>
+      <w:r>
+        <w:rPr>
+          <w:rFonts w:ascii="Arial" w:hAnsi="Arial" w:cs="Arial" w:eastAsia="Arial"/>
+          <w:b/>
+          <w:color w:val="000000"/>
+          <w:sz w:val="36"/>
+        </w:rPr>
+        <w:t>MAKE IT GOLDEN</w:t>
+      </w:r>
+      <w:r>
+        <w:rPr>
+          <w:rFonts w:ascii="Arial" w:hAnsi="Arial" w:cs="Arial" w:eastAsia="Arial"/>
+          <w:b w:val="0"/>
+          <w:color w:val="000000"/>
+          <w:sz w:val="36"/>
+        </w:rPr>
+        <w:t>," AND THE GOAL IS BETTER HOSPITALITY. HOW THEY TREAT YOU.</w:t>
+      </w:r>
+    </w:p>
+    <w:p>
+      <w:pPr>
+        <w:spacing w:lineRule="auto" w:line="276" w:before="0" w:after="0"/>
+      </w:pPr>
+      <w:r>
+        <w:rPr>
+          <w:rFonts w:ascii="Arial" w:hAnsi="Arial" w:cs="Arial" w:eastAsia="Arial"/>
+          <w:b w:val="0"/>
+          <w:color w:val="000000"/>
+          <w:sz w:val="36"/>
+        </w:rPr>
+      </w:r>
+    </w:p>
+    <w:p>
+      <w:pPr>
+        <w:spacing w:lineRule="auto" w:line="276" w:before="0" w:after="0"/>
+      </w:pPr>
+      <w:r>
+        <w:rPr>
+          <w:rFonts w:ascii="Arial" w:hAnsi="Arial" w:cs="Arial" w:eastAsia="Arial"/>
+          <w:b w:val="0"/>
+          <w:color w:val="000000"/>
+          <w:sz w:val="36"/>
+        </w:rPr>
+        <w:t>-IT'S THE BIGGEST TRAINING EFFORT IN THE COMPANY'S HISTORY.</w:t>
+      </w:r>
+    </w:p>
+    <w:p>
+      <w:pPr>
+        <w:spacing w:lineRule="auto" w:line="276" w:before="0" w:after="0"/>
+      </w:pPr>
+      <w:r>
+        <w:rPr>
+          <w:rFonts w:ascii="Arial" w:hAnsi="Arial" w:cs="Arial" w:eastAsia="Arial"/>
+          <w:b w:val="0"/>
+          <w:color w:val="000000"/>
+          <w:sz w:val="36"/>
+        </w:rPr>
+      </w:r>
+    </w:p>
+    <w:p>
+      <w:pPr>
+        <w:spacing w:lineRule="auto" w:line="276" w:before="0" w:after="0"/>
+      </w:pPr>
+      <w:r>
+        <w:rPr>
+          <w:rFonts w:ascii="Arial" w:hAnsi="Arial" w:cs="Arial" w:eastAsia="Arial"/>
+          <w:b/>
+          <w:color w:val="000000"/>
           <w:sz w:val="46"/>
         </w:rPr>
-        <w:t>MCDONALD'S IS BRINGING THE HUMANS BACK!!</w:t>
-      </w:r>
-    </w:p>
-    <w:p>
-      <w:pPr>
-        <w:spacing w:lineRule="auto" w:line="276" w:before="0" w:after="0"/>
-      </w:pPr>
-      <w:r>
-        <w:rPr>
-          <w:rFonts w:ascii="Arial" w:hAnsi="Arial" w:cs="Arial" w:eastAsia="Arial"/>
-          <w:b w:val="0"/>
-          <w:color w:val="000000"/>
-          <w:sz w:val="36"/>
-        </w:rPr>
-      </w:r>
-    </w:p>
-    <w:p>
-      <w:pPr>
-        <w:spacing w:lineRule="auto" w:line="276" w:before="0" w:after="0"/>
-      </w:pPr>
-      <w:r>
-        <w:rPr>
-          <w:rFonts w:ascii="Arial" w:hAnsi="Arial" w:cs="Arial" w:eastAsia="Arial"/>
-          <w:b w:val="0"/>
-          <w:color w:val="000000"/>
-          <w:sz w:val="36"/>
-        </w:rPr>
-        <w:t>-FOR YEARS, MCDONALD'S PUSHED YOU TO KIOSKS, MOBILE ORDERING AND AI.</w:t>
-      </w:r>
-    </w:p>
-    <w:p>
-      <w:pPr>
-        <w:spacing w:lineRule="auto" w:line="276" w:before="0" w:after="0"/>
-      </w:pPr>
-      <w:r>
-        <w:rPr>
-          <w:rFonts w:ascii="Arial" w:hAnsi="Arial" w:cs="Arial" w:eastAsia="Arial"/>
-          <w:b w:val="0"/>
-          <w:color w:val="000000"/>
-          <w:sz w:val="36"/>
-        </w:rPr>
-      </w:r>
-    </w:p>
-    <w:p>
-      <w:pPr>
-        <w:spacing w:lineRule="auto" w:line="276" w:before="0" w:after="0"/>
-      </w:pPr>
-      <w:r>
-        <w:rPr>
-          <w:rFonts w:ascii="Arial" w:hAnsi="Arial" w:cs="Arial" w:eastAsia="Arial"/>
-          <w:b w:val="0"/>
-          <w:color w:val="000000"/>
-          <w:sz w:val="36"/>
-        </w:rPr>
-        <w:t>-NOW IT'S MAKING A MAJOR SHIFT... BACK TO PEOPLE.</w:t>
-      </w:r>
-    </w:p>
-    <w:p>
-      <w:pPr>
-        <w:spacing w:lineRule="auto" w:line="276" w:before="0" w:after="0"/>
-      </w:pPr>
-      <w:r>
-        <w:rPr>
-          <w:rFonts w:ascii="Arial" w:hAnsi="Arial" w:cs="Arial" w:eastAsia="Arial"/>
-          <w:b w:val="0"/>
-          <w:color w:val="000000"/>
-          <w:sz w:val="36"/>
-        </w:rPr>
-      </w:r>
-    </w:p>
-    <w:p>
-      <w:pPr>
-        <w:spacing w:lineRule="auto" w:line="276" w:before="0" w:after="0"/>
-      </w:pPr>
-      <w:r>
-        <w:rPr>
-          <w:rFonts w:ascii="Arial" w:hAnsi="Arial" w:cs="Arial" w:eastAsia="Arial"/>
-          <w:b w:val="0"/>
-          <w:color w:val="000000"/>
-          <w:sz w:val="36"/>
-        </w:rPr>
-        <w:t xml:space="preserve">-STARTING OCTOBER 5TH, MCDONALD'S IS RETRAINING MORE THAN </w:t>
+        <w:t>AND WAIT UNTIL YOU HEAR WHAT THEY'RE TRAINING WORKERS TO SAY!!</w:t>
+      </w:r>
+    </w:p>
+    <w:p>
+      <w:pPr>
+        <w:spacing w:lineRule="auto" w:line="276" w:before="0" w:after="0"/>
+      </w:pPr>
+      <w:r>
+        <w:rPr>
+          <w:rFonts w:ascii="Arial" w:hAnsi="Arial" w:cs="Arial" w:eastAsia="Arial"/>
+          <w:b w:val="0"/>
+          <w:color w:val="000000"/>
+          <w:sz w:val="36"/>
+        </w:rPr>
+      </w:r>
+    </w:p>
+    <w:p>
+      <w:pPr>
+        <w:spacing w:lineRule="auto" w:line="276" w:before="0" w:after="0"/>
+      </w:pPr>
+      <w:r>
+        <w:rPr>
+          <w:rFonts w:ascii="Arial" w:hAnsi="Arial" w:cs="Arial" w:eastAsia="Arial"/>
+          <w:b w:val="0"/>
+          <w:color w:val="000000"/>
+          <w:sz w:val="36"/>
+        </w:rPr>
+        <w:t>-THE WALL STREET JOURNAL GOT A COPY OF AN INTERNAL MCDONALD'S TRAINING DOCUMENT.</w:t>
+      </w:r>
+    </w:p>
+    <w:p>
+      <w:pPr>
+        <w:spacing w:lineRule="auto" w:line="276" w:before="0" w:after="0"/>
+      </w:pPr>
+      <w:r>
+        <w:rPr>
+          <w:rFonts w:ascii="Arial" w:hAnsi="Arial" w:cs="Arial" w:eastAsia="Arial"/>
+          <w:b w:val="0"/>
+          <w:color w:val="000000"/>
+          <w:sz w:val="36"/>
+        </w:rPr>
+      </w:r>
+    </w:p>
+    <w:p>
+      <w:pPr>
+        <w:spacing w:lineRule="auto" w:line="276" w:before="0" w:after="0"/>
+      </w:pPr>
+      <w:r>
+        <w:rPr>
+          <w:rFonts w:ascii="Arial" w:hAnsi="Arial" w:cs="Arial" w:eastAsia="Arial"/>
+          <w:b w:val="0"/>
+          <w:color w:val="000000"/>
+          <w:sz w:val="36"/>
+        </w:rPr>
+        <w:t>-WORKERS ARE SUPPOSED TO GREET YOU WITH ENERGY... "</w:t>
       </w:r>
       <w:r>
         <w:rPr>
@@ -5697,43 +5868,16 @@
           <w:color w:val="000000"/>
           <w:sz w:val="36"/>
         </w:rPr>
-        <w:t>2 MILLION WORKERS</w:t>
-      </w:r>
-      <w:r>
-        <w:rPr>
-          <w:rFonts w:ascii="Arial" w:hAnsi="Arial" w:cs="Arial" w:eastAsia="Arial"/>
-          <w:b w:val="0"/>
-          <w:color w:val="000000"/>
-          <w:sz w:val="36"/>
-        </w:rPr>
-        <w:t xml:space="preserve"> AROUND THE WORLD. 2 MILLION!!</w:t>
-      </w:r>
-    </w:p>
-    <w:p>
-      <w:pPr>
-        <w:spacing w:lineRule="auto" w:line="276" w:before="0" w:after="0"/>
-      </w:pPr>
-      <w:r>
-        <w:rPr>
-          <w:rFonts w:ascii="Arial" w:hAnsi="Arial" w:cs="Arial" w:eastAsia="Arial"/>
-          <w:b w:val="0"/>
-          <w:color w:val="000000"/>
-          <w:sz w:val="36"/>
-        </w:rPr>
-      </w:r>
-    </w:p>
-    <w:p>
-      <w:pPr>
-        <w:spacing w:lineRule="auto" w:line="276" w:before="0" w:after="0"/>
-      </w:pPr>
-      <w:r>
-        <w:rPr>
-          <w:rFonts w:ascii="Arial" w:hAnsi="Arial" w:cs="Arial" w:eastAsia="Arial"/>
-          <w:b w:val="0"/>
-          <w:color w:val="000000"/>
-          <w:sz w:val="36"/>
-        </w:rPr>
-        <w:t>-IT'S CALLED "</w:t>
+        <w:t>ENJOY YOUR MEAL!</w:t>
+      </w:r>
+      <w:r>
+        <w:rPr>
+          <w:rFonts w:ascii="Arial" w:hAnsi="Arial" w:cs="Arial" w:eastAsia="Arial"/>
+          <w:b w:val="0"/>
+          <w:color w:val="000000"/>
+          <w:sz w:val="36"/>
+        </w:rPr>
+        <w:t>" AND "</w:t>
       </w:r>
       <w:r>
         <w:rPr>
@@ -5742,150 +5886,6 @@
           <w:color w:val="000000"/>
           <w:sz w:val="36"/>
         </w:rPr>
-        <w:t>MAKE IT GOLDEN</w:t>
-      </w:r>
-      <w:r>
-        <w:rPr>
-          <w:rFonts w:ascii="Arial" w:hAnsi="Arial" w:cs="Arial" w:eastAsia="Arial"/>
-          <w:b w:val="0"/>
-          <w:color w:val="000000"/>
-          <w:sz w:val="36"/>
-        </w:rPr>
-        <w:t>," AND THE GOAL IS BETTER HOSPITALITY. HOW THEY TREAT YOU.</w:t>
-      </w:r>
-    </w:p>
-    <w:p>
-      <w:pPr>
-        <w:spacing w:lineRule="auto" w:line="276" w:before="0" w:after="0"/>
-      </w:pPr>
-      <w:r>
-        <w:rPr>
-          <w:rFonts w:ascii="Arial" w:hAnsi="Arial" w:cs="Arial" w:eastAsia="Arial"/>
-          <w:b w:val="0"/>
-          <w:color w:val="000000"/>
-          <w:sz w:val="36"/>
-        </w:rPr>
-      </w:r>
-    </w:p>
-    <w:p>
-      <w:pPr>
-        <w:spacing w:lineRule="auto" w:line="276" w:before="0" w:after="0"/>
-      </w:pPr>
-      <w:r>
-        <w:rPr>
-          <w:rFonts w:ascii="Arial" w:hAnsi="Arial" w:cs="Arial" w:eastAsia="Arial"/>
-          <w:b w:val="0"/>
-          <w:color w:val="000000"/>
-          <w:sz w:val="36"/>
-        </w:rPr>
-        <w:t>-IT'S THE BIGGEST TRAINING EFFORT IN THE COMPANY'S HISTORY.</w:t>
-      </w:r>
-    </w:p>
-    <w:p>
-      <w:pPr>
-        <w:spacing w:lineRule="auto" w:line="276" w:before="0" w:after="0"/>
-      </w:pPr>
-      <w:r>
-        <w:rPr>
-          <w:rFonts w:ascii="Arial" w:hAnsi="Arial" w:cs="Arial" w:eastAsia="Arial"/>
-          <w:b w:val="0"/>
-          <w:color w:val="000000"/>
-          <w:sz w:val="36"/>
-        </w:rPr>
-      </w:r>
-    </w:p>
-    <w:p>
-      <w:pPr>
-        <w:spacing w:lineRule="auto" w:line="276" w:before="0" w:after="0"/>
-      </w:pPr>
-      <w:r>
-        <w:rPr>
-          <w:rFonts w:ascii="Arial" w:hAnsi="Arial" w:cs="Arial" w:eastAsia="Arial"/>
-          <w:b/>
-          <w:color w:val="000000"/>
-          <w:sz w:val="46"/>
-        </w:rPr>
-        <w:t>AND WAIT UNTIL YOU HEAR WHAT THEY'RE TRAINING WORKERS TO SAY!!</w:t>
-      </w:r>
-    </w:p>
-    <w:p>
-      <w:pPr>
-        <w:spacing w:lineRule="auto" w:line="276" w:before="0" w:after="0"/>
-      </w:pPr>
-      <w:r>
-        <w:rPr>
-          <w:rFonts w:ascii="Arial" w:hAnsi="Arial" w:cs="Arial" w:eastAsia="Arial"/>
-          <w:b w:val="0"/>
-          <w:color w:val="000000"/>
-          <w:sz w:val="36"/>
-        </w:rPr>
-      </w:r>
-    </w:p>
-    <w:p>
-      <w:pPr>
-        <w:spacing w:lineRule="auto" w:line="276" w:before="0" w:after="0"/>
-      </w:pPr>
-      <w:r>
-        <w:rPr>
-          <w:rFonts w:ascii="Arial" w:hAnsi="Arial" w:cs="Arial" w:eastAsia="Arial"/>
-          <w:b w:val="0"/>
-          <w:color w:val="000000"/>
-          <w:sz w:val="36"/>
-        </w:rPr>
-        <w:t>-THE WALL STREET JOURNAL GOT A COPY OF AN INTERNAL MCDONALD'S TRAINING DOCUMENT.</w:t>
-      </w:r>
-    </w:p>
-    <w:p>
-      <w:pPr>
-        <w:spacing w:lineRule="auto" w:line="276" w:before="0" w:after="0"/>
-      </w:pPr>
-      <w:r>
-        <w:rPr>
-          <w:rFonts w:ascii="Arial" w:hAnsi="Arial" w:cs="Arial" w:eastAsia="Arial"/>
-          <w:b w:val="0"/>
-          <w:color w:val="000000"/>
-          <w:sz w:val="36"/>
-        </w:rPr>
-      </w:r>
-    </w:p>
-    <w:p>
-      <w:pPr>
-        <w:spacing w:lineRule="auto" w:line="276" w:before="0" w:after="0"/>
-      </w:pPr>
-      <w:r>
-        <w:rPr>
-          <w:rFonts w:ascii="Arial" w:hAnsi="Arial" w:cs="Arial" w:eastAsia="Arial"/>
-          <w:b w:val="0"/>
-          <w:color w:val="000000"/>
-          <w:sz w:val="36"/>
-        </w:rPr>
-        <w:t>-WORKERS ARE SUPPOSED TO GREET YOU WITH ENERGY... "</w:t>
-      </w:r>
-      <w:r>
-        <w:rPr>
-          <w:rFonts w:ascii="Arial" w:hAnsi="Arial" w:cs="Arial" w:eastAsia="Arial"/>
-          <w:b/>
-          <w:color w:val="000000"/>
-          <w:sz w:val="36"/>
-        </w:rPr>
-        <w:t>ENJOY YOUR MEAL!</w:t>
-      </w:r>
-      <w:r>
-        <w:rPr>
-          <w:rFonts w:ascii="Arial" w:hAnsi="Arial" w:cs="Arial" w:eastAsia="Arial"/>
-          <w:b w:val="0"/>
-          <w:color w:val="000000"/>
-          <w:sz w:val="36"/>
-        </w:rPr>
-        <w:t>" AND "</w:t>
-      </w:r>
-      <w:r>
-        <w:rPr>
-          <w:rFonts w:ascii="Arial" w:hAnsi="Arial" w:cs="Arial" w:eastAsia="Arial"/>
-          <w:b/>
-          <w:color w:val="000000"/>
-          <w:sz w:val="36"/>
-        </w:rPr>
         <w:t>SEE YOU SOON!</w:t>
       </w:r>
       <w:r>
@@ -5922,61 +5922,34 @@
           <w:color w:val="000000"/>
           <w:sz w:val="36"/>
         </w:rPr>
-        <w:t>-AND ACCORDING TO THE JOURNAL, MCDONALD'S OWN FRANCHISE OWNERS ADMITTED THE PROBLEM.</w:t>
-      </w:r>
-    </w:p>
-    <w:p>
-      <w:pPr>
-        <w:spacing w:lineRule="auto" w:line="276" w:before="0" w:after="0"/>
-      </w:pPr>
-      <w:r>
-        <w:rPr>
-          <w:rFonts w:ascii="Arial" w:hAnsi="Arial" w:cs="Arial" w:eastAsia="Arial"/>
-          <w:b w:val="0"/>
-          <w:color w:val="000000"/>
-          <w:sz w:val="36"/>
-        </w:rPr>
-      </w:r>
-    </w:p>
-    <w:p>
-      <w:pPr>
-        <w:spacing w:lineRule="auto" w:line="276" w:before="0" w:after="0"/>
-      </w:pPr>
-      <w:r>
-        <w:rPr>
-          <w:rFonts w:ascii="Arial" w:hAnsi="Arial" w:cs="Arial" w:eastAsia="Arial"/>
-          <w:b w:val="0"/>
-          <w:color w:val="000000"/>
-          <w:sz w:val="36"/>
-        </w:rPr>
-        <w:t>-THEY SAID MANY GUESTS FEEL THEIR VISITS ARE "RUSHED, IMPERSONAL, STERILE AND COLD."</w:t>
-      </w:r>
-    </w:p>
-    <w:p>
-      <w:pPr>
-        <w:spacing w:lineRule="auto" w:line="276" w:before="0" w:after="0"/>
-      </w:pPr>
-      <w:r>
-        <w:rPr>
-          <w:rFonts w:ascii="Arial" w:hAnsi="Arial" w:cs="Arial" w:eastAsia="Arial"/>
-          <w:b w:val="0"/>
-          <w:color w:val="000000"/>
-          <w:sz w:val="36"/>
-        </w:rPr>
-      </w:r>
-    </w:p>
-    <w:p>
-      <w:pPr>
-        <w:spacing w:lineRule="auto" w:line="276" w:before="0" w:after="0"/>
-      </w:pPr>
-      <w:r>
-        <w:rPr>
-          <w:rFonts w:ascii="Arial" w:hAnsi="Arial" w:cs="Arial" w:eastAsia="Arial"/>
-          <w:b w:val="0"/>
-          <w:color w:val="000000"/>
-          <w:sz w:val="36"/>
-        </w:rPr>
-        <w:t>-YOU KNOW EXACTLY WHAT THEY MEAN. YOU PULL UP, AND A COMPUTER VOICE TAKES YOUR ORDER.</w:t>
+        <w:t>-A REAL PERSON, SAYING SOMETHING NICE TO YOU. REMEMBER THAT???</w:t>
+      </w:r>
+    </w:p>
+    <w:p>
+      <w:pPr>
+        <w:spacing w:lineRule="auto" w:line="276" w:before="0" w:after="0"/>
+      </w:pPr>
+      <w:r>
+        <w:rPr>
+          <w:rFonts w:ascii="Arial" w:hAnsi="Arial" w:cs="Arial" w:eastAsia="Arial"/>
+          <w:b w:val="0"/>
+          <w:color w:val="000000"/>
+          <w:sz w:val="36"/>
+        </w:rPr>
+      </w:r>
+    </w:p>
+    <w:p>
+      <w:pPr>
+        <w:spacing w:lineRule="auto" w:line="276" w:before="0" w:after="0"/>
+      </w:pPr>
+      <w:r>
+        <w:rPr>
+          <w:rFonts w:ascii="Arial" w:hAnsi="Arial" w:cs="Arial" w:eastAsia="Arial"/>
+          <w:b w:val="0"/>
+          <w:color w:val="000000"/>
+          <w:sz w:val="36"/>
+        </w:rPr>
+        <w:t>-BECAUSE YOU KNOW WHAT IT'S BEEN LIKE. YOU PULL UP, AND A COMPUTER VOICE TAKES YOUR ORDER.</w:t>
       </w:r>
     </w:p>
     <w:p>
@@ -6245,61 +6218,7 @@
           <w:color w:val="000000"/>
           <w:sz w:val="36"/>
         </w:rPr>
-        <w:t>-BURGER KING'S PRESIDENT, TOM CURTIS, TOLD THE WALL STREET JOURNAL PEOPLE WANT A HUMAN CONNECTION.</w:t>
-      </w:r>
-    </w:p>
-    <w:p>
-      <w:pPr>
-        <w:spacing w:lineRule="auto" w:line="276" w:before="0" w:after="0"/>
-      </w:pPr>
-      <w:r>
-        <w:rPr>
-          <w:rFonts w:ascii="Arial" w:hAnsi="Arial" w:cs="Arial" w:eastAsia="Arial"/>
-          <w:b w:val="0"/>
-          <w:color w:val="000000"/>
-          <w:sz w:val="36"/>
-        </w:rPr>
-      </w:r>
-    </w:p>
-    <w:p>
-      <w:pPr>
-        <w:spacing w:lineRule="auto" w:line="276" w:before="0" w:after="0"/>
-      </w:pPr>
-      <w:r>
-        <w:rPr>
-          <w:rFonts w:ascii="Arial" w:hAnsi="Arial" w:cs="Arial" w:eastAsia="Arial"/>
-          <w:b w:val="0"/>
-          <w:color w:val="000000"/>
-          <w:sz w:val="36"/>
-        </w:rPr>
-        <w:t>-AND I'M QUOTING HERE: "WE HAVE TO LEAN IN TO THAT BECAUSE THAT'S EVAPORATING IN THE FAST FOOD SPACE."</w:t>
-      </w:r>
-    </w:p>
-    <w:p>
-      <w:pPr>
-        <w:spacing w:lineRule="auto" w:line="276" w:before="0" w:after="0"/>
-      </w:pPr>
-      <w:r>
-        <w:rPr>
-          <w:rFonts w:ascii="Arial" w:hAnsi="Arial" w:cs="Arial" w:eastAsia="Arial"/>
-          <w:b w:val="0"/>
-          <w:color w:val="000000"/>
-          <w:sz w:val="36"/>
-        </w:rPr>
-      </w:r>
-    </w:p>
-    <w:p>
-      <w:pPr>
-        <w:spacing w:lineRule="auto" w:line="276" w:before="0" w:after="0"/>
-      </w:pPr>
-      <w:r>
-        <w:rPr>
-          <w:rFonts w:ascii="Arial" w:hAnsi="Arial" w:cs="Arial" w:eastAsia="Arial"/>
-          <w:b w:val="0"/>
-          <w:color w:val="000000"/>
-          <w:sz w:val="36"/>
-        </w:rPr>
-        <w:t>-BURGER KING SAYS IT'S MAKING IT EASIER TO ORDER FROM A REAL PERSON AT THE DRIVE-THRU.</w:t>
+        <w:t>-AT BURGER KING, THEY SAY THEY'RE MAKING IT EASIER FOR YOU TO ORDER FROM A REAL PERSON AT THE DRIVE-THRU... NOT THE ROBOT.</w:t>
       </w:r>
     </w:p>
     <w:p>
@@ -6380,7 +6299,7 @@
           <w:color w:val="000000"/>
           <w:sz w:val="36"/>
         </w:rPr>
-        <w:t xml:space="preserve">-STARBUCKS WAS ROLLING OUT NEW EQUIPMENT CALLED THE </w:t>
+        <w:t xml:space="preserve">-STARBUCKS WAS PUTTING </w:t>
       </w:r>
       <w:r>
         <w:rPr>
@@ -6389,124 +6308,97 @@
           <w:color w:val="000000"/>
           <w:sz w:val="36"/>
         </w:rPr>
-        <w:t>SIREN CRAFT SYSTEM</w:t>
-      </w:r>
-      <w:r>
-        <w:rPr>
-          <w:rFonts w:ascii="Arial" w:hAnsi="Arial" w:cs="Arial" w:eastAsia="Arial"/>
-          <w:b w:val="0"/>
-          <w:color w:val="000000"/>
-          <w:sz w:val="36"/>
-        </w:rPr>
-        <w:t>, TO MAKE YOUR DRINK FASTER.</w:t>
-      </w:r>
-    </w:p>
-    <w:p>
-      <w:pPr>
-        <w:spacing w:lineRule="auto" w:line="276" w:before="0" w:after="0"/>
-      </w:pPr>
-      <w:r>
-        <w:rPr>
-          <w:rFonts w:ascii="Arial" w:hAnsi="Arial" w:cs="Arial" w:eastAsia="Arial"/>
-          <w:b w:val="0"/>
-          <w:color w:val="000000"/>
-          <w:sz w:val="36"/>
-        </w:rPr>
-      </w:r>
-    </w:p>
-    <w:p>
-      <w:pPr>
-        <w:spacing w:lineRule="auto" w:line="276" w:before="0" w:after="0"/>
-      </w:pPr>
-      <w:r>
-        <w:rPr>
-          <w:rFonts w:ascii="Arial" w:hAnsi="Arial" w:cs="Arial" w:eastAsia="Arial"/>
-          <w:b w:val="0"/>
-          <w:color w:val="000000"/>
-          <w:sz w:val="36"/>
-        </w:rPr>
-        <w:t>-THE PLAN WAS ABOUT 10,000 STORES.</w:t>
-      </w:r>
-    </w:p>
-    <w:p>
-      <w:pPr>
-        <w:spacing w:lineRule="auto" w:line="276" w:before="0" w:after="0"/>
-      </w:pPr>
-      <w:r>
-        <w:rPr>
-          <w:rFonts w:ascii="Arial" w:hAnsi="Arial" w:cs="Arial" w:eastAsia="Arial"/>
-          <w:b w:val="0"/>
-          <w:color w:val="000000"/>
-          <w:sz w:val="36"/>
-        </w:rPr>
-      </w:r>
-    </w:p>
-    <w:p>
-      <w:pPr>
-        <w:spacing w:lineRule="auto" w:line="276" w:before="0" w:after="0"/>
-      </w:pPr>
-      <w:r>
-        <w:rPr>
-          <w:rFonts w:ascii="Arial" w:hAnsi="Arial" w:cs="Arial" w:eastAsia="Arial"/>
-          <w:b w:val="0"/>
-          <w:color w:val="000000"/>
-          <w:sz w:val="36"/>
-        </w:rPr>
-        <w:t>-THEN CEO BRIAN NICCOL STOPPED IT.</w:t>
-      </w:r>
-    </w:p>
-    <w:p>
-      <w:pPr>
-        <w:spacing w:lineRule="auto" w:line="276" w:before="0" w:after="0"/>
-      </w:pPr>
-      <w:r>
-        <w:rPr>
-          <w:rFonts w:ascii="Arial" w:hAnsi="Arial" w:cs="Arial" w:eastAsia="Arial"/>
-          <w:b w:val="0"/>
-          <w:color w:val="000000"/>
-          <w:sz w:val="36"/>
-        </w:rPr>
-      </w:r>
-    </w:p>
-    <w:p>
-      <w:pPr>
-        <w:spacing w:lineRule="auto" w:line="276" w:before="0" w:after="0"/>
-      </w:pPr>
-      <w:r>
-        <w:rPr>
-          <w:rFonts w:ascii="Arial" w:hAnsi="Arial" w:cs="Arial" w:eastAsia="Arial"/>
-          <w:b w:val="0"/>
-          <w:color w:val="000000"/>
-          <w:sz w:val="36"/>
-        </w:rPr>
-        <w:t>-ACCORDING TO CBS NEWS, HE SAID THE EQUIPMENT DOESN'T SOLVE THE EXPERIENCE... STAFFING THE STORES DOES.</w:t>
-      </w:r>
-    </w:p>
-    <w:p>
-      <w:pPr>
-        <w:spacing w:lineRule="auto" w:line="276" w:before="0" w:after="0"/>
-      </w:pPr>
-      <w:r>
-        <w:rPr>
-          <w:rFonts w:ascii="Arial" w:hAnsi="Arial" w:cs="Arial" w:eastAsia="Arial"/>
-          <w:b w:val="0"/>
-          <w:color w:val="000000"/>
-          <w:sz w:val="36"/>
-        </w:rPr>
-      </w:r>
-    </w:p>
-    <w:p>
-      <w:pPr>
-        <w:spacing w:lineRule="auto" w:line="276" w:before="0" w:after="0"/>
-      </w:pPr>
-      <w:r>
-        <w:rPr>
-          <w:rFonts w:ascii="Arial" w:hAnsi="Arial" w:cs="Arial" w:eastAsia="Arial"/>
-          <w:b w:val="0"/>
-          <w:color w:val="000000"/>
-          <w:sz w:val="36"/>
-        </w:rPr>
-        <w:t>-SO STARBUCKS STARTED HIRING MORE BARISTAS AT THOUSANDS OF STORES INSTEAD.</w:t>
+        <w:t>HIGH-TECH DRINK MACHINES</w:t>
+      </w:r>
+      <w:r>
+        <w:rPr>
+          <w:rFonts w:ascii="Arial" w:hAnsi="Arial" w:cs="Arial" w:eastAsia="Arial"/>
+          <w:b w:val="0"/>
+          <w:color w:val="000000"/>
+          <w:sz w:val="36"/>
+        </w:rPr>
+        <w:t xml:space="preserve"> IN ABOUT 10,000 STORES, TO MAKE YOUR ORDER FASTER.</w:t>
+      </w:r>
+    </w:p>
+    <w:p>
+      <w:pPr>
+        <w:spacing w:lineRule="auto" w:line="276" w:before="0" w:after="0"/>
+      </w:pPr>
+      <w:r>
+        <w:rPr>
+          <w:rFonts w:ascii="Arial" w:hAnsi="Arial" w:cs="Arial" w:eastAsia="Arial"/>
+          <w:b w:val="0"/>
+          <w:color w:val="000000"/>
+          <w:sz w:val="36"/>
+        </w:rPr>
+      </w:r>
+    </w:p>
+    <w:p>
+      <w:pPr>
+        <w:spacing w:lineRule="auto" w:line="276" w:before="0" w:after="0"/>
+      </w:pPr>
+      <w:r>
+        <w:rPr>
+          <w:rFonts w:ascii="Arial" w:hAnsi="Arial" w:cs="Arial" w:eastAsia="Arial"/>
+          <w:b w:val="0"/>
+          <w:color w:val="000000"/>
+          <w:sz w:val="36"/>
+        </w:rPr>
+        <w:t>-THEN IT SCRAPPED THE PLAN.</w:t>
+      </w:r>
+    </w:p>
+    <w:p>
+      <w:pPr>
+        <w:spacing w:lineRule="auto" w:line="276" w:before="0" w:after="0"/>
+      </w:pPr>
+      <w:r>
+        <w:rPr>
+          <w:rFonts w:ascii="Arial" w:hAnsi="Arial" w:cs="Arial" w:eastAsia="Arial"/>
+          <w:b w:val="0"/>
+          <w:color w:val="000000"/>
+          <w:sz w:val="36"/>
+        </w:rPr>
+      </w:r>
+    </w:p>
+    <w:p>
+      <w:pPr>
+        <w:spacing w:lineRule="auto" w:line="276" w:before="0" w:after="0"/>
+      </w:pPr>
+      <w:r>
+        <w:rPr>
+          <w:rFonts w:ascii="Arial" w:hAnsi="Arial" w:cs="Arial" w:eastAsia="Arial"/>
+          <w:b w:val="0"/>
+          <w:color w:val="000000"/>
+          <w:sz w:val="36"/>
+        </w:rPr>
+        <w:t>-INSTEAD, STARBUCKS IS HIRING MORE BARISTAS AT THOUSANDS OF STORES... MORE PEOPLE MAKING YOUR DRINK.</w:t>
+      </w:r>
+    </w:p>
+    <w:p>
+      <w:pPr>
+        <w:spacing w:lineRule="auto" w:line="276" w:before="0" w:after="0"/>
+      </w:pPr>
+      <w:r>
+        <w:rPr>
+          <w:rFonts w:ascii="Arial" w:hAnsi="Arial" w:cs="Arial" w:eastAsia="Arial"/>
+          <w:b w:val="0"/>
+          <w:color w:val="000000"/>
+          <w:sz w:val="36"/>
+        </w:rPr>
+      </w:r>
+    </w:p>
+    <w:p>
+      <w:pPr>
+        <w:spacing w:lineRule="auto" w:line="276" w:before="0" w:after="0"/>
+      </w:pPr>
+      <w:r>
+        <w:rPr>
+          <w:rFonts w:ascii="Arial" w:hAnsi="Arial" w:cs="Arial" w:eastAsia="Arial"/>
+          <w:b w:val="0"/>
+          <w:color w:val="000000"/>
+          <w:sz w:val="36"/>
+        </w:rPr>
+        <w:t>-THE CEO, BRIAN NICCOL, SAID THE MACHINES WEREN'T FIXING YOUR EXPERIENCE. MORE STAFF WAS.</w:t>
       </w:r>
     </w:p>
     <w:p>

</xml_diff>

<commit_message>
Story C: drop the walk-inside tip
Co-Authored-By: Claude Opus 5.5 <noreply@anthropic.com>
Claude-Session: https://claude.ai/code/session_01TNJ6mpHv7cQth7iuoFbymm
</commit_message>
<xml_diff>
--- a/runs/W_10072026/10_07 LIVE BIBLE.docx
+++ b/runs/W_10072026/10_07 LIVE BIBLE.docx
@@ -6662,34 +6662,7 @@
           <w:color w:val="000000"/>
           <w:sz w:val="36"/>
         </w:rPr>
-        <w:t>-NUMBER ONE. WALK INSIDE AND ORDER AT THE COUNTER, BECAUSE THAT'S WHERE THE PEOPLE ARE.</w:t>
-      </w:r>
-    </w:p>
-    <w:p>
-      <w:pPr>
-        <w:spacing w:lineRule="auto" w:line="276" w:before="0" w:after="0"/>
-      </w:pPr>
-      <w:r>
-        <w:rPr>
-          <w:rFonts w:ascii="Arial" w:hAnsi="Arial" w:cs="Arial" w:eastAsia="Arial"/>
-          <w:b w:val="0"/>
-          <w:color w:val="000000"/>
-          <w:sz w:val="36"/>
-        </w:rPr>
-      </w:r>
-    </w:p>
-    <w:p>
-      <w:pPr>
-        <w:spacing w:lineRule="auto" w:line="276" w:before="0" w:after="0"/>
-      </w:pPr>
-      <w:r>
-        <w:rPr>
-          <w:rFonts w:ascii="Arial" w:hAnsi="Arial" w:cs="Arial" w:eastAsia="Arial"/>
-          <w:b w:val="0"/>
-          <w:color w:val="000000"/>
-          <w:sz w:val="36"/>
-        </w:rPr>
-        <w:t>-NUMBER TWO. AT THE DRIVE-THRU SPEAKER, JUST ASK FOR A PERSON.</w:t>
+        <w:t>-AT THE DRIVE-THRU SPEAKER, JUST ASK FOR A PERSON.</w:t>
       </w:r>
     </w:p>
     <w:p>

</xml_diff>